<commit_message>
KG2 and 3 please please please
</commit_message>
<xml_diff>
--- a/41BZ Bezpeka ta zahyst program/K/KNT-122_Onyshchenko_Variant-19_PZ.docx
+++ b/41BZ Bezpeka ta zahyst program/K/KNT-122_Onyshchenko_Variant-19_PZ.docx
@@ -468,9 +468,9 @@
         </w:rPr>
       </w:pPr>
       <w:bookmarkStart w:id="0" w:name="__RefHeading___Toc2365_792400555"/>
-      <w:bookmarkStart w:id="1" w:name="_Зміст000064"/>
+      <w:bookmarkStart w:id="1" w:name="_Зміст000002"/>
       <w:bookmarkStart w:id="2" w:name="_Зміст000028"/>
-      <w:bookmarkStart w:id="3" w:name="_Зміст000002"/>
+      <w:bookmarkStart w:id="3" w:name="_Зміст000064"/>
       <w:bookmarkEnd w:id="0"/>
       <w:r>
         <w:rPr>
@@ -1453,13 +1453,13 @@
         </w:rPr>
       </w:pPr>
       <w:bookmarkStart w:id="4" w:name="__RefHeading___Toc2367_792400555"/>
-      <w:bookmarkStart w:id="5" w:name="_Toc196826519"/>
-      <w:bookmarkStart w:id="6" w:name="_Toc27554778"/>
-      <w:bookmarkStart w:id="7" w:name="_Зміст000066"/>
+      <w:bookmarkStart w:id="5" w:name="_Toc533520909"/>
+      <w:bookmarkStart w:id="6" w:name="_Зміст000003"/>
+      <w:bookmarkStart w:id="7" w:name="_Зміст000029"/>
       <w:bookmarkStart w:id="8" w:name="_Toc12274"/>
-      <w:bookmarkStart w:id="9" w:name="_Зміст000029"/>
-      <w:bookmarkStart w:id="10" w:name="_Зміст000003"/>
-      <w:bookmarkStart w:id="11" w:name="_Toc533520909"/>
+      <w:bookmarkStart w:id="9" w:name="_Зміст000066"/>
+      <w:bookmarkStart w:id="10" w:name="_Toc27554778"/>
+      <w:bookmarkStart w:id="11" w:name="_Toc196826519"/>
       <w:bookmarkEnd w:id="4"/>
       <w:r>
         <w:rPr>
@@ -1792,11 +1792,11 @@
         </w:rPr>
       </w:pPr>
       <w:bookmarkStart w:id="12" w:name="__RefHeading___Toc2369_792400555"/>
-      <w:bookmarkStart w:id="13" w:name="_Зміст000030"/>
-      <w:bookmarkStart w:id="14" w:name="_Зміст000067"/>
+      <w:bookmarkStart w:id="13" w:name="_Toc196826520"/>
+      <w:bookmarkStart w:id="14" w:name="_Toc1235"/>
       <w:bookmarkStart w:id="15" w:name="_Зміст000004"/>
-      <w:bookmarkStart w:id="16" w:name="_Toc1235"/>
-      <w:bookmarkStart w:id="17" w:name="_Toc196826520"/>
+      <w:bookmarkStart w:id="16" w:name="_Зміст000067"/>
+      <w:bookmarkStart w:id="17" w:name="_Зміст000030"/>
       <w:bookmarkEnd w:id="12"/>
       <w:r>
         <w:rPr>
@@ -1833,29 +1833,32 @@
           </w:r>
           <w:r>
             <w:rPr>
-              <w:webHidden/>
-              <w:rStyle w:val="Style18"/>
+              <w:rStyle w:val="user"/>
+              <w:vanish w:val="false"/>
             </w:rPr>
             <w:instrText xml:space="preserve"> TOC \z \o "1-9" \h</w:instrText>
           </w:r>
           <w:r>
             <w:rPr>
-              <w:webHidden/>
-              <w:rStyle w:val="Style18"/>
+              <w:rStyle w:val="user"/>
+              <w:vanish w:val="false"/>
             </w:rPr>
             <w:fldChar w:fldCharType="separate"/>
           </w:r>
-          <w:hyperlink w:anchor="__RefHeading___Toc2365_792400555" w:tooltip="КУРСОВИЙ ПРОЄКТ">
-            <w:r>
-              <w:rPr>
-                <w:webHidden/>
-                <w:rStyle w:val="Style18"/>
-              </w:rPr>
-              <w:t>КУРСОВИЙ ПРОЄКТ</w:t>
-              <w:tab/>
-              <w:t>1</w:t>
-            </w:r>
-          </w:hyperlink>
+          <w:r>
+            <w:rPr>
+              <w:rStyle w:val="user"/>
+              <w:vanish w:val="false"/>
+            </w:rPr>
+            <w:t>КУРСОВИЙ ПРОЄКТ</w:t>
+          </w:r>
+          <w:r>
+            <w:rPr>
+              <w:vanish w:val="false"/>
+            </w:rPr>
+            <w:tab/>
+            <w:t>1</w:t>
+          </w:r>
         </w:p>
         <w:p>
           <w:pPr>
@@ -1866,17 +1869,14 @@
             </w:tabs>
             <w:rPr/>
           </w:pPr>
-          <w:hyperlink w:anchor="__RefHeading___Toc2367_792400555" w:tooltip="Реферат">
-            <w:r>
-              <w:rPr>
-                <w:webHidden/>
-                <w:rStyle w:val="Style18"/>
-              </w:rPr>
-              <w:t>Реферат</w:t>
-              <w:tab/>
-              <w:t>2</w:t>
-            </w:r>
-          </w:hyperlink>
+          <w:r>
+            <w:rPr>
+              <w:vanish w:val="false"/>
+            </w:rPr>
+            <w:t>Реферат</w:t>
+            <w:tab/>
+            <w:t>2</w:t>
+          </w:r>
         </w:p>
         <w:p>
           <w:pPr>
@@ -1887,17 +1887,14 @@
             </w:tabs>
             <w:rPr/>
           </w:pPr>
-          <w:hyperlink w:anchor="__RefHeading___Toc2369_792400555" w:tooltip="Зміст">
-            <w:r>
-              <w:rPr>
-                <w:webHidden/>
-                <w:rStyle w:val="Style18"/>
-              </w:rPr>
-              <w:t>Зміст</w:t>
-              <w:tab/>
-              <w:t>3</w:t>
-            </w:r>
-          </w:hyperlink>
+          <w:r>
+            <w:rPr>
+              <w:vanish w:val="false"/>
+            </w:rPr>
+            <w:t>Зміст</w:t>
+            <w:tab/>
+            <w:t>3</w:t>
+          </w:r>
         </w:p>
         <w:p>
           <w:pPr>
@@ -1908,17 +1905,14 @@
             </w:tabs>
             <w:rPr/>
           </w:pPr>
-          <w:hyperlink w:anchor="__RefHeading___Toc2371_792400555" w:tooltip="Перелік умовних позначень, скорочень і термінів">
-            <w:r>
-              <w:rPr>
-                <w:webHidden/>
-                <w:rStyle w:val="Style18"/>
-              </w:rPr>
-              <w:t>Перелік умовних позначень, скорочень і термінів</w:t>
-              <w:tab/>
-              <w:t>6</w:t>
-            </w:r>
-          </w:hyperlink>
+          <w:r>
+            <w:rPr>
+              <w:vanish w:val="false"/>
+            </w:rPr>
+            <w:t>Перелік умовних позначень, скорочень і термінів</w:t>
+            <w:tab/>
+            <w:t>6</w:t>
+          </w:r>
         </w:p>
         <w:p>
           <w:pPr>
@@ -1929,17 +1923,14 @@
             </w:tabs>
             <w:rPr/>
           </w:pPr>
-          <w:hyperlink w:anchor="__RefHeading___Toc2373_792400555" w:tooltip="Вступ">
-            <w:r>
-              <w:rPr>
-                <w:webHidden/>
-                <w:rStyle w:val="Style18"/>
-              </w:rPr>
-              <w:t>Вступ</w:t>
-              <w:tab/>
-              <w:t>7</w:t>
-            </w:r>
-          </w:hyperlink>
+          <w:r>
+            <w:rPr>
+              <w:vanish w:val="false"/>
+            </w:rPr>
+            <w:t>Вступ</w:t>
+            <w:tab/>
+            <w:t>7</w:t>
+          </w:r>
         </w:p>
         <w:p>
           <w:pPr>
@@ -1950,17 +1941,14 @@
             </w:tabs>
             <w:rPr/>
           </w:pPr>
-          <w:hyperlink w:anchor="__RefHeading___Toc2375_792400555" w:tooltip="1 Аналіз предметної області та огляд аналогів">
-            <w:r>
-              <w:rPr>
-                <w:webHidden/>
-                <w:rStyle w:val="Style18"/>
-              </w:rPr>
-              <w:t>1 Аналіз предметної області та огляд аналогів</w:t>
-              <w:tab/>
-              <w:t>8</w:t>
-            </w:r>
-          </w:hyperlink>
+          <w:r>
+            <w:rPr>
+              <w:vanish w:val="false"/>
+            </w:rPr>
+            <w:t>1 Аналіз предметної області та огляд аналогів</w:t>
+            <w:tab/>
+            <w:t>8</w:t>
+          </w:r>
         </w:p>
         <w:p>
           <w:pPr>
@@ -1971,17 +1959,14 @@
             </w:tabs>
             <w:rPr/>
           </w:pPr>
-          <w:hyperlink w:anchor="__RefHeading___Toc2377_792400555" w:tooltip="1.1 Огляд існуючих методів вирішення завдання">
-            <w:r>
-              <w:rPr>
-                <w:webHidden/>
-                <w:rStyle w:val="Style18"/>
-              </w:rPr>
-              <w:t>1.1 Огляд існуючих методів вирішення завдання</w:t>
-              <w:tab/>
-              <w:t>9</w:t>
-            </w:r>
-          </w:hyperlink>
+          <w:r>
+            <w:rPr>
+              <w:vanish w:val="false"/>
+            </w:rPr>
+            <w:t>1.1 Огляд існуючих методів вирішення завдання</w:t>
+            <w:tab/>
+            <w:t>9</w:t>
+          </w:r>
         </w:p>
         <w:p>
           <w:pPr>
@@ -1992,17 +1977,14 @@
             </w:tabs>
             <w:rPr/>
           </w:pPr>
-          <w:hyperlink w:anchor="__RefHeading___Toc2379_792400555" w:tooltip="1.2 Огляд існуючих програмних засобів, що вирішують аналогічні завдання">
-            <w:r>
-              <w:rPr>
-                <w:webHidden/>
-                <w:rStyle w:val="Style18"/>
-              </w:rPr>
-              <w:t>1.2 Огляд існуючих програмних засобів, що вирішують аналогічні завдання</w:t>
-              <w:tab/>
-              <w:t>10</w:t>
-            </w:r>
-          </w:hyperlink>
+          <w:r>
+            <w:rPr>
+              <w:vanish w:val="false"/>
+            </w:rPr>
+            <w:t>1.2 Огляд існуючих програмних засобів, що вирішують аналогічні завдання</w:t>
+            <w:tab/>
+            <w:t>10</w:t>
+          </w:r>
         </w:p>
         <w:p>
           <w:pPr>
@@ -2013,17 +1995,14 @@
             </w:tabs>
             <w:rPr/>
           </w:pPr>
-          <w:hyperlink w:anchor="__RefHeading___Toc2381_792400555" w:tooltip="1.2.1 Програма Dcode">
-            <w:r>
-              <w:rPr>
-                <w:webHidden/>
-                <w:rStyle w:val="Style18"/>
-              </w:rPr>
-              <w:t>1.2.1 Програма Dcode</w:t>
-              <w:tab/>
-              <w:t>10</w:t>
-            </w:r>
-          </w:hyperlink>
+          <w:r>
+            <w:rPr>
+              <w:vanish w:val="false"/>
+            </w:rPr>
+            <w:t>1.2.1 Програма Dcode</w:t>
+            <w:tab/>
+            <w:t>10</w:t>
+          </w:r>
         </w:p>
         <w:p>
           <w:pPr>
@@ -2034,17 +2013,14 @@
             </w:tabs>
             <w:rPr/>
           </w:pPr>
-          <w:hyperlink w:anchor="__RefHeading___Toc2383_792400555" w:tooltip="1.2.2 Програма Boxentriq">
-            <w:r>
-              <w:rPr>
-                <w:webHidden/>
-                <w:rStyle w:val="Style18"/>
-              </w:rPr>
-              <w:t>1.2.2 Програма Boxentriq</w:t>
-              <w:tab/>
-              <w:t>11</w:t>
-            </w:r>
-          </w:hyperlink>
+          <w:r>
+            <w:rPr>
+              <w:vanish w:val="false"/>
+            </w:rPr>
+            <w:t>1.2.2 Програма Boxentriq</w:t>
+            <w:tab/>
+            <w:t>11</w:t>
+          </w:r>
         </w:p>
         <w:p>
           <w:pPr>
@@ -2055,17 +2031,14 @@
             </w:tabs>
             <w:rPr/>
           </w:pPr>
-          <w:hyperlink w:anchor="__RefHeading___Toc2385_792400555" w:tooltip="1.2.4 Порівняльна таблиця розглянутих програм">
-            <w:r>
-              <w:rPr>
-                <w:webHidden/>
-                <w:rStyle w:val="Style18"/>
-              </w:rPr>
-              <w:t>1.2.4 Порівняльна таблиця розглянутих програм</w:t>
-              <w:tab/>
-              <w:t>12</w:t>
-            </w:r>
-          </w:hyperlink>
+          <w:r>
+            <w:rPr>
+              <w:vanish w:val="false"/>
+            </w:rPr>
+            <w:t>1.2.4 Порівняльна таблиця розглянутих програм</w:t>
+            <w:tab/>
+            <w:t>12</w:t>
+          </w:r>
         </w:p>
         <w:p>
           <w:pPr>
@@ -2076,17 +2049,14 @@
             </w:tabs>
             <w:rPr/>
           </w:pPr>
-          <w:hyperlink w:anchor="__RefHeading___Toc2387_792400555" w:tooltip="1.3 Постановка завдання роботи">
-            <w:r>
-              <w:rPr>
-                <w:webHidden/>
-                <w:rStyle w:val="Style18"/>
-              </w:rPr>
-              <w:t>1.3 Постановка завдання роботи</w:t>
-              <w:tab/>
-              <w:t>13</w:t>
-            </w:r>
-          </w:hyperlink>
+          <w:r>
+            <w:rPr>
+              <w:vanish w:val="false"/>
+            </w:rPr>
+            <w:t>1.3 Постановка завдання роботи</w:t>
+            <w:tab/>
+            <w:t>13</w:t>
+          </w:r>
         </w:p>
         <w:p>
           <w:pPr>
@@ -2097,17 +2067,14 @@
             </w:tabs>
             <w:rPr/>
           </w:pPr>
-          <w:hyperlink w:anchor="__RefHeading___Toc2389_792400555" w:tooltip="1.4 Висновки за першим розділом">
-            <w:r>
-              <w:rPr>
-                <w:webHidden/>
-                <w:rStyle w:val="Style18"/>
-              </w:rPr>
-              <w:t>1.4 Висновки за першим розділом</w:t>
-              <w:tab/>
-              <w:t>13</w:t>
-            </w:r>
-          </w:hyperlink>
+          <w:r>
+            <w:rPr>
+              <w:vanish w:val="false"/>
+            </w:rPr>
+            <w:t>1.4 Висновки за першим розділом</w:t>
+            <w:tab/>
+            <w:t>13</w:t>
+          </w:r>
         </w:p>
         <w:p>
           <w:pPr>
@@ -2118,17 +2085,14 @@
             </w:tabs>
             <w:rPr/>
           </w:pPr>
-          <w:hyperlink w:anchor="__RefHeading___Toc2391_792400555" w:tooltip="2 Вибір та обґрунтування структури системи, яка проєктується">
-            <w:r>
-              <w:rPr>
-                <w:webHidden/>
-                <w:rStyle w:val="Style18"/>
-              </w:rPr>
-              <w:t>2 Вибір та обґрунтування структури системи, яка проєктується</w:t>
-              <w:tab/>
-              <w:t>14</w:t>
-            </w:r>
-          </w:hyperlink>
+          <w:r>
+            <w:rPr>
+              <w:vanish w:val="false"/>
+            </w:rPr>
+            <w:t>2 Вибір та обґрунтування структури системи, яка проєктується</w:t>
+            <w:tab/>
+            <w:t>14</w:t>
+          </w:r>
         </w:p>
         <w:p>
           <w:pPr>
@@ -2139,17 +2103,14 @@
             </w:tabs>
             <w:rPr/>
           </w:pPr>
-          <w:hyperlink w:anchor="__RefHeading___Toc2393_792400555" w:tooltip="2.1 Вибір інструментарію розробки програмного забезпечення">
-            <w:r>
-              <w:rPr>
-                <w:webHidden/>
-                <w:rStyle w:val="Style18"/>
-              </w:rPr>
-              <w:t>2.1 Вибір інструментарію розробки програмного забезпечення</w:t>
-              <w:tab/>
-              <w:t>14</w:t>
-            </w:r>
-          </w:hyperlink>
+          <w:r>
+            <w:rPr>
+              <w:vanish w:val="false"/>
+            </w:rPr>
+            <w:t>2.1 Вибір інструментарію розробки програмного забезпечення</w:t>
+            <w:tab/>
+            <w:t>14</w:t>
+          </w:r>
         </w:p>
         <w:p>
           <w:pPr>
@@ -2160,17 +2121,14 @@
             </w:tabs>
             <w:rPr/>
           </w:pPr>
-          <w:hyperlink w:anchor="__RefHeading___Toc2395_792400555" w:tooltip="2.1.1 Огляд особливостей мови програмування, клієнт">
-            <w:r>
-              <w:rPr>
-                <w:webHidden/>
-                <w:rStyle w:val="Style18"/>
-              </w:rPr>
-              <w:t>2.1.1 Огляд особливостей мови програмування, клієнт</w:t>
-              <w:tab/>
-              <w:t>14</w:t>
-            </w:r>
-          </w:hyperlink>
+          <w:r>
+            <w:rPr>
+              <w:vanish w:val="false"/>
+            </w:rPr>
+            <w:t>2.1.1 Огляд особливостей мови програмування, клієнт</w:t>
+            <w:tab/>
+            <w:t>14</w:t>
+          </w:r>
         </w:p>
         <w:p>
           <w:pPr>
@@ -2181,17 +2139,14 @@
             </w:tabs>
             <w:rPr/>
           </w:pPr>
-          <w:hyperlink w:anchor="__RefHeading___Toc2397_792400555" w:tooltip="2.1.2 Огляд особливостей обраного середовища розробки">
-            <w:r>
-              <w:rPr>
-                <w:webHidden/>
-                <w:rStyle w:val="Style18"/>
-              </w:rPr>
-              <w:t>2.1.2 Огляд особливостей обраного середовища розробки</w:t>
-              <w:tab/>
-              <w:t>16</w:t>
-            </w:r>
-          </w:hyperlink>
+          <w:r>
+            <w:rPr>
+              <w:vanish w:val="false"/>
+            </w:rPr>
+            <w:t>2.1.2 Огляд особливостей обраного середовища розробки</w:t>
+            <w:tab/>
+            <w:t>16</w:t>
+          </w:r>
         </w:p>
         <w:p>
           <w:pPr>
@@ -2202,17 +2157,14 @@
             </w:tabs>
             <w:rPr/>
           </w:pPr>
-          <w:hyperlink w:anchor="__RefHeading___Toc2399_792400555" w:tooltip="2.2 Структурна схема програми">
-            <w:r>
-              <w:rPr>
-                <w:webHidden/>
-                <w:rStyle w:val="Style18"/>
-              </w:rPr>
-              <w:t>2.2 Структурна схема програми</w:t>
-              <w:tab/>
-              <w:t>16</w:t>
-            </w:r>
-          </w:hyperlink>
+          <w:r>
+            <w:rPr>
+              <w:vanish w:val="false"/>
+            </w:rPr>
+            <w:t>2.2 Структурна схема програми</w:t>
+            <w:tab/>
+            <w:t>16</w:t>
+          </w:r>
         </w:p>
         <w:p>
           <w:pPr>
@@ -2223,17 +2175,14 @@
             </w:tabs>
             <w:rPr/>
           </w:pPr>
-          <w:hyperlink w:anchor="__RefHeading___Toc2401_792400555" w:tooltip="2.3 Опис модулів розроблюваної системи">
-            <w:r>
-              <w:rPr>
-                <w:webHidden/>
-                <w:rStyle w:val="Style18"/>
-              </w:rPr>
-              <w:t>2.3 Опис модулів розроблюваної системи</w:t>
-              <w:tab/>
-              <w:t>16</w:t>
-            </w:r>
-          </w:hyperlink>
+          <w:r>
+            <w:rPr>
+              <w:vanish w:val="false"/>
+            </w:rPr>
+            <w:t>2.3 Опис модулів розроблюваної системи</w:t>
+            <w:tab/>
+            <w:t>16</w:t>
+          </w:r>
         </w:p>
         <w:p>
           <w:pPr>
@@ -2244,17 +2193,14 @@
             </w:tabs>
             <w:rPr/>
           </w:pPr>
-          <w:hyperlink w:anchor="__RefHeading___Toc2403_792400555" w:tooltip="2.4 Висновки за другим розділом">
-            <w:r>
-              <w:rPr>
-                <w:webHidden/>
-                <w:rStyle w:val="Style18"/>
-              </w:rPr>
-              <w:t>2.4 Висновки за другим розділом</w:t>
-              <w:tab/>
-              <w:t>16</w:t>
-            </w:r>
-          </w:hyperlink>
+          <w:r>
+            <w:rPr>
+              <w:vanish w:val="false"/>
+            </w:rPr>
+            <w:t>2.4 Висновки за другим розділом</w:t>
+            <w:tab/>
+            <w:t>16</w:t>
+          </w:r>
         </w:p>
         <w:p>
           <w:pPr>
@@ -2265,17 +2211,14 @@
             </w:tabs>
             <w:rPr/>
           </w:pPr>
-          <w:hyperlink w:anchor="__RefHeading___Toc2405_792400555" w:tooltip="3 Основні рішення щодо реалізації компонентів системи">
-            <w:r>
-              <w:rPr>
-                <w:webHidden/>
-                <w:rStyle w:val="Style18"/>
-              </w:rPr>
-              <w:t>3 Основні рішення щодо реалізації компонентів системи</w:t>
-              <w:tab/>
-              <w:t>17</w:t>
-            </w:r>
-          </w:hyperlink>
+          <w:r>
+            <w:rPr>
+              <w:vanish w:val="false"/>
+            </w:rPr>
+            <w:t>3 Основні рішення щодо реалізації компонентів системи</w:t>
+            <w:tab/>
+            <w:t>17</w:t>
+          </w:r>
         </w:p>
         <w:p>
           <w:pPr>
@@ -2286,17 +2229,14 @@
             </w:tabs>
             <w:rPr/>
           </w:pPr>
-          <w:hyperlink w:anchor="__RefHeading___Toc2407_792400555" w:tooltip="3.1 Алгоритм функціонування розробленої програми">
-            <w:r>
-              <w:rPr>
-                <w:webHidden/>
-                <w:rStyle w:val="Style18"/>
-              </w:rPr>
-              <w:t>3.1 Алгоритм функціонування розробленої програми</w:t>
-              <w:tab/>
-              <w:t>17</w:t>
-            </w:r>
-          </w:hyperlink>
+          <w:r>
+            <w:rPr>
+              <w:vanish w:val="false"/>
+            </w:rPr>
+            <w:t>3.1 Алгоритм функціонування розробленої програми</w:t>
+            <w:tab/>
+            <w:t>17</w:t>
+          </w:r>
         </w:p>
         <w:p>
           <w:pPr>
@@ -2307,17 +2247,14 @@
             </w:tabs>
             <w:rPr/>
           </w:pPr>
-          <w:hyperlink w:anchor="__RefHeading___Toc2409_792400555" w:tooltip="3.2 Вибір шаблону проєктування">
-            <w:r>
-              <w:rPr>
-                <w:webHidden/>
-                <w:rStyle w:val="Style18"/>
-              </w:rPr>
-              <w:t>3.2 Вибір шаблону проєктування</w:t>
-              <w:tab/>
-              <w:t>17</w:t>
-            </w:r>
-          </w:hyperlink>
+          <w:r>
+            <w:rPr>
+              <w:vanish w:val="false"/>
+            </w:rPr>
+            <w:t>3.2 Вибір шаблону проєктування</w:t>
+            <w:tab/>
+            <w:t>17</w:t>
+          </w:r>
         </w:p>
         <w:p>
           <w:pPr>
@@ -2328,17 +2265,14 @@
             </w:tabs>
             <w:rPr/>
           </w:pPr>
-          <w:hyperlink w:anchor="__RefHeading___Toc2411_792400555" w:tooltip="3.5 Висновки за третім розділом">
-            <w:r>
-              <w:rPr>
-                <w:webHidden/>
-                <w:rStyle w:val="Style18"/>
-              </w:rPr>
-              <w:t>3.5 Висновки за третім розділом</w:t>
-              <w:tab/>
-              <w:t>18</w:t>
-            </w:r>
-          </w:hyperlink>
+          <w:r>
+            <w:rPr>
+              <w:vanish w:val="false"/>
+            </w:rPr>
+            <w:t>3.5 Висновки за третім розділом</w:t>
+            <w:tab/>
+            <w:t>18</w:t>
+          </w:r>
         </w:p>
         <w:p>
           <w:pPr>
@@ -2349,17 +2283,14 @@
             </w:tabs>
             <w:rPr/>
           </w:pPr>
-          <w:hyperlink w:anchor="__RefHeading___Toc2413_792400555" w:tooltip="4 Керівництво програміста">
-            <w:r>
-              <w:rPr>
-                <w:webHidden/>
-                <w:rStyle w:val="Style18"/>
-              </w:rPr>
-              <w:t>4 Керівництво програміста</w:t>
-              <w:tab/>
-              <w:t>19</w:t>
-            </w:r>
-          </w:hyperlink>
+          <w:r>
+            <w:rPr>
+              <w:vanish w:val="false"/>
+            </w:rPr>
+            <w:t>4 Керівництво програміста</w:t>
+            <w:tab/>
+            <w:t>19</w:t>
+          </w:r>
         </w:p>
         <w:p>
           <w:pPr>
@@ -2370,17 +2301,14 @@
             </w:tabs>
             <w:rPr/>
           </w:pPr>
-          <w:hyperlink w:anchor="__RefHeading___Toc2415_792400555" w:tooltip="4.1 Призначення й умови застосування програми">
-            <w:r>
-              <w:rPr>
-                <w:webHidden/>
-                <w:rStyle w:val="Style18"/>
-              </w:rPr>
-              <w:t>4.1 Призначення й умови застосування програми</w:t>
-              <w:tab/>
-              <w:t>19</w:t>
-            </w:r>
-          </w:hyperlink>
+          <w:r>
+            <w:rPr>
+              <w:vanish w:val="false"/>
+            </w:rPr>
+            <w:t>4.1 Призначення й умови застосування програми</w:t>
+            <w:tab/>
+            <w:t>19</w:t>
+          </w:r>
         </w:p>
         <w:p>
           <w:pPr>
@@ -2391,17 +2319,14 @@
             </w:tabs>
             <w:rPr/>
           </w:pPr>
-          <w:hyperlink w:anchor="__RefHeading___Toc2417_792400555" w:tooltip="4.2 Характеристики програми">
-            <w:r>
-              <w:rPr>
-                <w:webHidden/>
-                <w:rStyle w:val="Style18"/>
-              </w:rPr>
-              <w:t>4.2 Характеристики програми</w:t>
-              <w:tab/>
-              <w:t>20</w:t>
-            </w:r>
-          </w:hyperlink>
+          <w:r>
+            <w:rPr>
+              <w:vanish w:val="false"/>
+            </w:rPr>
+            <w:t>4.2 Характеристики програми</w:t>
+            <w:tab/>
+            <w:t>20</w:t>
+          </w:r>
         </w:p>
         <w:p>
           <w:pPr>
@@ -2412,17 +2337,14 @@
             </w:tabs>
             <w:rPr/>
           </w:pPr>
-          <w:hyperlink w:anchor="__RefHeading___Toc2419_792400555" w:tooltip="4.3 Звертання до програми">
-            <w:r>
-              <w:rPr>
-                <w:webHidden/>
-                <w:rStyle w:val="Style18"/>
-              </w:rPr>
-              <w:t>4.3 Звертання до програми</w:t>
-              <w:tab/>
-              <w:t>20</w:t>
-            </w:r>
-          </w:hyperlink>
+          <w:r>
+            <w:rPr>
+              <w:vanish w:val="false"/>
+            </w:rPr>
+            <w:t>4.3 Звертання до програми</w:t>
+            <w:tab/>
+            <w:t>20</w:t>
+          </w:r>
         </w:p>
         <w:p>
           <w:pPr>
@@ -2433,17 +2355,14 @@
             </w:tabs>
             <w:rPr/>
           </w:pPr>
-          <w:hyperlink w:anchor="__RefHeading___Toc2421_792400555" w:tooltip="4.4 Початкові та вихідні дані">
-            <w:r>
-              <w:rPr>
-                <w:webHidden/>
-                <w:rStyle w:val="Style18"/>
-              </w:rPr>
-              <w:t>4.4 Початкові та вихідні дані</w:t>
-              <w:tab/>
-              <w:t>21</w:t>
-            </w:r>
-          </w:hyperlink>
+          <w:r>
+            <w:rPr>
+              <w:vanish w:val="false"/>
+            </w:rPr>
+            <w:t>4.4 Початкові та вихідні дані</w:t>
+            <w:tab/>
+            <w:t>21</w:t>
+          </w:r>
         </w:p>
         <w:p>
           <w:pPr>
@@ -2454,17 +2373,14 @@
             </w:tabs>
             <w:rPr/>
           </w:pPr>
-          <w:hyperlink w:anchor="__RefHeading___Toc2423_792400555" w:tooltip="4.5 Повідомлення програмісту">
-            <w:r>
-              <w:rPr>
-                <w:webHidden/>
-                <w:rStyle w:val="Style18"/>
-              </w:rPr>
-              <w:t>4.5 Повідомлення програмісту</w:t>
-              <w:tab/>
-              <w:t>21</w:t>
-            </w:r>
-          </w:hyperlink>
+          <w:r>
+            <w:rPr>
+              <w:vanish w:val="false"/>
+            </w:rPr>
+            <w:t>4.5 Повідомлення програмісту</w:t>
+            <w:tab/>
+            <w:t>21</w:t>
+          </w:r>
         </w:p>
         <w:p>
           <w:pPr>
@@ -2475,17 +2391,14 @@
             </w:tabs>
             <w:rPr/>
           </w:pPr>
-          <w:hyperlink w:anchor="__RefHeading___Toc2425_792400555" w:tooltip="5 Керівництво оператора">
-            <w:r>
-              <w:rPr>
-                <w:webHidden/>
-                <w:rStyle w:val="Style18"/>
-              </w:rPr>
-              <w:t>5 Керівництво оператора</w:t>
-              <w:tab/>
-              <w:t>22</w:t>
-            </w:r>
-          </w:hyperlink>
+          <w:r>
+            <w:rPr>
+              <w:vanish w:val="false"/>
+            </w:rPr>
+            <w:t>5 Керівництво оператора</w:t>
+            <w:tab/>
+            <w:t>22</w:t>
+          </w:r>
         </w:p>
         <w:p>
           <w:pPr>
@@ -2496,17 +2409,14 @@
             </w:tabs>
             <w:rPr/>
           </w:pPr>
-          <w:hyperlink w:anchor="__RefHeading___Toc2427_792400555" w:tooltip="5.1 Призначення програми">
-            <w:r>
-              <w:rPr>
-                <w:webHidden/>
-                <w:rStyle w:val="Style18"/>
-              </w:rPr>
-              <w:t>5.1 Призначення програми</w:t>
-              <w:tab/>
-              <w:t>22</w:t>
-            </w:r>
-          </w:hyperlink>
+          <w:r>
+            <w:rPr>
+              <w:vanish w:val="false"/>
+            </w:rPr>
+            <w:t>5.1 Призначення програми</w:t>
+            <w:tab/>
+            <w:t>22</w:t>
+          </w:r>
         </w:p>
         <w:p>
           <w:pPr>
@@ -2517,17 +2427,14 @@
             </w:tabs>
             <w:rPr/>
           </w:pPr>
-          <w:hyperlink w:anchor="__RefHeading___Toc2429_792400555" w:tooltip="5.2 Умови виконання програми">
-            <w:r>
-              <w:rPr>
-                <w:webHidden/>
-                <w:rStyle w:val="Style18"/>
-              </w:rPr>
-              <w:t>5.2 Умови виконання програми</w:t>
-              <w:tab/>
-              <w:t>22</w:t>
-            </w:r>
-          </w:hyperlink>
+          <w:r>
+            <w:rPr>
+              <w:vanish w:val="false"/>
+            </w:rPr>
+            <w:t>5.2 Умови виконання програми</w:t>
+            <w:tab/>
+            <w:t>22</w:t>
+          </w:r>
         </w:p>
         <w:p>
           <w:pPr>
@@ -2538,17 +2445,14 @@
             </w:tabs>
             <w:rPr/>
           </w:pPr>
-          <w:hyperlink w:anchor="__RefHeading___Toc2431_792400555" w:tooltip="5.3 Виконання програми">
-            <w:r>
-              <w:rPr>
-                <w:webHidden/>
-                <w:rStyle w:val="Style18"/>
-              </w:rPr>
-              <w:t>5.3 Виконання програми</w:t>
-              <w:tab/>
-              <w:t>22</w:t>
-            </w:r>
-          </w:hyperlink>
+          <w:r>
+            <w:rPr>
+              <w:vanish w:val="false"/>
+            </w:rPr>
+            <w:t>5.3 Виконання програми</w:t>
+            <w:tab/>
+            <w:t>22</w:t>
+          </w:r>
         </w:p>
         <w:p>
           <w:pPr>
@@ -2559,17 +2463,14 @@
             </w:tabs>
             <w:rPr/>
           </w:pPr>
-          <w:hyperlink w:anchor="__RefHeading___Toc2433_792400555" w:tooltip="5.4 Повідомлення оператору">
-            <w:r>
-              <w:rPr>
-                <w:webHidden/>
-                <w:rStyle w:val="Style18"/>
-              </w:rPr>
-              <w:t>5.4 Повідомлення оператору</w:t>
-              <w:tab/>
-              <w:t>22</w:t>
-            </w:r>
-          </w:hyperlink>
+          <w:r>
+            <w:rPr>
+              <w:vanish w:val="false"/>
+            </w:rPr>
+            <w:t>5.4 Повідомлення оператору</w:t>
+            <w:tab/>
+            <w:t>22</w:t>
+          </w:r>
         </w:p>
         <w:p>
           <w:pPr>
@@ -2580,17 +2481,14 @@
             </w:tabs>
             <w:rPr/>
           </w:pPr>
-          <w:hyperlink w:anchor="__RefHeading___Toc2435_792400555" w:tooltip="6 Тестування і результати">
-            <w:r>
-              <w:rPr>
-                <w:webHidden/>
-                <w:rStyle w:val="Style18"/>
-              </w:rPr>
-              <w:t>6 Тестування і результати</w:t>
-              <w:tab/>
-              <w:t>26</w:t>
-            </w:r>
-          </w:hyperlink>
+          <w:r>
+            <w:rPr>
+              <w:vanish w:val="false"/>
+            </w:rPr>
+            <w:t>6 Тестування і результати</w:t>
+            <w:tab/>
+            <w:t>26</w:t>
+          </w:r>
         </w:p>
         <w:p>
           <w:pPr>
@@ -2601,17 +2499,14 @@
             </w:tabs>
             <w:rPr/>
           </w:pPr>
-          <w:hyperlink w:anchor="__RefHeading___Toc2437_792400555" w:tooltip="6.1 Опис методити проведення тестування">
-            <w:r>
-              <w:rPr>
-                <w:webHidden/>
-                <w:rStyle w:val="Style18"/>
-              </w:rPr>
-              <w:t>6.1 Опис методити проведення тестування</w:t>
-              <w:tab/>
-              <w:t>26</w:t>
-            </w:r>
-          </w:hyperlink>
+          <w:r>
+            <w:rPr>
+              <w:vanish w:val="false"/>
+            </w:rPr>
+            <w:t>6.1 Опис методити проведення тестування</w:t>
+            <w:tab/>
+            <w:t>26</w:t>
+          </w:r>
         </w:p>
         <w:p>
           <w:pPr>
@@ -2622,17 +2517,14 @@
             </w:tabs>
             <w:rPr/>
           </w:pPr>
-          <w:hyperlink w:anchor="__RefHeading___Toc2439_792400555" w:tooltip="6.2 Результати використання розробленого програмного забезпечення">
-            <w:r>
-              <w:rPr>
-                <w:webHidden/>
-                <w:rStyle w:val="Style18"/>
-              </w:rPr>
-              <w:t>6.2 Результати використання розробленого програмного забезпечення</w:t>
-              <w:tab/>
-              <w:t>26</w:t>
-            </w:r>
-          </w:hyperlink>
+          <w:r>
+            <w:rPr>
+              <w:vanish w:val="false"/>
+            </w:rPr>
+            <w:t>6.2 Результати використання розробленого програмного забезпечення</w:t>
+            <w:tab/>
+            <w:t>26</w:t>
+          </w:r>
         </w:p>
         <w:p>
           <w:pPr>
@@ -2643,17 +2535,14 @@
             </w:tabs>
             <w:rPr/>
           </w:pPr>
-          <w:hyperlink w:anchor="__RefHeading___Toc2441_792400555" w:tooltip="Висновки">
-            <w:r>
-              <w:rPr>
-                <w:webHidden/>
-                <w:rStyle w:val="Style18"/>
-              </w:rPr>
-              <w:t>Висновки</w:t>
-              <w:tab/>
-              <w:t>27</w:t>
-            </w:r>
-          </w:hyperlink>
+          <w:r>
+            <w:rPr>
+              <w:vanish w:val="false"/>
+            </w:rPr>
+            <w:t>Висновки</w:t>
+            <w:tab/>
+            <w:t>27</w:t>
+          </w:r>
         </w:p>
         <w:p>
           <w:pPr>
@@ -2664,17 +2553,14 @@
             </w:tabs>
             <w:rPr/>
           </w:pPr>
-          <w:hyperlink w:anchor="__RefHeading___Toc2443_792400555" w:tooltip="Список використаних джерел">
-            <w:r>
-              <w:rPr>
-                <w:webHidden/>
-                <w:rStyle w:val="Style18"/>
-              </w:rPr>
-              <w:t>Список використаних джерел</w:t>
-              <w:tab/>
-              <w:t>28</w:t>
-            </w:r>
-          </w:hyperlink>
+          <w:r>
+            <w:rPr>
+              <w:vanish w:val="false"/>
+            </w:rPr>
+            <w:t>Список використаних джерел</w:t>
+            <w:tab/>
+            <w:t>28</w:t>
+          </w:r>
         </w:p>
         <w:p>
           <w:pPr>
@@ -2685,17 +2571,14 @@
             </w:tabs>
             <w:rPr/>
           </w:pPr>
-          <w:hyperlink w:anchor="__RefHeading___Toc2445_792400555" w:tooltip="Додаток А">
-            <w:r>
-              <w:rPr>
-                <w:webHidden/>
-                <w:rStyle w:val="Style18"/>
-              </w:rPr>
-              <w:t>Додаток А</w:t>
-              <w:tab/>
-              <w:t>29</w:t>
-            </w:r>
-          </w:hyperlink>
+          <w:r>
+            <w:rPr>
+              <w:vanish w:val="false"/>
+            </w:rPr>
+            <w:t>Додаток А</w:t>
+            <w:tab/>
+            <w:t>29</w:t>
+          </w:r>
         </w:p>
         <w:p>
           <w:pPr>
@@ -2706,17 +2589,14 @@
             </w:tabs>
             <w:rPr/>
           </w:pPr>
-          <w:hyperlink w:anchor="__RefHeading___Toc2447_792400555" w:tooltip="А.1 Вступ">
-            <w:r>
-              <w:rPr>
-                <w:webHidden/>
-                <w:rStyle w:val="Style18"/>
-              </w:rPr>
-              <w:t>А.1 Вступ</w:t>
-              <w:tab/>
-              <w:t>30</w:t>
-            </w:r>
-          </w:hyperlink>
+          <w:r>
+            <w:rPr>
+              <w:vanish w:val="false"/>
+            </w:rPr>
+            <w:t>А.1 Вступ</w:t>
+            <w:tab/>
+            <w:t>30</w:t>
+          </w:r>
         </w:p>
         <w:p>
           <w:pPr>
@@ -2727,17 +2607,14 @@
             </w:tabs>
             <w:rPr/>
           </w:pPr>
-          <w:hyperlink w:anchor="__RefHeading___Toc2449_792400555" w:tooltip="А.1.1 Назва програми">
-            <w:r>
-              <w:rPr>
-                <w:webHidden/>
-                <w:rStyle w:val="Style18"/>
-              </w:rPr>
-              <w:t>А.1.1 Назва програми</w:t>
-              <w:tab/>
-              <w:t>30</w:t>
-            </w:r>
-          </w:hyperlink>
+          <w:r>
+            <w:rPr>
+              <w:vanish w:val="false"/>
+            </w:rPr>
+            <w:t>А.1.1 Назва програми</w:t>
+            <w:tab/>
+            <w:t>30</w:t>
+          </w:r>
         </w:p>
         <w:p>
           <w:pPr>
@@ -2748,17 +2625,14 @@
             </w:tabs>
             <w:rPr/>
           </w:pPr>
-          <w:hyperlink w:anchor="__RefHeading___Toc2451_792400555" w:tooltip="А.1.2 Призначення та область застосування">
-            <w:r>
-              <w:rPr>
-                <w:webHidden/>
-                <w:rStyle w:val="Style18"/>
-              </w:rPr>
-              <w:t>А.1.2 Призначення та область застосування</w:t>
-              <w:tab/>
-              <w:t>30</w:t>
-            </w:r>
-          </w:hyperlink>
+          <w:r>
+            <w:rPr>
+              <w:vanish w:val="false"/>
+            </w:rPr>
+            <w:t>А.1.2 Призначення та область застосування</w:t>
+            <w:tab/>
+            <w:t>30</w:t>
+          </w:r>
         </w:p>
         <w:p>
           <w:pPr>
@@ -2769,17 +2643,14 @@
             </w:tabs>
             <w:rPr/>
           </w:pPr>
-          <w:hyperlink w:anchor="__RefHeading___Toc2453_792400555" w:tooltip="А.2 Підстави для розробки">
-            <w:r>
-              <w:rPr>
-                <w:webHidden/>
-                <w:rStyle w:val="Style18"/>
-              </w:rPr>
-              <w:t>А.2 Підстави для розробки</w:t>
-              <w:tab/>
-              <w:t>30</w:t>
-            </w:r>
-          </w:hyperlink>
+          <w:r>
+            <w:rPr>
+              <w:vanish w:val="false"/>
+            </w:rPr>
+            <w:t>А.2 Підстави для розробки</w:t>
+            <w:tab/>
+            <w:t>30</w:t>
+          </w:r>
         </w:p>
         <w:p>
           <w:pPr>
@@ -2790,17 +2661,14 @@
             </w:tabs>
             <w:rPr/>
           </w:pPr>
-          <w:hyperlink w:anchor="__RefHeading___Toc2455_792400555" w:tooltip="А.3 Призначення розробки">
-            <w:r>
-              <w:rPr>
-                <w:webHidden/>
-                <w:rStyle w:val="Style18"/>
-              </w:rPr>
-              <w:t>А.3 Призначення розробки</w:t>
-              <w:tab/>
-              <w:t>30</w:t>
-            </w:r>
-          </w:hyperlink>
+          <w:r>
+            <w:rPr>
+              <w:vanish w:val="false"/>
+            </w:rPr>
+            <w:t>А.3 Призначення розробки</w:t>
+            <w:tab/>
+            <w:t>30</w:t>
+          </w:r>
         </w:p>
         <w:p>
           <w:pPr>
@@ -2811,17 +2679,14 @@
             </w:tabs>
             <w:rPr/>
           </w:pPr>
-          <w:hyperlink w:anchor="__RefHeading___Toc2457_792400555" w:tooltip="А.4 Вимоги до програми">
-            <w:r>
-              <w:rPr>
-                <w:webHidden/>
-                <w:rStyle w:val="Style18"/>
-              </w:rPr>
-              <w:t>А.4 Вимоги до програми</w:t>
-              <w:tab/>
-              <w:t>30</w:t>
-            </w:r>
-          </w:hyperlink>
+          <w:r>
+            <w:rPr>
+              <w:vanish w:val="false"/>
+            </w:rPr>
+            <w:t>А.4 Вимоги до програми</w:t>
+            <w:tab/>
+            <w:t>30</w:t>
+          </w:r>
         </w:p>
         <w:p>
           <w:pPr>
@@ -2832,17 +2697,14 @@
             </w:tabs>
             <w:rPr/>
           </w:pPr>
-          <w:hyperlink w:anchor="__RefHeading___Toc2459_792400555" w:tooltip="А.4.1 Вимоги до функціональних характеристик">
-            <w:r>
-              <w:rPr>
-                <w:webHidden/>
-                <w:rStyle w:val="Style18"/>
-              </w:rPr>
-              <w:t>А.4.1 Вимоги до функціональних характеристик</w:t>
-              <w:tab/>
-              <w:t>31</w:t>
-            </w:r>
-          </w:hyperlink>
+          <w:r>
+            <w:rPr>
+              <w:vanish w:val="false"/>
+            </w:rPr>
+            <w:t>А.4.1 Вимоги до функціональних характеристик</w:t>
+            <w:tab/>
+            <w:t>31</w:t>
+          </w:r>
         </w:p>
         <w:p>
           <w:pPr>
@@ -2853,17 +2715,14 @@
             </w:tabs>
             <w:rPr/>
           </w:pPr>
-          <w:hyperlink w:anchor="__RefHeading___Toc2461_792400555" w:tooltip="А.4.2 Вимоги до надійності">
-            <w:r>
-              <w:rPr>
-                <w:webHidden/>
-                <w:rStyle w:val="Style18"/>
-              </w:rPr>
-              <w:t>А.4.2 Вимоги до надійності</w:t>
-              <w:tab/>
-              <w:t>31</w:t>
-            </w:r>
-          </w:hyperlink>
+          <w:r>
+            <w:rPr>
+              <w:vanish w:val="false"/>
+            </w:rPr>
+            <w:t>А.4.2 Вимоги до надійності</w:t>
+            <w:tab/>
+            <w:t>31</w:t>
+          </w:r>
         </w:p>
         <w:p>
           <w:pPr>
@@ -2874,17 +2733,14 @@
             </w:tabs>
             <w:rPr/>
           </w:pPr>
-          <w:hyperlink w:anchor="__RefHeading___Toc2463_792400555" w:tooltip="А.4.3 Вимоги до технічних та програмних засобів">
-            <w:r>
-              <w:rPr>
-                <w:webHidden/>
-                <w:rStyle w:val="Style18"/>
-              </w:rPr>
-              <w:t>А.4.3 Вимоги до технічних та програмних засобів</w:t>
-              <w:tab/>
-              <w:t>31</w:t>
-            </w:r>
-          </w:hyperlink>
+          <w:r>
+            <w:rPr>
+              <w:vanish w:val="false"/>
+            </w:rPr>
+            <w:t>А.4.3 Вимоги до технічних та програмних засобів</w:t>
+            <w:tab/>
+            <w:t>31</w:t>
+          </w:r>
         </w:p>
         <w:p>
           <w:pPr>
@@ -2895,17 +2751,14 @@
             </w:tabs>
             <w:rPr/>
           </w:pPr>
-          <w:hyperlink w:anchor="__RefHeading___Toc2465_792400555" w:tooltip="А.5 Вимоги до програмної документації">
-            <w:r>
-              <w:rPr>
-                <w:webHidden/>
-                <w:rStyle w:val="Style18"/>
-              </w:rPr>
-              <w:t>А.5 Вимоги до програмної документації</w:t>
-              <w:tab/>
-              <w:t>32</w:t>
-            </w:r>
-          </w:hyperlink>
+          <w:r>
+            <w:rPr>
+              <w:vanish w:val="false"/>
+            </w:rPr>
+            <w:t>А.5 Вимоги до програмної документації</w:t>
+            <w:tab/>
+            <w:t>32</w:t>
+          </w:r>
         </w:p>
         <w:p>
           <w:pPr>
@@ -2916,17 +2769,14 @@
             </w:tabs>
             <w:rPr/>
           </w:pPr>
-          <w:hyperlink w:anchor="__RefHeading___Toc2467_792400555" w:tooltip="А.6 Стадії і етапи розробки">
-            <w:r>
-              <w:rPr>
-                <w:webHidden/>
-                <w:rStyle w:val="Style18"/>
-              </w:rPr>
-              <w:t>А.6 Стадії і етапи розробки</w:t>
-              <w:tab/>
-              <w:t>32</w:t>
-            </w:r>
-          </w:hyperlink>
+          <w:r>
+            <w:rPr>
+              <w:vanish w:val="false"/>
+            </w:rPr>
+            <w:t>А.6 Стадії і етапи розробки</w:t>
+            <w:tab/>
+            <w:t>32</w:t>
+          </w:r>
         </w:p>
         <w:p>
           <w:pPr>
@@ -2937,17 +2787,14 @@
             </w:tabs>
             <w:rPr/>
           </w:pPr>
-          <w:hyperlink w:anchor="__RefHeading___Toc2469_792400555" w:tooltip="А.6.1 Стадії розробки">
-            <w:r>
-              <w:rPr>
-                <w:webHidden/>
-                <w:rStyle w:val="Style18"/>
-              </w:rPr>
-              <w:t>А.6.1 Стадії розробки</w:t>
-              <w:tab/>
-              <w:t>32</w:t>
-            </w:r>
-          </w:hyperlink>
+          <w:r>
+            <w:rPr>
+              <w:vanish w:val="false"/>
+            </w:rPr>
+            <w:t>А.6.1 Стадії розробки</w:t>
+            <w:tab/>
+            <w:t>32</w:t>
+          </w:r>
         </w:p>
         <w:p>
           <w:pPr>
@@ -2958,17 +2805,14 @@
             </w:tabs>
             <w:rPr/>
           </w:pPr>
-          <w:hyperlink w:anchor="__RefHeading___Toc2471_792400555" w:tooltip="А.6.2 Етапи розробки">
-            <w:r>
-              <w:rPr>
-                <w:webHidden/>
-                <w:rStyle w:val="Style18"/>
-              </w:rPr>
-              <w:t>А.6.2 Етапи розробки</w:t>
-              <w:tab/>
-              <w:t>32</w:t>
-            </w:r>
-          </w:hyperlink>
+          <w:r>
+            <w:rPr>
+              <w:vanish w:val="false"/>
+            </w:rPr>
+            <w:t>А.6.2 Етапи розробки</w:t>
+            <w:tab/>
+            <w:t>32</w:t>
+          </w:r>
         </w:p>
         <w:p>
           <w:pPr>
@@ -2979,17 +2823,14 @@
             </w:tabs>
             <w:rPr/>
           </w:pPr>
-          <w:hyperlink w:anchor="__RefHeading___Toc2473_792400555" w:tooltip="А.6.3 Зміст робіт по етапах">
-            <w:r>
-              <w:rPr>
-                <w:webHidden/>
-                <w:rStyle w:val="Style18"/>
-              </w:rPr>
-              <w:t>А.6.3 Зміст робіт по етапах</w:t>
-              <w:tab/>
-              <w:t>32</w:t>
-            </w:r>
-          </w:hyperlink>
+          <w:r>
+            <w:rPr>
+              <w:vanish w:val="false"/>
+            </w:rPr>
+            <w:t>А.6.3 Зміст робіт по етапах</w:t>
+            <w:tab/>
+            <w:t>32</w:t>
+          </w:r>
         </w:p>
         <w:p>
           <w:pPr>
@@ -3000,17 +2841,14 @@
             </w:tabs>
             <w:rPr/>
           </w:pPr>
-          <w:hyperlink w:anchor="__RefHeading___Toc2475_792400555" w:tooltip="Додаток Б">
-            <w:r>
-              <w:rPr>
-                <w:webHidden/>
-                <w:rStyle w:val="Style18"/>
-              </w:rPr>
-              <w:t>Додаток Б</w:t>
-              <w:tab/>
-              <w:t>34</w:t>
-            </w:r>
-          </w:hyperlink>
+          <w:r>
+            <w:rPr>
+              <w:vanish w:val="false"/>
+            </w:rPr>
+            <w:t>Додаток Б</w:t>
+            <w:tab/>
+            <w:t>34</w:t>
+          </w:r>
         </w:p>
         <w:p>
           <w:pPr>
@@ -3021,17 +2859,14 @@
             </w:tabs>
             <w:rPr/>
           </w:pPr>
-          <w:hyperlink w:anchor="__RefHeading___Toc2477_792400555" w:tooltip="Б.1 Загальні відомості">
-            <w:r>
-              <w:rPr>
-                <w:webHidden/>
-                <w:rStyle w:val="Style18"/>
-              </w:rPr>
-              <w:t>Б.1 Загальні відомості</w:t>
-              <w:tab/>
-              <w:t>35</w:t>
-            </w:r>
-          </w:hyperlink>
+          <w:r>
+            <w:rPr>
+              <w:vanish w:val="false"/>
+            </w:rPr>
+            <w:t>Б.1 Загальні відомості</w:t>
+            <w:tab/>
+            <w:t>35</w:t>
+          </w:r>
         </w:p>
         <w:p>
           <w:pPr>
@@ -3042,17 +2877,14 @@
             </w:tabs>
             <w:rPr/>
           </w:pPr>
-          <w:hyperlink w:anchor="__RefHeading___Toc2479_792400555" w:tooltip="Б.2 Функціональне призначення">
-            <w:r>
-              <w:rPr>
-                <w:webHidden/>
-                <w:rStyle w:val="Style18"/>
-              </w:rPr>
-              <w:t>Б.2 Функціональне призначення</w:t>
-              <w:tab/>
-              <w:t>35</w:t>
-            </w:r>
-          </w:hyperlink>
+          <w:r>
+            <w:rPr>
+              <w:vanish w:val="false"/>
+            </w:rPr>
+            <w:t>Б.2 Функціональне призначення</w:t>
+            <w:tab/>
+            <w:t>35</w:t>
+          </w:r>
         </w:p>
         <w:p>
           <w:pPr>
@@ -3063,17 +2895,14 @@
             </w:tabs>
             <w:rPr/>
           </w:pPr>
-          <w:hyperlink w:anchor="__RefHeading___Toc2481_792400555" w:tooltip="Б.3 Опис логічної структури програми">
-            <w:r>
-              <w:rPr>
-                <w:webHidden/>
-                <w:rStyle w:val="Style18"/>
-              </w:rPr>
-              <w:t>Б.3 Опис логічної структури програми</w:t>
-              <w:tab/>
-              <w:t>35</w:t>
-            </w:r>
-          </w:hyperlink>
+          <w:r>
+            <w:rPr>
+              <w:vanish w:val="false"/>
+            </w:rPr>
+            <w:t>Б.3 Опис логічної структури програми</w:t>
+            <w:tab/>
+            <w:t>35</w:t>
+          </w:r>
         </w:p>
         <w:p>
           <w:pPr>
@@ -3084,17 +2913,14 @@
             </w:tabs>
             <w:rPr/>
           </w:pPr>
-          <w:hyperlink w:anchor="__RefHeading___Toc2483_792400555" w:tooltip="Б.3.1 Алгоритм шифрування">
-            <w:r>
-              <w:rPr>
-                <w:webHidden/>
-                <w:rStyle w:val="Style18"/>
-              </w:rPr>
-              <w:t>Б.3.1 Алгоритм шифрування</w:t>
-              <w:tab/>
-              <w:t>35</w:t>
-            </w:r>
-          </w:hyperlink>
+          <w:r>
+            <w:rPr>
+              <w:vanish w:val="false"/>
+            </w:rPr>
+            <w:t>Б.3.1 Алгоритм шифрування</w:t>
+            <w:tab/>
+            <w:t>35</w:t>
+          </w:r>
         </w:p>
         <w:p>
           <w:pPr>
@@ -3105,17 +2931,14 @@
             </w:tabs>
             <w:rPr/>
           </w:pPr>
-          <w:hyperlink w:anchor="__RefHeading___Toc2485_792400555" w:tooltip="Б.4 Використані технічні засоби">
-            <w:r>
-              <w:rPr>
-                <w:webHidden/>
-                <w:rStyle w:val="Style18"/>
-              </w:rPr>
-              <w:t>Б.4 Використані технічні засоби</w:t>
-              <w:tab/>
-              <w:t>36</w:t>
-            </w:r>
-          </w:hyperlink>
+          <w:r>
+            <w:rPr>
+              <w:vanish w:val="false"/>
+            </w:rPr>
+            <w:t>Б.4 Використані технічні засоби</w:t>
+            <w:tab/>
+            <w:t>36</w:t>
+          </w:r>
         </w:p>
         <w:p>
           <w:pPr>
@@ -3126,17 +2949,14 @@
             </w:tabs>
             <w:rPr/>
           </w:pPr>
-          <w:hyperlink w:anchor="__RefHeading___Toc2487_792400555" w:tooltip="Б.5 Виклик і завантаження">
-            <w:r>
-              <w:rPr>
-                <w:webHidden/>
-                <w:rStyle w:val="Style18"/>
-              </w:rPr>
-              <w:t>Б.5 Виклик і завантаження</w:t>
-              <w:tab/>
-              <w:t>36</w:t>
-            </w:r>
-          </w:hyperlink>
+          <w:r>
+            <w:rPr>
+              <w:vanish w:val="false"/>
+            </w:rPr>
+            <w:t>Б.5 Виклик і завантаження</w:t>
+            <w:tab/>
+            <w:t>36</w:t>
+          </w:r>
         </w:p>
         <w:p>
           <w:pPr>
@@ -3147,17 +2967,14 @@
             </w:tabs>
             <w:rPr/>
           </w:pPr>
-          <w:hyperlink w:anchor="__RefHeading___Toc2489_792400555" w:tooltip="Б.6 Початкові дані">
-            <w:r>
-              <w:rPr>
-                <w:webHidden/>
-                <w:rStyle w:val="Style18"/>
-              </w:rPr>
-              <w:t>Б.6 Початкові дані</w:t>
-              <w:tab/>
-              <w:t>36</w:t>
-            </w:r>
-          </w:hyperlink>
+          <w:r>
+            <w:rPr>
+              <w:vanish w:val="false"/>
+            </w:rPr>
+            <w:t>Б.6 Початкові дані</w:t>
+            <w:tab/>
+            <w:t>36</w:t>
+          </w:r>
         </w:p>
         <w:p>
           <w:pPr>
@@ -3168,17 +2985,14 @@
             </w:tabs>
             <w:rPr/>
           </w:pPr>
-          <w:hyperlink w:anchor="__RefHeading___Toc2491_792400555" w:tooltip="Додаток В">
-            <w:r>
-              <w:rPr>
-                <w:webHidden/>
-                <w:rStyle w:val="Style18"/>
-              </w:rPr>
-              <w:t>Додаток В</w:t>
-              <w:tab/>
-              <w:t>37</w:t>
-            </w:r>
-          </w:hyperlink>
+          <w:r>
+            <w:rPr>
+              <w:vanish w:val="false"/>
+            </w:rPr>
+            <w:t>Додаток В</w:t>
+            <w:tab/>
+            <w:t>37</w:t>
+          </w:r>
         </w:p>
         <w:p>
           <w:pPr>
@@ -3189,17 +3003,14 @@
             </w:tabs>
             <w:rPr/>
           </w:pPr>
-          <w:hyperlink w:anchor="__RefHeading___Toc2493_792400555" w:tooltip="Текст головного файлу">
-            <w:r>
-              <w:rPr>
-                <w:webHidden/>
-                <w:rStyle w:val="Style18"/>
-              </w:rPr>
-              <w:t>Текст головного файлу</w:t>
-              <w:tab/>
-              <w:t>38</w:t>
-            </w:r>
-          </w:hyperlink>
+          <w:r>
+            <w:rPr>
+              <w:vanish w:val="false"/>
+            </w:rPr>
+            <w:t>Текст головного файлу</w:t>
+            <w:tab/>
+            <w:t>38</w:t>
+          </w:r>
         </w:p>
         <w:p>
           <w:pPr>
@@ -3210,20 +3021,17 @@
             </w:tabs>
             <w:rPr/>
           </w:pPr>
-          <w:hyperlink w:anchor="__RefHeading___Toc2495_792400555" w:tooltip="Додаток Г">
-            <w:r>
-              <w:rPr>
-                <w:webHidden/>
-                <w:rStyle w:val="Style18"/>
-              </w:rPr>
-              <w:t>Додаток Г</w:t>
-              <w:tab/>
-              <w:t>41</w:t>
-            </w:r>
-          </w:hyperlink>
           <w:r>
             <w:rPr>
-              <w:rStyle w:val="Style18"/>
+              <w:vanish w:val="false"/>
+            </w:rPr>
+            <w:t>Додаток Г</w:t>
+            <w:tab/>
+            <w:t>41</w:t>
+          </w:r>
+          <w:r>
+            <w:rPr>
+              <w:vanish w:val="false"/>
             </w:rPr>
             <w:fldChar w:fldCharType="end"/>
           </w:r>
@@ -3272,14 +3080,14 @@
         </w:rPr>
       </w:pPr>
       <w:bookmarkStart w:id="18" w:name="__RefHeading___Toc2371_792400555"/>
-      <w:bookmarkStart w:id="19" w:name="_Toc29924"/>
-      <w:bookmarkStart w:id="20" w:name="_Toc27554779"/>
-      <w:bookmarkStart w:id="21" w:name="_Зміст000068"/>
-      <w:bookmarkStart w:id="22" w:name="_Toc196826521"/>
-      <w:bookmarkStart w:id="23" w:name="_Зміст000065"/>
-      <w:bookmarkStart w:id="24" w:name="_Зміст000005"/>
-      <w:bookmarkStart w:id="25" w:name="_Зміст000031"/>
-      <w:bookmarkStart w:id="26" w:name="_Toc533520912"/>
+      <w:bookmarkStart w:id="19" w:name="_Toc533520912"/>
+      <w:bookmarkStart w:id="20" w:name="_Зміст000031"/>
+      <w:bookmarkStart w:id="21" w:name="_Зміст000005"/>
+      <w:bookmarkStart w:id="22" w:name="_Зміст000065"/>
+      <w:bookmarkStart w:id="23" w:name="_Toc196826521"/>
+      <w:bookmarkStart w:id="24" w:name="_Зміст000068"/>
+      <w:bookmarkStart w:id="25" w:name="_Toc27554779"/>
+      <w:bookmarkStart w:id="26" w:name="_Toc29924"/>
       <w:bookmarkEnd w:id="18"/>
       <w:r>
         <w:rPr>
@@ -3463,13 +3271,13 @@
         </w:rPr>
       </w:pPr>
       <w:bookmarkStart w:id="27" w:name="__RefHeading___Toc2373_792400555"/>
-      <w:bookmarkStart w:id="28" w:name="_Toc196826522"/>
-      <w:bookmarkStart w:id="29" w:name="_Зміст000006"/>
-      <w:bookmarkStart w:id="30" w:name="_Toc27554780"/>
+      <w:bookmarkStart w:id="28" w:name="_Toc31110"/>
+      <w:bookmarkStart w:id="29" w:name="_Зміст000032"/>
+      <w:bookmarkStart w:id="30" w:name="_Toc533520911"/>
       <w:bookmarkStart w:id="31" w:name="_Зміст000069"/>
-      <w:bookmarkStart w:id="32" w:name="_Toc533520911"/>
-      <w:bookmarkStart w:id="33" w:name="_Зміст000032"/>
-      <w:bookmarkStart w:id="34" w:name="_Toc31110"/>
+      <w:bookmarkStart w:id="32" w:name="_Toc27554780"/>
+      <w:bookmarkStart w:id="33" w:name="_Зміст000006"/>
+      <w:bookmarkStart w:id="34" w:name="_Toc196826522"/>
       <w:bookmarkEnd w:id="27"/>
       <w:r>
         <w:rPr>
@@ -3657,11 +3465,11 @@
         </w:rPr>
       </w:pPr>
       <w:bookmarkStart w:id="35" w:name="__RefHeading___Toc2375_792400555"/>
-      <w:bookmarkStart w:id="36" w:name="_Toc533520913"/>
-      <w:bookmarkStart w:id="37" w:name="_Зміст000070"/>
+      <w:bookmarkStart w:id="36" w:name="_Toc196826523"/>
+      <w:bookmarkStart w:id="37" w:name="_Toc27554781"/>
       <w:bookmarkStart w:id="38" w:name="_Toc19024"/>
-      <w:bookmarkStart w:id="39" w:name="_Toc27554781"/>
-      <w:bookmarkStart w:id="40" w:name="_Toc196826523"/>
+      <w:bookmarkStart w:id="39" w:name="_Зміст000070"/>
+      <w:bookmarkStart w:id="40" w:name="_Toc533520913"/>
       <w:bookmarkEnd w:id="35"/>
       <w:r>
         <w:rPr>
@@ -4173,9 +3981,9 @@
         </w:rPr>
       </w:pPr>
       <w:bookmarkStart w:id="41" w:name="__RefHeading___Toc2377_792400555"/>
-      <w:bookmarkStart w:id="42" w:name="_Toc196826524"/>
+      <w:bookmarkStart w:id="42" w:name="_Зміст000071"/>
       <w:bookmarkStart w:id="43" w:name="_Toc25684"/>
-      <w:bookmarkStart w:id="44" w:name="_Зміст000071"/>
+      <w:bookmarkStart w:id="44" w:name="_Toc196826524"/>
       <w:bookmarkStart w:id="45" w:name="_Toc27554782"/>
       <w:bookmarkEnd w:id="41"/>
       <w:r>
@@ -4264,13 +4072,13 @@
         </w:rPr>
       </w:pPr>
       <w:bookmarkStart w:id="46" w:name="__RefHeading___Toc2379_792400555"/>
-      <w:bookmarkStart w:id="47" w:name="_Зміст000007"/>
-      <w:bookmarkStart w:id="48" w:name="_Toc14290"/>
+      <w:bookmarkStart w:id="47" w:name="_Зміст000072"/>
+      <w:bookmarkStart w:id="48" w:name="_Toc196826525"/>
       <w:bookmarkStart w:id="49" w:name="_Зміст000033"/>
-      <w:bookmarkStart w:id="50" w:name="_Toc196826525"/>
-      <w:bookmarkStart w:id="51" w:name="_Зміст000072"/>
-      <w:bookmarkStart w:id="52" w:name="_Toc27554783"/>
-      <w:bookmarkStart w:id="53" w:name="_Toc533520914"/>
+      <w:bookmarkStart w:id="50" w:name="_Toc14290"/>
+      <w:bookmarkStart w:id="51" w:name="_Зміст000007"/>
+      <w:bookmarkStart w:id="52" w:name="_Toc533520914"/>
+      <w:bookmarkStart w:id="53" w:name="_Toc27554783"/>
       <w:bookmarkEnd w:id="46"/>
       <w:r>
         <w:rPr>
@@ -4303,10 +4111,10 @@
       </w:pPr>
       <w:bookmarkStart w:id="54" w:name="__RefHeading___Toc2381_792400555"/>
       <w:bookmarkStart w:id="55" w:name="_Toc17577"/>
-      <w:bookmarkStart w:id="56" w:name="_Зміст000008"/>
-      <w:bookmarkStart w:id="57" w:name="_Toc196826526"/>
-      <w:bookmarkStart w:id="58" w:name="_Зміст000034"/>
-      <w:bookmarkStart w:id="59" w:name="_Зміст000073"/>
+      <w:bookmarkStart w:id="56" w:name="_Зміст000073"/>
+      <w:bookmarkStart w:id="57" w:name="_Зміст000034"/>
+      <w:bookmarkStart w:id="58" w:name="_Toc196826526"/>
+      <w:bookmarkStart w:id="59" w:name="_Зміст000008"/>
       <w:bookmarkEnd w:id="54"/>
       <w:r>
         <w:rPr>
@@ -4564,10 +4372,10 @@
       </w:pPr>
       <w:bookmarkStart w:id="60" w:name="__RefHeading___Toc2383_792400555"/>
       <w:bookmarkStart w:id="61" w:name="_Toc1121"/>
-      <w:bookmarkStart w:id="62" w:name="_Зміст000035"/>
-      <w:bookmarkStart w:id="63" w:name="_Зміст000009"/>
-      <w:bookmarkStart w:id="64" w:name="_Зміст000074"/>
-      <w:bookmarkStart w:id="65" w:name="_Toc196826527"/>
+      <w:bookmarkStart w:id="62" w:name="_Toc196826527"/>
+      <w:bookmarkStart w:id="63" w:name="_Зміст000074"/>
+      <w:bookmarkStart w:id="64" w:name="_Зміст000009"/>
+      <w:bookmarkStart w:id="65" w:name="_Зміст000035"/>
       <w:bookmarkEnd w:id="60"/>
       <w:r>
         <w:rPr>
@@ -4936,11 +4744,11 @@
         </w:rPr>
       </w:pPr>
       <w:bookmarkStart w:id="66" w:name="__RefHeading___Toc2385_792400555"/>
-      <w:bookmarkStart w:id="67" w:name="_Toc196826529"/>
-      <w:bookmarkStart w:id="68" w:name="_Зміст000011"/>
+      <w:bookmarkStart w:id="67" w:name="_Toc24053"/>
+      <w:bookmarkStart w:id="68" w:name="_Зміст000037"/>
       <w:bookmarkStart w:id="69" w:name="_Зміст000076"/>
-      <w:bookmarkStart w:id="70" w:name="_Зміст000037"/>
-      <w:bookmarkStart w:id="71" w:name="_Toc24053"/>
+      <w:bookmarkStart w:id="70" w:name="_Зміст000011"/>
+      <w:bookmarkStart w:id="71" w:name="_Toc196826529"/>
       <w:bookmarkEnd w:id="66"/>
       <w:r>
         <w:rPr>
@@ -5581,9 +5389,9 @@
         </w:rPr>
       </w:pPr>
       <w:bookmarkStart w:id="72" w:name="__RefHeading___Toc2387_792400555"/>
-      <w:bookmarkStart w:id="73" w:name="_Зміст000077"/>
+      <w:bookmarkStart w:id="73" w:name="_Toc25781"/>
       <w:bookmarkStart w:id="74" w:name="_Toc196826530"/>
-      <w:bookmarkStart w:id="75" w:name="_Toc25781"/>
+      <w:bookmarkStart w:id="75" w:name="_Зміст000077"/>
       <w:bookmarkEnd w:id="72"/>
       <w:r>
         <w:rPr>
@@ -5662,9 +5470,9 @@
         </w:rPr>
       </w:pPr>
       <w:bookmarkStart w:id="76" w:name="__RefHeading___Toc2389_792400555"/>
-      <w:bookmarkStart w:id="77" w:name="_Toc15598"/>
+      <w:bookmarkStart w:id="77" w:name="_Зміст000078"/>
       <w:bookmarkStart w:id="78" w:name="_Toc196826531"/>
-      <w:bookmarkStart w:id="79" w:name="_Зміст000078"/>
+      <w:bookmarkStart w:id="79" w:name="_Toc15598"/>
       <w:bookmarkEnd w:id="76"/>
       <w:r>
         <w:rPr>
@@ -5758,12 +5566,12 @@
         </w:rPr>
       </w:pPr>
       <w:bookmarkStart w:id="80" w:name="__RefHeading___Toc2391_792400555"/>
-      <w:bookmarkStart w:id="81" w:name="_Зміст000063"/>
-      <w:bookmarkStart w:id="82" w:name="_Зміст000079"/>
-      <w:bookmarkStart w:id="83" w:name="_Toc14854"/>
-      <w:bookmarkStart w:id="84" w:name="_Toc196826532"/>
-      <w:bookmarkStart w:id="85" w:name="_Зміст000038"/>
-      <w:bookmarkStart w:id="86" w:name="_Зміст000012"/>
+      <w:bookmarkStart w:id="81" w:name="_Зміст000012"/>
+      <w:bookmarkStart w:id="82" w:name="_Зміст000038"/>
+      <w:bookmarkStart w:id="83" w:name="_Toc196826532"/>
+      <w:bookmarkStart w:id="84" w:name="_Toc14854"/>
+      <w:bookmarkStart w:id="85" w:name="_Зміст000079"/>
+      <w:bookmarkStart w:id="86" w:name="_Зміст000063"/>
       <w:bookmarkEnd w:id="80"/>
       <w:r>
         <w:rPr>
@@ -5788,9 +5596,9 @@
         </w:rPr>
       </w:pPr>
       <w:bookmarkStart w:id="87" w:name="__RefHeading___Toc2393_792400555"/>
-      <w:bookmarkStart w:id="88" w:name="_Toc196826533"/>
+      <w:bookmarkStart w:id="88" w:name="_Зміст000080"/>
       <w:bookmarkStart w:id="89" w:name="_Toc4063"/>
-      <w:bookmarkStart w:id="90" w:name="_Зміст000080"/>
+      <w:bookmarkStart w:id="90" w:name="_Toc196826533"/>
       <w:bookmarkEnd w:id="87"/>
       <w:r>
         <w:rPr>
@@ -6062,11 +5870,11 @@
         </w:rPr>
       </w:pPr>
       <w:bookmarkStart w:id="91" w:name="__RefHeading___Toc2395_792400555"/>
-      <w:bookmarkStart w:id="92" w:name="_Зміст000081"/>
-      <w:bookmarkStart w:id="93" w:name="_Toc196826534"/>
+      <w:bookmarkStart w:id="92" w:name="_Toc19360"/>
+      <w:bookmarkStart w:id="93" w:name="_Зміст000013"/>
       <w:bookmarkStart w:id="94" w:name="_Зміст000039"/>
-      <w:bookmarkStart w:id="95" w:name="_Зміст000013"/>
-      <w:bookmarkStart w:id="96" w:name="_Toc19360"/>
+      <w:bookmarkStart w:id="95" w:name="_Toc196826534"/>
+      <w:bookmarkStart w:id="96" w:name="_Зміст000081"/>
       <w:bookmarkEnd w:id="91"/>
       <w:r>
         <w:rPr>
@@ -6318,8 +6126,8 @@
       </w:tblPr>
       <w:tblGrid>
         <w:gridCol w:w="2830"/>
-        <w:gridCol w:w="1549"/>
-        <w:gridCol w:w="1503"/>
+        <w:gridCol w:w="1548"/>
+        <w:gridCol w:w="1504"/>
         <w:gridCol w:w="1811"/>
       </w:tblGrid>
       <w:tr>
@@ -6335,7 +6143,7 @@
           </w:tcPr>
           <w:p>
             <w:pPr>
-              <w:pStyle w:val="user4"/>
+              <w:pStyle w:val="Style28"/>
               <w:spacing w:lineRule="auto" w:line="240" w:before="0" w:after="0"/>
               <w:rPr>
                 <w:rFonts w:ascii="Times New Roman" w:hAnsi="Times New Roman"/>
@@ -6361,7 +6169,7 @@
         </w:tc>
         <w:tc>
           <w:tcPr>
-            <w:tcW w:w="1549" w:type="dxa"/>
+            <w:tcW w:w="1548" w:type="dxa"/>
             <w:tcBorders>
               <w:top w:val="single" w:sz="4" w:space="0" w:color="000000"/>
               <w:start w:val="single" w:sz="4" w:space="0" w:color="000000"/>
@@ -6370,7 +6178,7 @@
           </w:tcPr>
           <w:p>
             <w:pPr>
-              <w:pStyle w:val="user4"/>
+              <w:pStyle w:val="Style28"/>
               <w:spacing w:lineRule="auto" w:line="240" w:before="0" w:after="0"/>
               <w:rPr>
                 <w:rFonts w:ascii="Times New Roman" w:hAnsi="Times New Roman"/>
@@ -6396,7 +6204,7 @@
         </w:tc>
         <w:tc>
           <w:tcPr>
-            <w:tcW w:w="1503" w:type="dxa"/>
+            <w:tcW w:w="1504" w:type="dxa"/>
             <w:tcBorders>
               <w:top w:val="single" w:sz="4" w:space="0" w:color="000000"/>
               <w:start w:val="single" w:sz="4" w:space="0" w:color="000000"/>
@@ -6405,7 +6213,7 @@
           </w:tcPr>
           <w:p>
             <w:pPr>
-              <w:pStyle w:val="user4"/>
+              <w:pStyle w:val="Style28"/>
               <w:spacing w:lineRule="auto" w:line="240" w:before="0" w:after="0"/>
               <w:rPr>
                 <w:rFonts w:ascii="Times New Roman" w:hAnsi="Times New Roman"/>
@@ -6441,7 +6249,7 @@
           </w:tcPr>
           <w:p>
             <w:pPr>
-              <w:pStyle w:val="user4"/>
+              <w:pStyle w:val="Style28"/>
               <w:spacing w:lineRule="auto" w:line="240" w:before="0" w:after="0"/>
               <w:rPr>
                 <w:rFonts w:ascii="Times New Roman" w:hAnsi="Times New Roman"/>
@@ -6478,7 +6286,7 @@
           </w:tcPr>
           <w:p>
             <w:pPr>
-              <w:pStyle w:val="user4"/>
+              <w:pStyle w:val="Style28"/>
               <w:spacing w:lineRule="auto" w:line="240" w:before="0" w:after="0"/>
               <w:rPr>
                 <w:rFonts w:ascii="Times New Roman" w:hAnsi="Times New Roman"/>
@@ -6500,7 +6308,7 @@
         </w:tc>
         <w:tc>
           <w:tcPr>
-            <w:tcW w:w="1549" w:type="dxa"/>
+            <w:tcW w:w="1548" w:type="dxa"/>
             <w:tcBorders>
               <w:start w:val="single" w:sz="4" w:space="0" w:color="000000"/>
               <w:bottom w:val="single" w:sz="4" w:space="0" w:color="000000"/>
@@ -6508,7 +6316,7 @@
           </w:tcPr>
           <w:p>
             <w:pPr>
-              <w:pStyle w:val="user4"/>
+              <w:pStyle w:val="Style28"/>
               <w:spacing w:lineRule="auto" w:line="240" w:before="0" w:after="0"/>
               <w:rPr>
                 <w:rFonts w:ascii="Times New Roman" w:hAnsi="Times New Roman"/>
@@ -6530,7 +6338,7 @@
         </w:tc>
         <w:tc>
           <w:tcPr>
-            <w:tcW w:w="1503" w:type="dxa"/>
+            <w:tcW w:w="1504" w:type="dxa"/>
             <w:tcBorders>
               <w:start w:val="single" w:sz="4" w:space="0" w:color="000000"/>
               <w:bottom w:val="single" w:sz="4" w:space="0" w:color="000000"/>
@@ -6538,7 +6346,7 @@
           </w:tcPr>
           <w:p>
             <w:pPr>
-              <w:pStyle w:val="user4"/>
+              <w:pStyle w:val="Style28"/>
               <w:spacing w:lineRule="auto" w:line="240" w:before="0" w:after="0"/>
               <w:rPr>
                 <w:rFonts w:ascii="Times New Roman" w:hAnsi="Times New Roman"/>
@@ -6569,7 +6377,7 @@
           </w:tcPr>
           <w:p>
             <w:pPr>
-              <w:pStyle w:val="user4"/>
+              <w:pStyle w:val="Style28"/>
               <w:spacing w:lineRule="auto" w:line="240" w:before="0" w:after="0"/>
               <w:rPr>
                 <w:rFonts w:ascii="Times New Roman" w:hAnsi="Times New Roman"/>
@@ -6602,7 +6410,7 @@
           </w:tcPr>
           <w:p>
             <w:pPr>
-              <w:pStyle w:val="user4"/>
+              <w:pStyle w:val="Style28"/>
               <w:spacing w:lineRule="auto" w:line="240" w:before="0" w:after="0"/>
               <w:rPr>
                 <w:rFonts w:ascii="Times New Roman" w:hAnsi="Times New Roman"/>
@@ -6624,7 +6432,7 @@
         </w:tc>
         <w:tc>
           <w:tcPr>
-            <w:tcW w:w="1549" w:type="dxa"/>
+            <w:tcW w:w="1548" w:type="dxa"/>
             <w:tcBorders>
               <w:start w:val="single" w:sz="4" w:space="0" w:color="000000"/>
               <w:bottom w:val="single" w:sz="4" w:space="0" w:color="000000"/>
@@ -6632,7 +6440,7 @@
           </w:tcPr>
           <w:p>
             <w:pPr>
-              <w:pStyle w:val="user4"/>
+              <w:pStyle w:val="Style28"/>
               <w:spacing w:lineRule="auto" w:line="240" w:before="0" w:after="0"/>
               <w:rPr>
                 <w:rFonts w:ascii="Times New Roman" w:hAnsi="Times New Roman"/>
@@ -6654,7 +6462,7 @@
         </w:tc>
         <w:tc>
           <w:tcPr>
-            <w:tcW w:w="1503" w:type="dxa"/>
+            <w:tcW w:w="1504" w:type="dxa"/>
             <w:tcBorders>
               <w:start w:val="single" w:sz="4" w:space="0" w:color="000000"/>
               <w:bottom w:val="single" w:sz="4" w:space="0" w:color="000000"/>
@@ -6662,7 +6470,7 @@
           </w:tcPr>
           <w:p>
             <w:pPr>
-              <w:pStyle w:val="user4"/>
+              <w:pStyle w:val="Style28"/>
               <w:spacing w:lineRule="auto" w:line="240" w:before="0" w:after="0"/>
               <w:rPr>
                 <w:rFonts w:ascii="Times New Roman" w:hAnsi="Times New Roman"/>
@@ -6693,7 +6501,7 @@
           </w:tcPr>
           <w:p>
             <w:pPr>
-              <w:pStyle w:val="user4"/>
+              <w:pStyle w:val="Style28"/>
               <w:spacing w:lineRule="auto" w:line="240" w:before="0" w:after="0"/>
               <w:rPr>
                 <w:rFonts w:ascii="Times New Roman" w:hAnsi="Times New Roman"/>
@@ -6726,7 +6534,7 @@
           </w:tcPr>
           <w:p>
             <w:pPr>
-              <w:pStyle w:val="user4"/>
+              <w:pStyle w:val="Style28"/>
               <w:spacing w:lineRule="auto" w:line="240" w:before="0" w:after="0"/>
               <w:rPr>
                 <w:rFonts w:ascii="Times New Roman" w:hAnsi="Times New Roman"/>
@@ -6748,7 +6556,7 @@
         </w:tc>
         <w:tc>
           <w:tcPr>
-            <w:tcW w:w="1549" w:type="dxa"/>
+            <w:tcW w:w="1548" w:type="dxa"/>
             <w:tcBorders>
               <w:start w:val="single" w:sz="4" w:space="0" w:color="000000"/>
               <w:bottom w:val="single" w:sz="4" w:space="0" w:color="000000"/>
@@ -6756,7 +6564,7 @@
           </w:tcPr>
           <w:p>
             <w:pPr>
-              <w:pStyle w:val="user4"/>
+              <w:pStyle w:val="Style28"/>
               <w:spacing w:lineRule="auto" w:line="240" w:before="0" w:after="0"/>
               <w:rPr>
                 <w:rFonts w:ascii="Times New Roman" w:hAnsi="Times New Roman"/>
@@ -6778,7 +6586,7 @@
         </w:tc>
         <w:tc>
           <w:tcPr>
-            <w:tcW w:w="1503" w:type="dxa"/>
+            <w:tcW w:w="1504" w:type="dxa"/>
             <w:tcBorders>
               <w:start w:val="single" w:sz="4" w:space="0" w:color="000000"/>
               <w:bottom w:val="single" w:sz="4" w:space="0" w:color="000000"/>
@@ -6786,7 +6594,7 @@
           </w:tcPr>
           <w:p>
             <w:pPr>
-              <w:pStyle w:val="user4"/>
+              <w:pStyle w:val="Style28"/>
               <w:spacing w:lineRule="auto" w:line="240" w:before="0" w:after="0"/>
               <w:rPr>
                 <w:rFonts w:ascii="Times New Roman" w:hAnsi="Times New Roman"/>
@@ -6817,7 +6625,7 @@
           </w:tcPr>
           <w:p>
             <w:pPr>
-              <w:pStyle w:val="user4"/>
+              <w:pStyle w:val="Style28"/>
               <w:spacing w:lineRule="auto" w:line="240" w:before="0" w:after="0"/>
               <w:rPr>
                 <w:rFonts w:ascii="Times New Roman" w:hAnsi="Times New Roman"/>
@@ -7116,8 +6924,8 @@
       </w:tblPr>
       <w:tblGrid>
         <w:gridCol w:w="2525"/>
-        <w:gridCol w:w="1544"/>
-        <w:gridCol w:w="1732"/>
+        <w:gridCol w:w="1543"/>
+        <w:gridCol w:w="1733"/>
       </w:tblGrid>
       <w:tr>
         <w:trPr/>
@@ -7132,7 +6940,7 @@
           </w:tcPr>
           <w:p>
             <w:pPr>
-              <w:pStyle w:val="user4"/>
+              <w:pStyle w:val="Style28"/>
               <w:spacing w:lineRule="auto" w:line="240" w:before="0" w:after="0"/>
               <w:rPr>
                 <w:rFonts w:ascii="Times New Roman" w:hAnsi="Times New Roman"/>
@@ -7158,7 +6966,7 @@
         </w:tc>
         <w:tc>
           <w:tcPr>
-            <w:tcW w:w="1544" w:type="dxa"/>
+            <w:tcW w:w="1543" w:type="dxa"/>
             <w:tcBorders>
               <w:top w:val="single" w:sz="4" w:space="0" w:color="000000"/>
               <w:start w:val="single" w:sz="4" w:space="0" w:color="000000"/>
@@ -7167,7 +6975,7 @@
           </w:tcPr>
           <w:p>
             <w:pPr>
-              <w:pStyle w:val="user4"/>
+              <w:pStyle w:val="Style28"/>
               <w:spacing w:lineRule="auto" w:line="240" w:before="0" w:after="0"/>
               <w:rPr>
                 <w:rFonts w:ascii="Times New Roman" w:hAnsi="Times New Roman"/>
@@ -7193,7 +7001,7 @@
         </w:tc>
         <w:tc>
           <w:tcPr>
-            <w:tcW w:w="1732" w:type="dxa"/>
+            <w:tcW w:w="1733" w:type="dxa"/>
             <w:tcBorders>
               <w:top w:val="single" w:sz="4" w:space="0" w:color="000000"/>
               <w:start w:val="single" w:sz="4" w:space="0" w:color="000000"/>
@@ -7203,7 +7011,7 @@
           </w:tcPr>
           <w:p>
             <w:pPr>
-              <w:pStyle w:val="user4"/>
+              <w:pStyle w:val="Style28"/>
               <w:spacing w:lineRule="auto" w:line="240" w:before="0" w:after="0"/>
               <w:rPr>
                 <w:rFonts w:ascii="Times New Roman" w:hAnsi="Times New Roman"/>
@@ -7240,7 +7048,7 @@
           </w:tcPr>
           <w:p>
             <w:pPr>
-              <w:pStyle w:val="user4"/>
+              <w:pStyle w:val="Style28"/>
               <w:spacing w:lineRule="auto" w:line="240" w:before="0" w:after="0"/>
               <w:rPr>
                 <w:rFonts w:ascii="Times New Roman" w:hAnsi="Times New Roman"/>
@@ -7262,7 +7070,7 @@
         </w:tc>
         <w:tc>
           <w:tcPr>
-            <w:tcW w:w="1544" w:type="dxa"/>
+            <w:tcW w:w="1543" w:type="dxa"/>
             <w:tcBorders>
               <w:start w:val="single" w:sz="4" w:space="0" w:color="000000"/>
               <w:bottom w:val="single" w:sz="4" w:space="0" w:color="000000"/>
@@ -7270,7 +7078,7 @@
           </w:tcPr>
           <w:p>
             <w:pPr>
-              <w:pStyle w:val="user4"/>
+              <w:pStyle w:val="Style28"/>
               <w:spacing w:lineRule="auto" w:line="240" w:before="0" w:after="0"/>
               <w:rPr>
                 <w:rFonts w:ascii="Times New Roman" w:hAnsi="Times New Roman"/>
@@ -7292,7 +7100,7 @@
         </w:tc>
         <w:tc>
           <w:tcPr>
-            <w:tcW w:w="1732" w:type="dxa"/>
+            <w:tcW w:w="1733" w:type="dxa"/>
             <w:tcBorders>
               <w:start w:val="single" w:sz="4" w:space="0" w:color="000000"/>
               <w:bottom w:val="single" w:sz="4" w:space="0" w:color="000000"/>
@@ -7301,7 +7109,7 @@
           </w:tcPr>
           <w:p>
             <w:pPr>
-              <w:pStyle w:val="user4"/>
+              <w:pStyle w:val="Style28"/>
               <w:spacing w:lineRule="auto" w:line="240" w:before="0" w:after="0"/>
               <w:rPr>
                 <w:rFonts w:ascii="Times New Roman" w:hAnsi="Times New Roman"/>
@@ -7334,7 +7142,7 @@
           </w:tcPr>
           <w:p>
             <w:pPr>
-              <w:pStyle w:val="user4"/>
+              <w:pStyle w:val="Style28"/>
               <w:spacing w:lineRule="auto" w:line="240" w:before="0" w:after="0"/>
               <w:rPr>
                 <w:rFonts w:ascii="Times New Roman" w:hAnsi="Times New Roman"/>
@@ -7356,7 +7164,7 @@
         </w:tc>
         <w:tc>
           <w:tcPr>
-            <w:tcW w:w="1544" w:type="dxa"/>
+            <w:tcW w:w="1543" w:type="dxa"/>
             <w:tcBorders>
               <w:start w:val="single" w:sz="4" w:space="0" w:color="000000"/>
               <w:bottom w:val="single" w:sz="4" w:space="0" w:color="000000"/>
@@ -7364,7 +7172,7 @@
           </w:tcPr>
           <w:p>
             <w:pPr>
-              <w:pStyle w:val="user4"/>
+              <w:pStyle w:val="Style28"/>
               <w:spacing w:lineRule="auto" w:line="240" w:before="0" w:after="0"/>
               <w:rPr>
                 <w:rFonts w:ascii="Times New Roman" w:hAnsi="Times New Roman"/>
@@ -7386,7 +7194,7 @@
         </w:tc>
         <w:tc>
           <w:tcPr>
-            <w:tcW w:w="1732" w:type="dxa"/>
+            <w:tcW w:w="1733" w:type="dxa"/>
             <w:tcBorders>
               <w:start w:val="single" w:sz="4" w:space="0" w:color="000000"/>
               <w:bottom w:val="single" w:sz="4" w:space="0" w:color="000000"/>
@@ -7395,7 +7203,7 @@
           </w:tcPr>
           <w:p>
             <w:pPr>
-              <w:pStyle w:val="user4"/>
+              <w:pStyle w:val="Style28"/>
               <w:spacing w:lineRule="auto" w:line="240" w:before="0" w:after="0"/>
               <w:rPr>
                 <w:rFonts w:ascii="Times New Roman" w:hAnsi="Times New Roman"/>
@@ -7428,7 +7236,7 @@
           </w:tcPr>
           <w:p>
             <w:pPr>
-              <w:pStyle w:val="user4"/>
+              <w:pStyle w:val="Style28"/>
               <w:spacing w:lineRule="auto" w:line="240" w:before="0" w:after="0"/>
               <w:rPr>
                 <w:rFonts w:ascii="Times New Roman" w:hAnsi="Times New Roman"/>
@@ -7450,7 +7258,7 @@
         </w:tc>
         <w:tc>
           <w:tcPr>
-            <w:tcW w:w="1544" w:type="dxa"/>
+            <w:tcW w:w="1543" w:type="dxa"/>
             <w:tcBorders>
               <w:start w:val="single" w:sz="4" w:space="0" w:color="000000"/>
               <w:bottom w:val="single" w:sz="4" w:space="0" w:color="000000"/>
@@ -7458,7 +7266,7 @@
           </w:tcPr>
           <w:p>
             <w:pPr>
-              <w:pStyle w:val="user4"/>
+              <w:pStyle w:val="Style28"/>
               <w:spacing w:lineRule="auto" w:line="240" w:before="0" w:after="0"/>
               <w:rPr>
                 <w:rFonts w:ascii="Times New Roman" w:hAnsi="Times New Roman"/>
@@ -7480,7 +7288,7 @@
         </w:tc>
         <w:tc>
           <w:tcPr>
-            <w:tcW w:w="1732" w:type="dxa"/>
+            <w:tcW w:w="1733" w:type="dxa"/>
             <w:tcBorders>
               <w:start w:val="single" w:sz="4" w:space="0" w:color="000000"/>
               <w:bottom w:val="single" w:sz="4" w:space="0" w:color="000000"/>
@@ -7489,7 +7297,7 @@
           </w:tcPr>
           <w:p>
             <w:pPr>
-              <w:pStyle w:val="user4"/>
+              <w:pStyle w:val="Style28"/>
               <w:spacing w:lineRule="auto" w:line="240" w:before="0" w:after="0"/>
               <w:rPr>
                 <w:rFonts w:ascii="Times New Roman" w:hAnsi="Times New Roman"/>
@@ -7550,11 +7358,11 @@
         </w:rPr>
       </w:pPr>
       <w:bookmarkStart w:id="97" w:name="__RefHeading___Toc2397_792400555"/>
-      <w:bookmarkStart w:id="98" w:name="_Зміст000082"/>
-      <w:bookmarkStart w:id="99" w:name="_Зміст000040"/>
+      <w:bookmarkStart w:id="98" w:name="_Toc196826535"/>
+      <w:bookmarkStart w:id="99" w:name="_Зміст000014"/>
       <w:bookmarkStart w:id="100" w:name="_Toc12907"/>
-      <w:bookmarkStart w:id="101" w:name="_Зміст000014"/>
-      <w:bookmarkStart w:id="102" w:name="_Toc196826535"/>
+      <w:bookmarkStart w:id="101" w:name="_Зміст000040"/>
+      <w:bookmarkStart w:id="102" w:name="_Зміст000082"/>
       <w:bookmarkEnd w:id="97"/>
       <w:r>
         <w:rPr>
@@ -8213,9 +8021,9 @@
         </w:rPr>
       </w:pPr>
       <w:bookmarkStart w:id="103" w:name="__RefHeading___Toc2399_792400555"/>
-      <w:bookmarkStart w:id="104" w:name="_Toc196826537"/>
+      <w:bookmarkStart w:id="104" w:name="_Toc31252"/>
       <w:bookmarkStart w:id="105" w:name="_Зміст000084"/>
-      <w:bookmarkStart w:id="106" w:name="_Toc31252"/>
+      <w:bookmarkStart w:id="106" w:name="_Toc196826537"/>
       <w:bookmarkEnd w:id="103"/>
       <w:r>
         <w:rPr>
@@ -8359,9 +8167,9 @@
         </w:rPr>
       </w:pPr>
       <w:bookmarkStart w:id="107" w:name="__RefHeading___Toc2401_792400555"/>
-      <w:bookmarkStart w:id="108" w:name="_Зміст000085"/>
+      <w:bookmarkStart w:id="108" w:name="_Toc4204"/>
       <w:bookmarkStart w:id="109" w:name="_Toc196826538"/>
-      <w:bookmarkStart w:id="110" w:name="_Toc4204"/>
+      <w:bookmarkStart w:id="110" w:name="_Зміст000085"/>
       <w:bookmarkEnd w:id="107"/>
       <w:r>
         <w:rPr>
@@ -8511,9 +8319,9 @@
         </w:rPr>
       </w:pPr>
       <w:bookmarkStart w:id="111" w:name="__RefHeading___Toc2403_792400555"/>
-      <w:bookmarkStart w:id="112" w:name="_Зміст000086"/>
+      <w:bookmarkStart w:id="112" w:name="_Toc8474"/>
       <w:bookmarkStart w:id="113" w:name="_Toc196826539"/>
-      <w:bookmarkStart w:id="114" w:name="_Toc8474"/>
+      <w:bookmarkStart w:id="114" w:name="_Зміст000086"/>
       <w:bookmarkEnd w:id="111"/>
       <w:r>
         <w:rPr>
@@ -8624,9 +8432,9 @@
         </w:rPr>
       </w:pPr>
       <w:bookmarkStart w:id="115" w:name="__RefHeading___Toc2405_792400555"/>
-      <w:bookmarkStart w:id="116" w:name="_Зміст000042"/>
+      <w:bookmarkStart w:id="116" w:name="_Toc24797"/>
       <w:bookmarkStart w:id="117" w:name="_Зміст000087"/>
-      <w:bookmarkStart w:id="118" w:name="_Toc24797"/>
+      <w:bookmarkStart w:id="118" w:name="_Зміст000042"/>
       <w:bookmarkEnd w:id="115"/>
       <w:r>
         <w:rPr>
@@ -8646,9 +8454,9 @@
         </w:rPr>
       </w:pPr>
       <w:bookmarkStart w:id="119" w:name="__RefHeading___Toc2407_792400555"/>
-      <w:bookmarkStart w:id="120" w:name="_Зміст000088"/>
+      <w:bookmarkStart w:id="120" w:name="_Toc17760"/>
       <w:bookmarkStart w:id="121" w:name="_Зміст000043"/>
-      <w:bookmarkStart w:id="122" w:name="_Toc17760"/>
+      <w:bookmarkStart w:id="122" w:name="_Зміст000088"/>
       <w:bookmarkEnd w:id="119"/>
       <w:r>
         <w:rPr>
@@ -8933,9 +8741,9 @@
         </w:rPr>
       </w:pPr>
       <w:bookmarkStart w:id="123" w:name="__RefHeading___Toc2409_792400555"/>
-      <w:bookmarkStart w:id="124" w:name="_Зміст000092"/>
+      <w:bookmarkStart w:id="124" w:name="_Toc231"/>
       <w:bookmarkStart w:id="125" w:name="_Зміст000047"/>
-      <w:bookmarkStart w:id="126" w:name="_Toc231"/>
+      <w:bookmarkStart w:id="126" w:name="_Зміст000092"/>
       <w:bookmarkEnd w:id="123"/>
       <w:r>
         <w:rPr>
@@ -9132,9 +8940,9 @@
         </w:rPr>
       </w:pPr>
       <w:bookmarkStart w:id="127" w:name="__RefHeading___Toc2411_792400555"/>
-      <w:bookmarkStart w:id="128" w:name="_Toc21967"/>
+      <w:bookmarkStart w:id="128" w:name="_Зміст000095"/>
       <w:bookmarkStart w:id="129" w:name="_Зміст000050"/>
-      <w:bookmarkStart w:id="130" w:name="_Зміст000095"/>
+      <w:bookmarkStart w:id="130" w:name="_Toc21967"/>
       <w:bookmarkEnd w:id="127"/>
       <w:r>
         <w:rPr>
@@ -11759,11 +11567,11 @@
         </w:rPr>
       </w:pPr>
       <w:bookmarkStart w:id="161" w:name="__RefHeading___Toc2443_792400555"/>
-      <w:bookmarkStart w:id="162" w:name="_Зміст000107"/>
-      <w:bookmarkStart w:id="163" w:name="_Toc23555"/>
+      <w:bookmarkStart w:id="162" w:name="_Toc196826540"/>
+      <w:bookmarkStart w:id="163" w:name="_Зміст000016"/>
       <w:bookmarkStart w:id="164" w:name="_Зміст000051"/>
-      <w:bookmarkStart w:id="165" w:name="_Зміст000016"/>
-      <w:bookmarkStart w:id="166" w:name="_Toc196826540"/>
+      <w:bookmarkStart w:id="165" w:name="_Toc23555"/>
+      <w:bookmarkStart w:id="166" w:name="_Зміст000107"/>
       <w:bookmarkEnd w:id="161"/>
       <w:r>
         <w:rPr>
@@ -12182,11 +11990,11 @@
         </w:rPr>
       </w:pPr>
       <w:bookmarkStart w:id="167" w:name="__RefHeading___Toc2445_792400555"/>
-      <w:bookmarkStart w:id="168" w:name="_Toc196826541"/>
-      <w:bookmarkStart w:id="169" w:name="_Зміст000017"/>
+      <w:bookmarkStart w:id="168" w:name="_Зміст000108"/>
+      <w:bookmarkStart w:id="169" w:name="_Зміст000052"/>
       <w:bookmarkStart w:id="170" w:name="_Toc19423"/>
-      <w:bookmarkStart w:id="171" w:name="_Зміст000052"/>
-      <w:bookmarkStart w:id="172" w:name="_Зміст000108"/>
+      <w:bookmarkStart w:id="171" w:name="_Зміст000017"/>
+      <w:bookmarkStart w:id="172" w:name="_Toc196826541"/>
       <w:bookmarkEnd w:id="167"/>
       <w:r>
         <w:rPr>
@@ -12232,11 +12040,11 @@
         </w:rPr>
       </w:pPr>
       <w:bookmarkStart w:id="173" w:name="__RefHeading___Toc2447_792400555"/>
-      <w:bookmarkStart w:id="174" w:name="_Зміст000053"/>
-      <w:bookmarkStart w:id="175" w:name="_Зміст000018"/>
+      <w:bookmarkStart w:id="174" w:name="_Toc196826542"/>
+      <w:bookmarkStart w:id="175" w:name="_Toc23903"/>
       <w:bookmarkStart w:id="176" w:name="_Зміст000109"/>
-      <w:bookmarkStart w:id="177" w:name="_Toc23903"/>
-      <w:bookmarkStart w:id="178" w:name="_Toc196826542"/>
+      <w:bookmarkStart w:id="177" w:name="_Зміст000018"/>
+      <w:bookmarkStart w:id="178" w:name="_Зміст000053"/>
       <w:bookmarkEnd w:id="173"/>
       <w:r>
         <w:rPr>
@@ -12259,11 +12067,11 @@
         </w:rPr>
       </w:pPr>
       <w:bookmarkStart w:id="179" w:name="__RefHeading___Toc2449_792400555"/>
-      <w:bookmarkStart w:id="180" w:name="_Зміст000110"/>
-      <w:bookmarkStart w:id="181" w:name="_Toc196826543"/>
+      <w:bookmarkStart w:id="180" w:name="_Зміст000019"/>
+      <w:bookmarkStart w:id="181" w:name="_Toc10522"/>
       <w:bookmarkStart w:id="182" w:name="_Зміст000054"/>
-      <w:bookmarkStart w:id="183" w:name="_Toc10522"/>
-      <w:bookmarkStart w:id="184" w:name="_Зміст000019"/>
+      <w:bookmarkStart w:id="183" w:name="_Toc196826543"/>
+      <w:bookmarkStart w:id="184" w:name="_Зміст000110"/>
       <w:bookmarkEnd w:id="179"/>
       <w:r>
         <w:rPr>
@@ -12306,21 +12114,7 @@
           <w:rFonts w:eastAsia="Times New Roman" w:cs="Times New Roman"/>
           <w:lang w:val="uk-UA"/>
         </w:rPr>
-        <w:t>Програма має назву «Застосунок шифрування-</w:t>
-      </w:r>
-      <w:r>
-        <w:rPr>
-          <w:rFonts w:eastAsia="Times New Roman" w:cs="Times New Roman"/>
-          <w:lang w:val="uk-UA"/>
-        </w:rPr>
-        <w:t>дешифрування</w:t>
-      </w:r>
-      <w:r>
-        <w:rPr>
-          <w:rFonts w:eastAsia="Times New Roman" w:cs="Times New Roman"/>
-          <w:lang w:val="uk-UA"/>
-        </w:rPr>
-        <w:t xml:space="preserve"> алгоритмом Віженера».</w:t>
+        <w:t>Програма має назву «Застосунок шифрування-дешифрування алгоритмом Віженера».</w:t>
       </w:r>
     </w:p>
     <w:p>
@@ -12347,11 +12141,11 @@
         </w:rPr>
       </w:pPr>
       <w:bookmarkStart w:id="185" w:name="__RefHeading___Toc2451_792400555"/>
-      <w:bookmarkStart w:id="186" w:name="_Toc6891"/>
-      <w:bookmarkStart w:id="187" w:name="_Toc196826544"/>
+      <w:bookmarkStart w:id="186" w:name="_Зміст000111"/>
+      <w:bookmarkStart w:id="187" w:name="_Зміст000055"/>
       <w:bookmarkStart w:id="188" w:name="_Зміст000020"/>
-      <w:bookmarkStart w:id="189" w:name="_Зміст000055"/>
-      <w:bookmarkStart w:id="190" w:name="_Зміст000111"/>
+      <w:bookmarkStart w:id="189" w:name="_Toc196826544"/>
+      <w:bookmarkStart w:id="190" w:name="_Toc6891"/>
       <w:bookmarkEnd w:id="185"/>
       <w:r>
         <w:rPr>
@@ -12410,56 +12204,7 @@
           <w:rFonts w:eastAsia="Times New Roman" w:cs="Times New Roman"/>
           <w:lang w:val="uk-UA"/>
         </w:rPr>
-        <w:t xml:space="preserve">Вона </w:t>
-      </w:r>
-      <w:r>
-        <w:rPr>
-          <w:rFonts w:eastAsia="Times New Roman" w:cs="Times New Roman"/>
-          <w:lang w:val="uk-UA"/>
-        </w:rPr>
-        <w:t xml:space="preserve">може </w:t>
-      </w:r>
-      <w:r>
-        <w:rPr>
-          <w:rFonts w:eastAsia="Times New Roman" w:cs="Times New Roman"/>
-          <w:lang w:val="uk-UA"/>
-        </w:rPr>
-        <w:t xml:space="preserve">бути використана </w:t>
-      </w:r>
-      <w:r>
-        <w:rPr>
-          <w:rFonts w:eastAsia="Times New Roman" w:cs="Times New Roman"/>
-          <w:lang w:val="uk-UA"/>
-        </w:rPr>
-        <w:t xml:space="preserve">звичайними людьми, колегами по роботі, тощо. Така програма спрощує зашифровану комунікацію </w:t>
-      </w:r>
-      <w:r>
-        <w:rPr>
-          <w:rFonts w:eastAsia="Times New Roman" w:cs="Times New Roman"/>
-          <w:lang w:val="uk-UA"/>
-        </w:rPr>
-        <w:t>або</w:t>
-      </w:r>
-      <w:r>
-        <w:rPr>
-          <w:rFonts w:eastAsia="Times New Roman" w:cs="Times New Roman"/>
-          <w:lang w:val="uk-UA"/>
-        </w:rPr>
-        <w:t xml:space="preserve"> </w:t>
-      </w:r>
-      <w:r>
-        <w:rPr>
-          <w:rFonts w:eastAsia="Times New Roman" w:cs="Times New Roman"/>
-          <w:lang w:val="uk-UA"/>
-        </w:rPr>
-        <w:t xml:space="preserve">приватні </w:t>
-      </w:r>
-      <w:r>
-        <w:rPr>
-          <w:rFonts w:eastAsia="Times New Roman" w:cs="Times New Roman"/>
-          <w:lang w:val="uk-UA"/>
-        </w:rPr>
-        <w:t>документи.</w:t>
+        <w:t>Вона може бути використана звичайними людьми, колегами по роботі, тощо. Така програма спрощує зашифровану комунікацію або приватні документи.</w:t>
       </w:r>
     </w:p>
     <w:p>
@@ -12485,9 +12230,9 @@
         </w:rPr>
       </w:pPr>
       <w:bookmarkStart w:id="191" w:name="__RefHeading___Toc2453_792400555"/>
-      <w:bookmarkStart w:id="192" w:name="_Зміст000112"/>
+      <w:bookmarkStart w:id="192" w:name="_Toc1373"/>
       <w:bookmarkStart w:id="193" w:name="_Toc196826545"/>
-      <w:bookmarkStart w:id="194" w:name="_Toc1373"/>
+      <w:bookmarkStart w:id="194" w:name="_Зміст000112"/>
       <w:bookmarkEnd w:id="191"/>
       <w:r>
         <w:rPr>
@@ -12553,9 +12298,9 @@
         </w:rPr>
       </w:pPr>
       <w:bookmarkStart w:id="195" w:name="__RefHeading___Toc2455_792400555"/>
-      <w:bookmarkStart w:id="196" w:name="_Toc196826546"/>
+      <w:bookmarkStart w:id="196" w:name="_Toc2435"/>
       <w:bookmarkStart w:id="197" w:name="_Зміст000113"/>
-      <w:bookmarkStart w:id="198" w:name="_Toc2435"/>
+      <w:bookmarkStart w:id="198" w:name="_Toc196826546"/>
       <w:bookmarkEnd w:id="195"/>
       <w:r>
         <w:rPr>
@@ -12595,21 +12340,7 @@
           <w:rFonts w:eastAsia="Times New Roman" w:cs="Times New Roman"/>
           <w:lang w:val="uk-UA"/>
         </w:rPr>
-        <w:t xml:space="preserve">Програма має дозволяти користувачам вводити власний текст </w:t>
-      </w:r>
-      <w:r>
-        <w:rPr>
-          <w:rFonts w:eastAsia="Times New Roman" w:cs="Times New Roman"/>
-          <w:lang w:val="uk-UA"/>
-        </w:rPr>
-        <w:t xml:space="preserve">разом з ключем, а на виході </w:t>
-      </w:r>
-      <w:r>
-        <w:rPr>
-          <w:rFonts w:eastAsia="Times New Roman" w:cs="Times New Roman"/>
-          <w:lang w:val="uk-UA"/>
-        </w:rPr>
-        <w:t>отримувати зашифровані дані.</w:t>
+        <w:t>Програма має дозволяти користувачам вводити власний текст разом з ключем, а на виході отримувати зашифровані дані.</w:t>
       </w:r>
     </w:p>
     <w:p>
@@ -12652,11 +12383,11 @@
         </w:rPr>
       </w:pPr>
       <w:bookmarkStart w:id="199" w:name="__RefHeading___Toc2457_792400555"/>
-      <w:bookmarkStart w:id="200" w:name="_Зміст000021"/>
-      <w:bookmarkStart w:id="201" w:name="_Зміст000114"/>
+      <w:bookmarkStart w:id="200" w:name="_Toc196826547"/>
+      <w:bookmarkStart w:id="201" w:name="_Toc26896"/>
       <w:bookmarkStart w:id="202" w:name="_Зміст000056"/>
-      <w:bookmarkStart w:id="203" w:name="_Toc26896"/>
-      <w:bookmarkStart w:id="204" w:name="_Toc196826547"/>
+      <w:bookmarkStart w:id="203" w:name="_Зміст000114"/>
+      <w:bookmarkStart w:id="204" w:name="_Зміст000021"/>
       <w:bookmarkEnd w:id="199"/>
       <w:r>
         <w:rPr>
@@ -12767,11 +12498,11 @@
         </w:rPr>
       </w:pPr>
       <w:bookmarkStart w:id="205" w:name="__RefHeading___Toc2459_792400555"/>
-      <w:bookmarkStart w:id="206" w:name="_Toc8988"/>
-      <w:bookmarkStart w:id="207" w:name="_Зміст000022"/>
+      <w:bookmarkStart w:id="206" w:name="_Зміст000115"/>
+      <w:bookmarkStart w:id="207" w:name="_Toc196826548"/>
       <w:bookmarkStart w:id="208" w:name="_Зміст000057"/>
-      <w:bookmarkStart w:id="209" w:name="_Toc196826548"/>
-      <w:bookmarkStart w:id="210" w:name="_Зміст000115"/>
+      <w:bookmarkStart w:id="209" w:name="_Зміст000022"/>
+      <w:bookmarkStart w:id="210" w:name="_Toc8988"/>
       <w:bookmarkEnd w:id="205"/>
       <w:r>
         <w:rPr>
@@ -12904,11 +12635,11 @@
         </w:rPr>
       </w:pPr>
       <w:bookmarkStart w:id="211" w:name="__RefHeading___Toc2461_792400555"/>
-      <w:bookmarkStart w:id="212" w:name="_Зміст000023"/>
-      <w:bookmarkStart w:id="213" w:name="_Toc196826549"/>
+      <w:bookmarkStart w:id="212" w:name="_Зміст000116"/>
+      <w:bookmarkStart w:id="213" w:name="_Зміст000058"/>
       <w:bookmarkStart w:id="214" w:name="_Toc21715"/>
-      <w:bookmarkStart w:id="215" w:name="_Зміст000058"/>
-      <w:bookmarkStart w:id="216" w:name="_Зміст000116"/>
+      <w:bookmarkStart w:id="215" w:name="_Toc196826549"/>
+      <w:bookmarkStart w:id="216" w:name="_Зміст000023"/>
       <w:bookmarkEnd w:id="211"/>
       <w:r>
         <w:rPr>
@@ -12994,11 +12725,11 @@
         </w:rPr>
       </w:pPr>
       <w:bookmarkStart w:id="217" w:name="__RefHeading___Toc2463_792400555"/>
-      <w:bookmarkStart w:id="218" w:name="_Зміст000117"/>
-      <w:bookmarkStart w:id="219" w:name="_Зміст000024"/>
+      <w:bookmarkStart w:id="218" w:name="_Toc196826550"/>
+      <w:bookmarkStart w:id="219" w:name="_Зміст000059"/>
       <w:bookmarkStart w:id="220" w:name="_Toc8780"/>
-      <w:bookmarkStart w:id="221" w:name="_Зміст000059"/>
-      <w:bookmarkStart w:id="222" w:name="_Toc196826550"/>
+      <w:bookmarkStart w:id="221" w:name="_Зміст000024"/>
+      <w:bookmarkStart w:id="222" w:name="_Зміст000117"/>
       <w:bookmarkEnd w:id="217"/>
       <w:r>
         <w:rPr>
@@ -13329,97 +13060,76 @@
           <w:rFonts w:eastAsia="Times New Roman" w:cs="Times New Roman"/>
           <w:lang w:val="en-US"/>
         </w:rPr>
-        <w:t>NiceGUI. Tailwind</w:t>
+        <w:t xml:space="preserve">NiceGUI. TailwindCSS </w:t>
+      </w:r>
+      <w:r>
+        <w:rPr>
+          <w:rFonts w:eastAsia="Times New Roman" w:cs="Times New Roman"/>
+          <w:lang w:val="uk-UA"/>
+        </w:rPr>
+        <w:t>має бути використаний для стилізації.</w:t>
+      </w:r>
+    </w:p>
+    <w:p>
+      <w:pPr>
+        <w:pStyle w:val="Common"/>
+        <w:rPr>
+          <w:rFonts w:eastAsia="Times New Roman" w:cs="Times New Roman"/>
+          <w:lang w:val="uk-UA"/>
+        </w:rPr>
+      </w:pPr>
+      <w:r>
+        <w:rPr>
+          <w:rFonts w:eastAsia="Times New Roman" w:cs="Times New Roman"/>
+          <w:lang w:val="uk-UA"/>
+        </w:rPr>
+      </w:r>
+    </w:p>
+    <w:p>
+      <w:pPr>
+        <w:pStyle w:val="Title3rd1"/>
+        <w:rPr/>
+      </w:pPr>
+      <w:r>
+        <w:rPr/>
+        <w:t>А.4.4 Вимоги до вхідних даних</w:t>
+      </w:r>
+    </w:p>
+    <w:p>
+      <w:pPr>
+        <w:pStyle w:val="Common"/>
+        <w:rPr>
+          <w:rFonts w:eastAsia="Times New Roman" w:cs="Times New Roman"/>
+          <w:lang w:val="uk-UA"/>
+        </w:rPr>
+      </w:pPr>
+      <w:r>
+        <w:rPr>
+          <w:rFonts w:eastAsia="Times New Roman" w:cs="Times New Roman"/>
+          <w:lang w:val="uk-UA"/>
+        </w:rPr>
+      </w:r>
+    </w:p>
+    <w:p>
+      <w:pPr>
+        <w:pStyle w:val="Common"/>
+        <w:rPr>
+          <w:rFonts w:eastAsia="Times New Roman" w:cs="Times New Roman"/>
+          <w:lang w:val="uk-UA"/>
+        </w:rPr>
+      </w:pPr>
+      <w:r>
+        <w:rPr>
+          <w:rFonts w:eastAsia="Times New Roman" w:cs="Times New Roman"/>
+          <w:lang w:val="uk-UA"/>
+        </w:rPr>
+        <w:t xml:space="preserve">Вимогами до ключа та введеного тексту є підтримка повної таблиці </w:t>
       </w:r>
       <w:r>
         <w:rPr>
           <w:rFonts w:eastAsia="Times New Roman" w:cs="Times New Roman"/>
           <w:lang w:val="en-US"/>
         </w:rPr>
-        <w:t>C</w:t>
-      </w:r>
-      <w:r>
-        <w:rPr>
-          <w:rFonts w:eastAsia="Times New Roman" w:cs="Times New Roman"/>
-          <w:lang w:val="en-US"/>
-        </w:rPr>
-        <w:t xml:space="preserve">SS </w:t>
-      </w:r>
-      <w:r>
-        <w:rPr>
-          <w:rFonts w:eastAsia="Times New Roman" w:cs="Times New Roman"/>
-          <w:lang w:val="uk-UA"/>
-        </w:rPr>
-        <w:t xml:space="preserve">має бути використаний </w:t>
-      </w:r>
-      <w:r>
-        <w:rPr>
-          <w:rFonts w:eastAsia="Times New Roman" w:cs="Times New Roman"/>
-          <w:lang w:val="uk-UA"/>
-        </w:rPr>
-        <w:t>для стилізації.</w:t>
-      </w:r>
-    </w:p>
-    <w:p>
-      <w:pPr>
-        <w:pStyle w:val="Common"/>
-        <w:rPr>
-          <w:rFonts w:eastAsia="Times New Roman" w:cs="Times New Roman"/>
-          <w:lang w:val="uk-UA"/>
-        </w:rPr>
-      </w:pPr>
-      <w:r>
-        <w:rPr>
-          <w:rFonts w:eastAsia="Times New Roman" w:cs="Times New Roman"/>
-          <w:lang w:val="uk-UA"/>
-        </w:rPr>
-      </w:r>
-    </w:p>
-    <w:p>
-      <w:pPr>
-        <w:pStyle w:val="Title3rd1"/>
-        <w:rPr/>
-      </w:pPr>
-      <w:r>
-        <w:rPr/>
-        <w:t>А.4.4 Вимоги до вхідних даних</w:t>
-      </w:r>
-    </w:p>
-    <w:p>
-      <w:pPr>
-        <w:pStyle w:val="Common"/>
-        <w:rPr>
-          <w:rFonts w:eastAsia="Times New Roman" w:cs="Times New Roman"/>
-          <w:lang w:val="uk-UA"/>
-        </w:rPr>
-      </w:pPr>
-      <w:r>
-        <w:rPr>
-          <w:rFonts w:eastAsia="Times New Roman" w:cs="Times New Roman"/>
-          <w:lang w:val="uk-UA"/>
-        </w:rPr>
-      </w:r>
-    </w:p>
-    <w:p>
-      <w:pPr>
-        <w:pStyle w:val="Common"/>
-        <w:rPr>
-          <w:rFonts w:eastAsia="Times New Roman" w:cs="Times New Roman"/>
-          <w:lang w:val="uk-UA"/>
-        </w:rPr>
-      </w:pPr>
-      <w:r>
-        <w:rPr>
-          <w:rFonts w:eastAsia="Times New Roman" w:cs="Times New Roman"/>
-          <w:lang w:val="uk-UA"/>
-        </w:rPr>
-        <w:t xml:space="preserve">Вимогами до ключа та введеного тексту є підтримка повної таблиці </w:t>
-      </w:r>
-      <w:r>
-        <w:rPr>
-          <w:rFonts w:eastAsia="Times New Roman" w:cs="Times New Roman"/>
-          <w:lang w:val="en-US"/>
-        </w:rPr>
         <w:t xml:space="preserve">ASCII, </w:t>
       </w:r>
       <w:r>
@@ -13453,9 +13163,9 @@
         </w:rPr>
       </w:pPr>
       <w:bookmarkStart w:id="223" w:name="__RefHeading___Toc2465_792400555"/>
-      <w:bookmarkStart w:id="224" w:name="_Toc196826551"/>
+      <w:bookmarkStart w:id="224" w:name="_Зміст000118"/>
       <w:bookmarkStart w:id="225" w:name="_Toc19314"/>
-      <w:bookmarkStart w:id="226" w:name="_Зміст000118"/>
+      <w:bookmarkStart w:id="226" w:name="_Toc196826551"/>
       <w:bookmarkEnd w:id="223"/>
       <w:r>
         <w:rPr>
@@ -13584,21 +13294,7 @@
           <w:rFonts w:eastAsia="Times New Roman" w:cs="Times New Roman"/>
           <w:lang w:val="uk-UA"/>
         </w:rPr>
-        <w:t xml:space="preserve">Код програми має бути написаний </w:t>
-      </w:r>
-      <w:r>
-        <w:rPr>
-          <w:rFonts w:eastAsia="Times New Roman" w:cs="Times New Roman"/>
-          <w:lang w:val="uk-UA"/>
-        </w:rPr>
-        <w:t>зі</w:t>
-      </w:r>
-      <w:r>
-        <w:rPr>
-          <w:rFonts w:eastAsia="Times New Roman" w:cs="Times New Roman"/>
-          <w:lang w:val="uk-UA"/>
-        </w:rPr>
-        <w:t xml:space="preserve"> зрозумілими назвами змінних/класів/методів і може включати коментарі.</w:t>
+        <w:t>Код програми має бути написаний зі зрозумілими назвами змінних/класів/методів і може включати коментарі.</w:t>
       </w:r>
     </w:p>
     <w:p>
@@ -13624,9 +13320,9 @@
         </w:rPr>
       </w:pPr>
       <w:bookmarkStart w:id="227" w:name="__RefHeading___Toc2467_792400555"/>
-      <w:bookmarkStart w:id="228" w:name="_Зміст000119"/>
+      <w:bookmarkStart w:id="228" w:name="_Toc196826552"/>
       <w:bookmarkStart w:id="229" w:name="_Toc12028"/>
-      <w:bookmarkStart w:id="230" w:name="_Toc196826552"/>
+      <w:bookmarkStart w:id="230" w:name="_Зміст000119"/>
       <w:bookmarkEnd w:id="227"/>
       <w:r>
         <w:rPr>
@@ -13647,11 +13343,11 @@
         </w:rPr>
       </w:pPr>
       <w:bookmarkStart w:id="231" w:name="__RefHeading___Toc2469_792400555"/>
-      <w:bookmarkStart w:id="232" w:name="_Toc27737"/>
-      <w:bookmarkStart w:id="233" w:name="_Toc196826553"/>
+      <w:bookmarkStart w:id="232" w:name="_Зміст000025"/>
+      <w:bookmarkStart w:id="233" w:name="_Зміст000060"/>
       <w:bookmarkStart w:id="234" w:name="_Зміст000120"/>
-      <w:bookmarkStart w:id="235" w:name="_Зміст000060"/>
-      <w:bookmarkStart w:id="236" w:name="_Зміст000025"/>
+      <w:bookmarkStart w:id="235" w:name="_Toc196826553"/>
+      <w:bookmarkStart w:id="236" w:name="_Toc27737"/>
       <w:bookmarkEnd w:id="231"/>
       <w:r>
         <w:rPr>
@@ -13799,11 +13495,11 @@
         </w:rPr>
       </w:pPr>
       <w:bookmarkStart w:id="237" w:name="__RefHeading___Toc2471_792400555"/>
-      <w:bookmarkStart w:id="238" w:name="_Зміст000061"/>
+      <w:bookmarkStart w:id="238" w:name="_Зміст000026"/>
       <w:bookmarkStart w:id="239" w:name="_Зміст000121"/>
-      <w:bookmarkStart w:id="240" w:name="_Зміст000026"/>
-      <w:bookmarkStart w:id="241" w:name="_Toc11650"/>
-      <w:bookmarkStart w:id="242" w:name="_Toc196826554"/>
+      <w:bookmarkStart w:id="240" w:name="_Зміст000061"/>
+      <w:bookmarkStart w:id="241" w:name="_Toc196826554"/>
+      <w:bookmarkStart w:id="242" w:name="_Toc11650"/>
       <w:bookmarkEnd w:id="237"/>
       <w:r>
         <w:rPr>
@@ -13931,14 +13627,7 @@
           <w:rFonts w:eastAsia="Times New Roman" w:cs="Times New Roman"/>
           <w:lang w:val="uk-UA"/>
         </w:rPr>
-        <w:t xml:space="preserve">Тестування та </w:t>
-      </w:r>
-      <w:r>
-        <w:rPr>
-          <w:rFonts w:eastAsia="Times New Roman" w:cs="Times New Roman"/>
-          <w:lang w:val="uk-UA"/>
-        </w:rPr>
-        <w:t>перероблювання;</w:t>
+        <w:t>Тестування та перероблювання;</w:t>
       </w:r>
     </w:p>
     <w:p>
@@ -13986,11 +13675,11 @@
         </w:rPr>
       </w:pPr>
       <w:bookmarkStart w:id="243" w:name="__RefHeading___Toc2473_792400555"/>
-      <w:bookmarkStart w:id="244" w:name="_Toc196826555"/>
-      <w:bookmarkStart w:id="245" w:name="_Зміст000027"/>
+      <w:bookmarkStart w:id="244" w:name="_Toc10935"/>
+      <w:bookmarkStart w:id="245" w:name="_Зміст000062"/>
       <w:bookmarkStart w:id="246" w:name="_Зміст000122"/>
-      <w:bookmarkStart w:id="247" w:name="_Зміст000062"/>
-      <w:bookmarkStart w:id="248" w:name="_Toc10935"/>
+      <w:bookmarkStart w:id="247" w:name="_Зміст000027"/>
+      <w:bookmarkStart w:id="248" w:name="_Toc196826555"/>
       <w:bookmarkEnd w:id="243"/>
       <w:r>
         <w:rPr>
@@ -14323,8 +14012,8 @@
         </w:rPr>
       </w:pPr>
       <w:bookmarkStart w:id="249" w:name="__RefHeading___Toc2475_792400555"/>
-      <w:bookmarkStart w:id="250" w:name="_Зміст000127"/>
-      <w:bookmarkStart w:id="251" w:name="_Toc11195"/>
+      <w:bookmarkStart w:id="250" w:name="_Toc11195"/>
+      <w:bookmarkStart w:id="251" w:name="_Зміст000127"/>
       <w:bookmarkEnd w:id="249"/>
       <w:r>
         <w:rPr>
@@ -14557,13 +14246,7 @@
         <w:rPr>
           <w:lang w:val="uk-UA"/>
         </w:rPr>
-        <w:t>/</w:t>
-      </w:r>
-      <w:r>
-        <w:rPr>
-          <w:lang w:val="uk-UA"/>
-        </w:rPr>
-        <w:t>дешифрування</w:t>
+        <w:t>/дешифрування</w:t>
       </w:r>
     </w:p>
     <w:p>
@@ -14667,39 +14350,20 @@
           <w:rFonts w:eastAsia="Times New Roman" w:cs="Times New Roman"/>
           <w:lang w:val="uk-UA"/>
         </w:rPr>
-        <w:t>Для д</w:t>
-      </w:r>
-      <w:r>
-        <w:rPr>
-          <w:rFonts w:eastAsia="Times New Roman" w:cs="Times New Roman"/>
-          <w:lang w:val="uk-UA"/>
-        </w:rPr>
-        <w:t xml:space="preserve">ешифрування </w:t>
-      </w:r>
-      <w:r>
-        <w:rPr>
-          <w:rFonts w:eastAsia="Times New Roman" w:cs="Times New Roman"/>
-          <w:lang w:val="uk-UA"/>
-        </w:rPr>
-        <w:t xml:space="preserve">формула така: </w:t>
-      </w:r>
-      <w:r>
-        <w:rPr>
-          <w:rFonts w:eastAsia="Times New Roman" w:cs="Times New Roman"/>
-          <w:lang w:val="uk-UA"/>
-        </w:rPr>
-        <w:t>(ЛітераШифру - ЛітераКлюча) % 128.</w:t>
-      </w:r>
-    </w:p>
-    <w:p>
-      <w:pPr>
-        <w:pStyle w:val="Common"/>
-        <w:rPr>
-          <w:lang w:val="uk-UA"/>
-        </w:rPr>
-      </w:pPr>
-      <w:r>
-        <w:rPr/>
+        <w:t>Для дешифрування формула така: (ЛітераШифру - ЛітераКлюча) % 128.</w:t>
+      </w:r>
+    </w:p>
+    <w:p>
+      <w:pPr>
+        <w:pStyle w:val="Common"/>
+        <w:rPr>
+          <w:lang w:val="uk-UA"/>
+        </w:rPr>
+      </w:pPr>
+      <w:r>
+        <w:rPr>
+          <w:lang w:val="uk-UA"/>
+        </w:rPr>
       </w:r>
     </w:p>
     <w:p>
@@ -14793,19 +14457,7 @@
         <w:rPr>
           <w:lang w:val="uk-UA"/>
         </w:rPr>
-        <w:t xml:space="preserve"> </w:t>
-      </w:r>
-      <w:r>
-        <w:rPr>
-          <w:lang w:val="uk-UA"/>
-        </w:rPr>
-        <w:t>1</w:t>
-      </w:r>
-      <w:r>
-        <w:rPr>
-          <w:lang w:val="uk-UA"/>
-        </w:rPr>
-        <w:t xml:space="preserve"> </w:t>
+        <w:t xml:space="preserve"> 1 </w:t>
       </w:r>
       <w:r>
         <w:rPr/>
@@ -15062,15 +14714,7 @@
           <w:iCs/>
           <w:lang w:val="en-US"/>
         </w:rPr>
-        <w:t>python</w:t>
-      </w:r>
-      <w:r>
-        <w:rPr>
-          <w:i/>
-          <w:iCs/>
-          <w:lang w:val="en-US"/>
-        </w:rPr>
-        <w:t xml:space="preserve"> main.py</w:t>
+        <w:t>python main.py</w:t>
       </w:r>
       <w:r>
         <w:rPr/>
@@ -19291,7 +18935,7 @@
     </w:r>
     <w:r>
       <w:rPr/>
-      <w:t>29</w:t>
+      <w:t>47</w:t>
     </w:r>
     <w:r>
       <w:rPr/>
@@ -21159,13 +20803,13 @@
       <w:sz w:val="28"/>
     </w:rPr>
   </w:style>
-  <w:style w:type="character" w:styleId="user">
-    <w:name w:val="Посилання покажчика (user)"/>
+  <w:style w:type="character" w:styleId="Style18">
+    <w:name w:val="Посилання покажчика"/>
     <w:qFormat/>
     <w:rPr/>
   </w:style>
-  <w:style w:type="character" w:styleId="Style18">
-    <w:name w:val="Посилання покажчика"/>
+  <w:style w:type="character" w:styleId="user">
+    <w:name w:val="Посилання покажчика (user)"/>
     <w:qFormat/>
     <w:rPr/>
   </w:style>
@@ -21267,15 +20911,15 @@
       <w:szCs w:val="16"/>
     </w:rPr>
   </w:style>
-  <w:style w:type="paragraph" w:styleId="user3">
-    <w:name w:val="Верхній і нижній колонтитули (user)"/>
+  <w:style w:type="paragraph" w:styleId="Style21">
+    <w:name w:val="Верхній і нижній колонтитули"/>
     <w:basedOn w:val="Normal"/>
     <w:qFormat/>
     <w:pPr/>
     <w:rPr/>
   </w:style>
-  <w:style w:type="paragraph" w:styleId="Style21">
-    <w:name w:val="Верхній і нижній колонтитули"/>
+  <w:style w:type="paragraph" w:styleId="user3">
+    <w:name w:val="Верхній і нижній колонтитули (user)"/>
     <w:basedOn w:val="Normal"/>
     <w:qFormat/>
     <w:pPr/>
@@ -21844,8 +21488,8 @@
       <w:lang w:val="ru-RU" w:eastAsia="ru-RU" w:bidi="ar-SA"/>
     </w:rPr>
   </w:style>
-  <w:style w:type="paragraph" w:styleId="user4">
-    <w:name w:val="Вміст таблиці (user)"/>
+  <w:style w:type="paragraph" w:styleId="Style28">
+    <w:name w:val="Вміст таблиці"/>
     <w:basedOn w:val="Normal"/>
     <w:qFormat/>
     <w:pPr>

</xml_diff>

<commit_message>
c# .net chosen, praise King Jesus Christ
</commit_message>
<xml_diff>
--- a/41BZ Bezpeka ta zahyst program/K/KNT-122_Onyshchenko_Variant-19_PZ.docx
+++ b/41BZ Bezpeka ta zahyst program/K/KNT-122_Onyshchenko_Variant-19_PZ.docx
@@ -468,9 +468,9 @@
         </w:rPr>
       </w:pPr>
       <w:bookmarkStart w:id="0" w:name="__RefHeading___Toc2365_792400555"/>
-      <w:bookmarkStart w:id="1" w:name="_Зміст000002"/>
+      <w:bookmarkStart w:id="1" w:name="_Зміст000064"/>
       <w:bookmarkStart w:id="2" w:name="_Зміст000028"/>
-      <w:bookmarkStart w:id="3" w:name="_Зміст000064"/>
+      <w:bookmarkStart w:id="3" w:name="_Зміст000002"/>
       <w:bookmarkEnd w:id="0"/>
       <w:r>
         <w:rPr>
@@ -1453,13 +1453,13 @@
         </w:rPr>
       </w:pPr>
       <w:bookmarkStart w:id="4" w:name="__RefHeading___Toc2367_792400555"/>
-      <w:bookmarkStart w:id="5" w:name="_Toc533520909"/>
-      <w:bookmarkStart w:id="6" w:name="_Зміст000003"/>
-      <w:bookmarkStart w:id="7" w:name="_Зміст000029"/>
+      <w:bookmarkStart w:id="5" w:name="_Toc196826519"/>
+      <w:bookmarkStart w:id="6" w:name="_Toc27554778"/>
+      <w:bookmarkStart w:id="7" w:name="_Зміст000066"/>
       <w:bookmarkStart w:id="8" w:name="_Toc12274"/>
-      <w:bookmarkStart w:id="9" w:name="_Зміст000066"/>
-      <w:bookmarkStart w:id="10" w:name="_Toc27554778"/>
-      <w:bookmarkStart w:id="11" w:name="_Toc196826519"/>
+      <w:bookmarkStart w:id="9" w:name="_Зміст000029"/>
+      <w:bookmarkStart w:id="10" w:name="_Зміст000003"/>
+      <w:bookmarkStart w:id="11" w:name="_Toc533520909"/>
       <w:bookmarkEnd w:id="4"/>
       <w:r>
         <w:rPr>
@@ -1654,6 +1654,14 @@
         </w:rPr>
         <w:t xml:space="preserve">Предмет </w:t>
       </w:r>
+      <w:r>
+        <w:rPr>
+          <w:rFonts w:eastAsia="Times New Roman" w:cs="Times New Roman"/>
+          <w:szCs w:val="28"/>
+          <w:lang w:val="uk-UA"/>
+        </w:rPr>
+        <w:t>дослідження — шифрування алгоритмом Віженера.</w:t>
+      </w:r>
     </w:p>
     <w:p>
       <w:pPr>
@@ -1826,11 +1834,11 @@
         </w:rPr>
       </w:pPr>
       <w:bookmarkStart w:id="12" w:name="__RefHeading___Toc2369_792400555"/>
-      <w:bookmarkStart w:id="13" w:name="_Toc196826520"/>
-      <w:bookmarkStart w:id="14" w:name="_Toc1235"/>
+      <w:bookmarkStart w:id="13" w:name="_Зміст000030"/>
+      <w:bookmarkStart w:id="14" w:name="_Зміст000067"/>
       <w:bookmarkStart w:id="15" w:name="_Зміст000004"/>
-      <w:bookmarkStart w:id="16" w:name="_Зміст000067"/>
-      <w:bookmarkStart w:id="17" w:name="_Зміст000030"/>
+      <w:bookmarkStart w:id="16" w:name="_Toc1235"/>
+      <w:bookmarkStart w:id="17" w:name="_Toc196826520"/>
       <w:bookmarkEnd w:id="12"/>
       <w:r>
         <w:rPr>
@@ -1867,21 +1875,21 @@
           </w:r>
           <w:r>
             <w:rPr>
-              <w:rStyle w:val="user"/>
+              <w:rStyle w:val="Style18"/>
               <w:vanish w:val="false"/>
             </w:rPr>
             <w:instrText xml:space="preserve"> TOC \z \o "1-9" \h</w:instrText>
           </w:r>
           <w:r>
             <w:rPr>
-              <w:rStyle w:val="user"/>
+              <w:rStyle w:val="Style18"/>
               <w:vanish w:val="false"/>
             </w:rPr>
             <w:fldChar w:fldCharType="separate"/>
           </w:r>
           <w:r>
             <w:rPr>
-              <w:rStyle w:val="user"/>
+              <w:rStyle w:val="Style18"/>
               <w:vanish w:val="false"/>
             </w:rPr>
             <w:t>КУРСОВИЙ ПРОЄКТ</w:t>
@@ -3060,14 +3068,14 @@
         </w:rPr>
       </w:pPr>
       <w:bookmarkStart w:id="18" w:name="__RefHeading___Toc2371_792400555"/>
-      <w:bookmarkStart w:id="19" w:name="_Toc533520912"/>
-      <w:bookmarkStart w:id="20" w:name="_Зміст000031"/>
-      <w:bookmarkStart w:id="21" w:name="_Зміст000005"/>
-      <w:bookmarkStart w:id="22" w:name="_Зміст000065"/>
-      <w:bookmarkStart w:id="23" w:name="_Toc196826521"/>
-      <w:bookmarkStart w:id="24" w:name="_Зміст000068"/>
-      <w:bookmarkStart w:id="25" w:name="_Toc27554779"/>
-      <w:bookmarkStart w:id="26" w:name="_Toc29924"/>
+      <w:bookmarkStart w:id="19" w:name="_Toc29924"/>
+      <w:bookmarkStart w:id="20" w:name="_Toc27554779"/>
+      <w:bookmarkStart w:id="21" w:name="_Зміст000068"/>
+      <w:bookmarkStart w:id="22" w:name="_Toc196826521"/>
+      <w:bookmarkStart w:id="23" w:name="_Зміст000065"/>
+      <w:bookmarkStart w:id="24" w:name="_Зміст000005"/>
+      <w:bookmarkStart w:id="25" w:name="_Зміст000031"/>
+      <w:bookmarkStart w:id="26" w:name="_Toc533520912"/>
       <w:bookmarkEnd w:id="18"/>
       <w:r>
         <w:rPr>
@@ -3251,13 +3259,13 @@
         </w:rPr>
       </w:pPr>
       <w:bookmarkStart w:id="27" w:name="__RefHeading___Toc2373_792400555"/>
-      <w:bookmarkStart w:id="28" w:name="_Toc31110"/>
-      <w:bookmarkStart w:id="29" w:name="_Зміст000032"/>
-      <w:bookmarkStart w:id="30" w:name="_Toc533520911"/>
+      <w:bookmarkStart w:id="28" w:name="_Toc196826522"/>
+      <w:bookmarkStart w:id="29" w:name="_Зміст000006"/>
+      <w:bookmarkStart w:id="30" w:name="_Toc27554780"/>
       <w:bookmarkStart w:id="31" w:name="_Зміст000069"/>
-      <w:bookmarkStart w:id="32" w:name="_Toc27554780"/>
-      <w:bookmarkStart w:id="33" w:name="_Зміст000006"/>
-      <w:bookmarkStart w:id="34" w:name="_Toc196826522"/>
+      <w:bookmarkStart w:id="32" w:name="_Toc533520911"/>
+      <w:bookmarkStart w:id="33" w:name="_Зміст000032"/>
+      <w:bookmarkStart w:id="34" w:name="_Toc31110"/>
       <w:bookmarkEnd w:id="27"/>
       <w:r>
         <w:rPr>
@@ -3445,11 +3453,11 @@
         </w:rPr>
       </w:pPr>
       <w:bookmarkStart w:id="35" w:name="__RefHeading___Toc2375_792400555"/>
-      <w:bookmarkStart w:id="36" w:name="_Toc196826523"/>
-      <w:bookmarkStart w:id="37" w:name="_Toc27554781"/>
+      <w:bookmarkStart w:id="36" w:name="_Toc533520913"/>
+      <w:bookmarkStart w:id="37" w:name="_Зміст000070"/>
       <w:bookmarkStart w:id="38" w:name="_Toc19024"/>
-      <w:bookmarkStart w:id="39" w:name="_Зміст000070"/>
-      <w:bookmarkStart w:id="40" w:name="_Toc533520913"/>
+      <w:bookmarkStart w:id="39" w:name="_Toc27554781"/>
+      <w:bookmarkStart w:id="40" w:name="_Toc196826523"/>
       <w:bookmarkEnd w:id="35"/>
       <w:r>
         <w:rPr>
@@ -3971,9 +3979,9 @@
         </w:rPr>
       </w:pPr>
       <w:bookmarkStart w:id="41" w:name="__RefHeading___Toc2377_792400555"/>
-      <w:bookmarkStart w:id="42" w:name="_Зміст000071"/>
+      <w:bookmarkStart w:id="42" w:name="_Toc196826524"/>
       <w:bookmarkStart w:id="43" w:name="_Toc25684"/>
-      <w:bookmarkStart w:id="44" w:name="_Toc196826524"/>
+      <w:bookmarkStart w:id="44" w:name="_Зміст000071"/>
       <w:bookmarkStart w:id="45" w:name="_Toc27554782"/>
       <w:bookmarkEnd w:id="41"/>
       <w:r>
@@ -4062,13 +4070,13 @@
         </w:rPr>
       </w:pPr>
       <w:bookmarkStart w:id="46" w:name="__RefHeading___Toc2379_792400555"/>
-      <w:bookmarkStart w:id="47" w:name="_Зміст000072"/>
-      <w:bookmarkStart w:id="48" w:name="_Toc196826525"/>
+      <w:bookmarkStart w:id="47" w:name="_Зміст000007"/>
+      <w:bookmarkStart w:id="48" w:name="_Toc14290"/>
       <w:bookmarkStart w:id="49" w:name="_Зміст000033"/>
-      <w:bookmarkStart w:id="50" w:name="_Toc14290"/>
-      <w:bookmarkStart w:id="51" w:name="_Зміст000007"/>
-      <w:bookmarkStart w:id="52" w:name="_Toc533520914"/>
-      <w:bookmarkStart w:id="53" w:name="_Toc27554783"/>
+      <w:bookmarkStart w:id="50" w:name="_Toc196826525"/>
+      <w:bookmarkStart w:id="51" w:name="_Зміст000072"/>
+      <w:bookmarkStart w:id="52" w:name="_Toc27554783"/>
+      <w:bookmarkStart w:id="53" w:name="_Toc533520914"/>
       <w:bookmarkEnd w:id="46"/>
       <w:r>
         <w:rPr>
@@ -4101,10 +4109,10 @@
       </w:pPr>
       <w:bookmarkStart w:id="54" w:name="__RefHeading___Toc2381_792400555"/>
       <w:bookmarkStart w:id="55" w:name="_Toc17577"/>
-      <w:bookmarkStart w:id="56" w:name="_Зміст000073"/>
-      <w:bookmarkStart w:id="57" w:name="_Зміст000034"/>
-      <w:bookmarkStart w:id="58" w:name="_Toc196826526"/>
-      <w:bookmarkStart w:id="59" w:name="_Зміст000008"/>
+      <w:bookmarkStart w:id="56" w:name="_Зміст000008"/>
+      <w:bookmarkStart w:id="57" w:name="_Toc196826526"/>
+      <w:bookmarkStart w:id="58" w:name="_Зміст000034"/>
+      <w:bookmarkStart w:id="59" w:name="_Зміст000073"/>
       <w:bookmarkEnd w:id="54"/>
       <w:r>
         <w:rPr>
@@ -4377,10 +4385,10 @@
       </w:pPr>
       <w:bookmarkStart w:id="60" w:name="__RefHeading___Toc2383_792400555"/>
       <w:bookmarkStart w:id="61" w:name="_Toc1121"/>
-      <w:bookmarkStart w:id="62" w:name="_Toc196826527"/>
-      <w:bookmarkStart w:id="63" w:name="_Зміст000074"/>
-      <w:bookmarkStart w:id="64" w:name="_Зміст000009"/>
-      <w:bookmarkStart w:id="65" w:name="_Зміст000035"/>
+      <w:bookmarkStart w:id="62" w:name="_Зміст000035"/>
+      <w:bookmarkStart w:id="63" w:name="_Зміст000009"/>
+      <w:bookmarkStart w:id="64" w:name="_Зміст000074"/>
+      <w:bookmarkStart w:id="65" w:name="_Toc196826527"/>
       <w:bookmarkEnd w:id="60"/>
       <w:r>
         <w:rPr>
@@ -4764,11 +4772,11 @@
         </w:rPr>
       </w:pPr>
       <w:bookmarkStart w:id="66" w:name="__RefHeading___Toc2385_792400555"/>
-      <w:bookmarkStart w:id="67" w:name="_Toc24053"/>
-      <w:bookmarkStart w:id="68" w:name="_Зміст000037"/>
+      <w:bookmarkStart w:id="67" w:name="_Toc196826529"/>
+      <w:bookmarkStart w:id="68" w:name="_Зміст000011"/>
       <w:bookmarkStart w:id="69" w:name="_Зміст000076"/>
-      <w:bookmarkStart w:id="70" w:name="_Зміст000011"/>
-      <w:bookmarkStart w:id="71" w:name="_Toc196826529"/>
+      <w:bookmarkStart w:id="70" w:name="_Зміст000037"/>
+      <w:bookmarkStart w:id="71" w:name="_Toc24053"/>
       <w:bookmarkEnd w:id="66"/>
       <w:r>
         <w:rPr>
@@ -5409,9 +5417,9 @@
         </w:rPr>
       </w:pPr>
       <w:bookmarkStart w:id="72" w:name="__RefHeading___Toc2387_792400555"/>
-      <w:bookmarkStart w:id="73" w:name="_Toc25781"/>
+      <w:bookmarkStart w:id="73" w:name="_Зміст000077"/>
       <w:bookmarkStart w:id="74" w:name="_Toc196826530"/>
-      <w:bookmarkStart w:id="75" w:name="_Зміст000077"/>
+      <w:bookmarkStart w:id="75" w:name="_Toc25781"/>
       <w:bookmarkEnd w:id="72"/>
       <w:r>
         <w:rPr>
@@ -5490,9 +5498,9 @@
         </w:rPr>
       </w:pPr>
       <w:bookmarkStart w:id="76" w:name="__RefHeading___Toc2389_792400555"/>
-      <w:bookmarkStart w:id="77" w:name="_Зміст000078"/>
+      <w:bookmarkStart w:id="77" w:name="_Toc15598"/>
       <w:bookmarkStart w:id="78" w:name="_Toc196826531"/>
-      <w:bookmarkStart w:id="79" w:name="_Toc15598"/>
+      <w:bookmarkStart w:id="79" w:name="_Зміст000078"/>
       <w:bookmarkEnd w:id="76"/>
       <w:r>
         <w:rPr>
@@ -5586,12 +5594,12 @@
         </w:rPr>
       </w:pPr>
       <w:bookmarkStart w:id="80" w:name="__RefHeading___Toc2391_792400555"/>
-      <w:bookmarkStart w:id="81" w:name="_Зміст000012"/>
-      <w:bookmarkStart w:id="82" w:name="_Зміст000038"/>
-      <w:bookmarkStart w:id="83" w:name="_Toc196826532"/>
-      <w:bookmarkStart w:id="84" w:name="_Toc14854"/>
-      <w:bookmarkStart w:id="85" w:name="_Зміст000079"/>
-      <w:bookmarkStart w:id="86" w:name="_Зміст000063"/>
+      <w:bookmarkStart w:id="81" w:name="_Зміст000063"/>
+      <w:bookmarkStart w:id="82" w:name="_Зміст000079"/>
+      <w:bookmarkStart w:id="83" w:name="_Toc14854"/>
+      <w:bookmarkStart w:id="84" w:name="_Toc196826532"/>
+      <w:bookmarkStart w:id="85" w:name="_Зміст000038"/>
+      <w:bookmarkStart w:id="86" w:name="_Зміст000012"/>
       <w:bookmarkEnd w:id="80"/>
       <w:r>
         <w:rPr>
@@ -5616,9 +5624,9 @@
         </w:rPr>
       </w:pPr>
       <w:bookmarkStart w:id="87" w:name="__RefHeading___Toc2393_792400555"/>
-      <w:bookmarkStart w:id="88" w:name="_Зміст000080"/>
+      <w:bookmarkStart w:id="88" w:name="_Toc196826533"/>
       <w:bookmarkStart w:id="89" w:name="_Toc4063"/>
-      <w:bookmarkStart w:id="90" w:name="_Toc196826533"/>
+      <w:bookmarkStart w:id="90" w:name="_Зміст000080"/>
       <w:bookmarkEnd w:id="87"/>
       <w:r>
         <w:rPr>
@@ -5890,11 +5898,11 @@
         </w:rPr>
       </w:pPr>
       <w:bookmarkStart w:id="91" w:name="__RefHeading___Toc2395_792400555"/>
-      <w:bookmarkStart w:id="92" w:name="_Toc19360"/>
-      <w:bookmarkStart w:id="93" w:name="_Зміст000013"/>
+      <w:bookmarkStart w:id="92" w:name="_Зміст000081"/>
+      <w:bookmarkStart w:id="93" w:name="_Toc196826534"/>
       <w:bookmarkStart w:id="94" w:name="_Зміст000039"/>
-      <w:bookmarkStart w:id="95" w:name="_Toc196826534"/>
-      <w:bookmarkStart w:id="96" w:name="_Зміст000081"/>
+      <w:bookmarkStart w:id="95" w:name="_Зміст000013"/>
+      <w:bookmarkStart w:id="96" w:name="_Toc19360"/>
       <w:bookmarkEnd w:id="91"/>
       <w:r>
         <w:rPr>
@@ -6163,7 +6171,7 @@
           </w:tcPr>
           <w:p>
             <w:pPr>
-              <w:pStyle w:val="Style28"/>
+              <w:pStyle w:val="user4"/>
               <w:spacing w:lineRule="auto" w:line="240" w:before="0" w:after="0"/>
               <w:rPr>
                 <w:rFonts w:ascii="Times New Roman" w:hAnsi="Times New Roman"/>
@@ -6198,7 +6206,7 @@
           </w:tcPr>
           <w:p>
             <w:pPr>
-              <w:pStyle w:val="Style28"/>
+              <w:pStyle w:val="user4"/>
               <w:spacing w:lineRule="auto" w:line="240" w:before="0" w:after="0"/>
               <w:rPr>
                 <w:rFonts w:ascii="Times New Roman" w:hAnsi="Times New Roman"/>
@@ -6233,7 +6241,7 @@
           </w:tcPr>
           <w:p>
             <w:pPr>
-              <w:pStyle w:val="Style28"/>
+              <w:pStyle w:val="user4"/>
               <w:spacing w:lineRule="auto" w:line="240" w:before="0" w:after="0"/>
               <w:rPr>
                 <w:rFonts w:ascii="Times New Roman" w:hAnsi="Times New Roman"/>
@@ -6269,7 +6277,7 @@
           </w:tcPr>
           <w:p>
             <w:pPr>
-              <w:pStyle w:val="Style28"/>
+              <w:pStyle w:val="user4"/>
               <w:spacing w:lineRule="auto" w:line="240" w:before="0" w:after="0"/>
               <w:rPr>
                 <w:rFonts w:ascii="Times New Roman" w:hAnsi="Times New Roman"/>
@@ -6306,7 +6314,7 @@
           </w:tcPr>
           <w:p>
             <w:pPr>
-              <w:pStyle w:val="Style28"/>
+              <w:pStyle w:val="user4"/>
               <w:spacing w:lineRule="auto" w:line="240" w:before="0" w:after="0"/>
               <w:rPr>
                 <w:rFonts w:ascii="Times New Roman" w:hAnsi="Times New Roman"/>
@@ -6336,7 +6344,7 @@
           </w:tcPr>
           <w:p>
             <w:pPr>
-              <w:pStyle w:val="Style28"/>
+              <w:pStyle w:val="user4"/>
               <w:spacing w:lineRule="auto" w:line="240" w:before="0" w:after="0"/>
               <w:rPr>
                 <w:rFonts w:ascii="Times New Roman" w:hAnsi="Times New Roman"/>
@@ -6366,7 +6374,7 @@
           </w:tcPr>
           <w:p>
             <w:pPr>
-              <w:pStyle w:val="Style28"/>
+              <w:pStyle w:val="user4"/>
               <w:spacing w:lineRule="auto" w:line="240" w:before="0" w:after="0"/>
               <w:rPr>
                 <w:rFonts w:ascii="Times New Roman" w:hAnsi="Times New Roman"/>
@@ -6397,7 +6405,7 @@
           </w:tcPr>
           <w:p>
             <w:pPr>
-              <w:pStyle w:val="Style28"/>
+              <w:pStyle w:val="user4"/>
               <w:spacing w:lineRule="auto" w:line="240" w:before="0" w:after="0"/>
               <w:rPr>
                 <w:rFonts w:ascii="Times New Roman" w:hAnsi="Times New Roman"/>
@@ -6430,7 +6438,7 @@
           </w:tcPr>
           <w:p>
             <w:pPr>
-              <w:pStyle w:val="Style28"/>
+              <w:pStyle w:val="user4"/>
               <w:spacing w:lineRule="auto" w:line="240" w:before="0" w:after="0"/>
               <w:rPr>
                 <w:rFonts w:ascii="Times New Roman" w:hAnsi="Times New Roman"/>
@@ -6460,7 +6468,7 @@
           </w:tcPr>
           <w:p>
             <w:pPr>
-              <w:pStyle w:val="Style28"/>
+              <w:pStyle w:val="user4"/>
               <w:spacing w:lineRule="auto" w:line="240" w:before="0" w:after="0"/>
               <w:rPr>
                 <w:rFonts w:ascii="Times New Roman" w:hAnsi="Times New Roman"/>
@@ -6490,7 +6498,7 @@
           </w:tcPr>
           <w:p>
             <w:pPr>
-              <w:pStyle w:val="Style28"/>
+              <w:pStyle w:val="user4"/>
               <w:spacing w:lineRule="auto" w:line="240" w:before="0" w:after="0"/>
               <w:rPr>
                 <w:rFonts w:ascii="Times New Roman" w:hAnsi="Times New Roman"/>
@@ -6521,7 +6529,7 @@
           </w:tcPr>
           <w:p>
             <w:pPr>
-              <w:pStyle w:val="Style28"/>
+              <w:pStyle w:val="user4"/>
               <w:spacing w:lineRule="auto" w:line="240" w:before="0" w:after="0"/>
               <w:rPr>
                 <w:rFonts w:ascii="Times New Roman" w:hAnsi="Times New Roman"/>
@@ -6554,7 +6562,7 @@
           </w:tcPr>
           <w:p>
             <w:pPr>
-              <w:pStyle w:val="Style28"/>
+              <w:pStyle w:val="user4"/>
               <w:spacing w:lineRule="auto" w:line="240" w:before="0" w:after="0"/>
               <w:rPr>
                 <w:rFonts w:ascii="Times New Roman" w:hAnsi="Times New Roman"/>
@@ -6584,7 +6592,7 @@
           </w:tcPr>
           <w:p>
             <w:pPr>
-              <w:pStyle w:val="Style28"/>
+              <w:pStyle w:val="user4"/>
               <w:spacing w:lineRule="auto" w:line="240" w:before="0" w:after="0"/>
               <w:rPr>
                 <w:rFonts w:ascii="Times New Roman" w:hAnsi="Times New Roman"/>
@@ -6614,7 +6622,7 @@
           </w:tcPr>
           <w:p>
             <w:pPr>
-              <w:pStyle w:val="Style28"/>
+              <w:pStyle w:val="user4"/>
               <w:spacing w:lineRule="auto" w:line="240" w:before="0" w:after="0"/>
               <w:rPr>
                 <w:rFonts w:ascii="Times New Roman" w:hAnsi="Times New Roman"/>
@@ -6645,7 +6653,7 @@
           </w:tcPr>
           <w:p>
             <w:pPr>
-              <w:pStyle w:val="Style28"/>
+              <w:pStyle w:val="user4"/>
               <w:spacing w:lineRule="auto" w:line="240" w:before="0" w:after="0"/>
               <w:rPr>
                 <w:rFonts w:ascii="Times New Roman" w:hAnsi="Times New Roman"/>
@@ -6974,7 +6982,7 @@
           </w:tcPr>
           <w:p>
             <w:pPr>
-              <w:pStyle w:val="Style28"/>
+              <w:pStyle w:val="user4"/>
               <w:spacing w:lineRule="auto" w:line="240" w:before="0" w:after="0"/>
               <w:rPr>
                 <w:rFonts w:ascii="Times New Roman" w:hAnsi="Times New Roman"/>
@@ -7009,7 +7017,7 @@
           </w:tcPr>
           <w:p>
             <w:pPr>
-              <w:pStyle w:val="Style28"/>
+              <w:pStyle w:val="user4"/>
               <w:spacing w:lineRule="auto" w:line="240" w:before="0" w:after="0"/>
               <w:rPr>
                 <w:rFonts w:ascii="Times New Roman" w:hAnsi="Times New Roman"/>
@@ -7045,7 +7053,7 @@
           </w:tcPr>
           <w:p>
             <w:pPr>
-              <w:pStyle w:val="Style28"/>
+              <w:pStyle w:val="user4"/>
               <w:spacing w:lineRule="auto" w:line="240" w:before="0" w:after="0"/>
               <w:rPr>
                 <w:rFonts w:ascii="Times New Roman" w:hAnsi="Times New Roman"/>
@@ -7082,7 +7090,7 @@
           </w:tcPr>
           <w:p>
             <w:pPr>
-              <w:pStyle w:val="Style28"/>
+              <w:pStyle w:val="user4"/>
               <w:spacing w:lineRule="auto" w:line="240" w:before="0" w:after="0"/>
               <w:rPr>
                 <w:rFonts w:ascii="Times New Roman" w:hAnsi="Times New Roman"/>
@@ -7112,7 +7120,7 @@
           </w:tcPr>
           <w:p>
             <w:pPr>
-              <w:pStyle w:val="Style28"/>
+              <w:pStyle w:val="user4"/>
               <w:spacing w:lineRule="auto" w:line="240" w:before="0" w:after="0"/>
               <w:rPr>
                 <w:rFonts w:ascii="Times New Roman" w:hAnsi="Times New Roman"/>
@@ -7143,7 +7151,7 @@
           </w:tcPr>
           <w:p>
             <w:pPr>
-              <w:pStyle w:val="Style28"/>
+              <w:pStyle w:val="user4"/>
               <w:spacing w:lineRule="auto" w:line="240" w:before="0" w:after="0"/>
               <w:rPr>
                 <w:rFonts w:ascii="Times New Roman" w:hAnsi="Times New Roman"/>
@@ -7176,7 +7184,7 @@
           </w:tcPr>
           <w:p>
             <w:pPr>
-              <w:pStyle w:val="Style28"/>
+              <w:pStyle w:val="user4"/>
               <w:spacing w:lineRule="auto" w:line="240" w:before="0" w:after="0"/>
               <w:rPr>
                 <w:rFonts w:ascii="Times New Roman" w:hAnsi="Times New Roman"/>
@@ -7206,7 +7214,7 @@
           </w:tcPr>
           <w:p>
             <w:pPr>
-              <w:pStyle w:val="Style28"/>
+              <w:pStyle w:val="user4"/>
               <w:spacing w:lineRule="auto" w:line="240" w:before="0" w:after="0"/>
               <w:rPr>
                 <w:rFonts w:ascii="Times New Roman" w:hAnsi="Times New Roman"/>
@@ -7237,7 +7245,7 @@
           </w:tcPr>
           <w:p>
             <w:pPr>
-              <w:pStyle w:val="Style28"/>
+              <w:pStyle w:val="user4"/>
               <w:spacing w:lineRule="auto" w:line="240" w:before="0" w:after="0"/>
               <w:rPr>
                 <w:rFonts w:ascii="Times New Roman" w:hAnsi="Times New Roman"/>
@@ -7270,7 +7278,7 @@
           </w:tcPr>
           <w:p>
             <w:pPr>
-              <w:pStyle w:val="Style28"/>
+              <w:pStyle w:val="user4"/>
               <w:spacing w:lineRule="auto" w:line="240" w:before="0" w:after="0"/>
               <w:rPr>
                 <w:rFonts w:ascii="Times New Roman" w:hAnsi="Times New Roman"/>
@@ -7300,7 +7308,7 @@
           </w:tcPr>
           <w:p>
             <w:pPr>
-              <w:pStyle w:val="Style28"/>
+              <w:pStyle w:val="user4"/>
               <w:spacing w:lineRule="auto" w:line="240" w:before="0" w:after="0"/>
               <w:rPr>
                 <w:rFonts w:ascii="Times New Roman" w:hAnsi="Times New Roman"/>
@@ -7331,7 +7339,7 @@
           </w:tcPr>
           <w:p>
             <w:pPr>
-              <w:pStyle w:val="Style28"/>
+              <w:pStyle w:val="user4"/>
               <w:spacing w:lineRule="auto" w:line="240" w:before="0" w:after="0"/>
               <w:rPr>
                 <w:rFonts w:ascii="Times New Roman" w:hAnsi="Times New Roman"/>
@@ -7392,11 +7400,11 @@
         </w:rPr>
       </w:pPr>
       <w:bookmarkStart w:id="98" w:name="__RefHeading___Toc2397_792400555"/>
-      <w:bookmarkStart w:id="99" w:name="_Toc196826535"/>
-      <w:bookmarkStart w:id="100" w:name="_Зміст000014"/>
+      <w:bookmarkStart w:id="99" w:name="_Зміст000082"/>
+      <w:bookmarkStart w:id="100" w:name="_Зміст000040"/>
       <w:bookmarkStart w:id="101" w:name="_Toc12907"/>
-      <w:bookmarkStart w:id="102" w:name="_Зміст000040"/>
-      <w:bookmarkStart w:id="103" w:name="_Зміст000082"/>
+      <w:bookmarkStart w:id="102" w:name="_Зміст000014"/>
+      <w:bookmarkStart w:id="103" w:name="_Toc196826535"/>
       <w:bookmarkEnd w:id="98"/>
       <w:r>
         <w:rPr>
@@ -8055,9 +8063,9 @@
         </w:rPr>
       </w:pPr>
       <w:bookmarkStart w:id="104" w:name="__RefHeading___Toc2399_792400555"/>
-      <w:bookmarkStart w:id="105" w:name="_Toc31252"/>
+      <w:bookmarkStart w:id="105" w:name="_Toc196826537"/>
       <w:bookmarkStart w:id="106" w:name="_Зміст000084"/>
-      <w:bookmarkStart w:id="107" w:name="_Toc196826537"/>
+      <w:bookmarkStart w:id="107" w:name="_Toc31252"/>
       <w:bookmarkEnd w:id="104"/>
       <w:r>
         <w:rPr>
@@ -8343,9 +8351,9 @@
         </w:rPr>
       </w:pPr>
       <w:bookmarkStart w:id="109" w:name="__RefHeading___Toc2401_792400555"/>
-      <w:bookmarkStart w:id="110" w:name="_Toc4204"/>
+      <w:bookmarkStart w:id="110" w:name="_Зміст000085"/>
       <w:bookmarkStart w:id="111" w:name="_Toc196826538"/>
-      <w:bookmarkStart w:id="112" w:name="_Зміст000085"/>
+      <w:bookmarkStart w:id="112" w:name="_Toc4204"/>
       <w:bookmarkEnd w:id="109"/>
       <w:r>
         <w:rPr>
@@ -8548,9 +8556,9 @@
         </w:rPr>
       </w:pPr>
       <w:bookmarkStart w:id="113" w:name="__RefHeading___Toc2403_792400555"/>
-      <w:bookmarkStart w:id="114" w:name="_Toc8474"/>
+      <w:bookmarkStart w:id="114" w:name="_Зміст000086"/>
       <w:bookmarkStart w:id="115" w:name="_Toc196826539"/>
-      <w:bookmarkStart w:id="116" w:name="_Зміст000086"/>
+      <w:bookmarkStart w:id="116" w:name="_Toc8474"/>
       <w:bookmarkEnd w:id="113"/>
       <w:r>
         <w:rPr>
@@ -8661,9 +8669,9 @@
         </w:rPr>
       </w:pPr>
       <w:bookmarkStart w:id="117" w:name="__RefHeading___Toc2405_792400555"/>
-      <w:bookmarkStart w:id="118" w:name="_Toc24797"/>
+      <w:bookmarkStart w:id="118" w:name="_Зміст000042"/>
       <w:bookmarkStart w:id="119" w:name="_Зміст000087"/>
-      <w:bookmarkStart w:id="120" w:name="_Зміст000042"/>
+      <w:bookmarkStart w:id="120" w:name="_Toc24797"/>
       <w:bookmarkEnd w:id="117"/>
       <w:r>
         <w:rPr>
@@ -8683,9 +8691,9 @@
         </w:rPr>
       </w:pPr>
       <w:bookmarkStart w:id="121" w:name="__RefHeading___Toc2407_792400555"/>
-      <w:bookmarkStart w:id="122" w:name="_Toc17760"/>
+      <w:bookmarkStart w:id="122" w:name="_Зміст000088"/>
       <w:bookmarkStart w:id="123" w:name="_Зміст000043"/>
-      <w:bookmarkStart w:id="124" w:name="_Зміст000088"/>
+      <w:bookmarkStart w:id="124" w:name="_Toc17760"/>
       <w:bookmarkEnd w:id="121"/>
       <w:r>
         <w:rPr>
@@ -9132,9 +9140,9 @@
         </w:rPr>
       </w:pPr>
       <w:bookmarkStart w:id="126" w:name="__RefHeading___Toc2411_792400555"/>
-      <w:bookmarkStart w:id="127" w:name="_Зміст000095"/>
+      <w:bookmarkStart w:id="127" w:name="_Toc21967"/>
       <w:bookmarkStart w:id="128" w:name="_Зміст000050"/>
-      <w:bookmarkStart w:id="129" w:name="_Toc21967"/>
+      <w:bookmarkStart w:id="129" w:name="_Зміст000095"/>
       <w:bookmarkEnd w:id="126"/>
       <w:r>
         <w:rPr>
@@ -10157,11 +10165,11 @@
         </w:rPr>
       </w:pPr>
       <w:bookmarkStart w:id="145" w:name="__RefHeading___Toc2443_792400555"/>
-      <w:bookmarkStart w:id="146" w:name="_Toc196826540"/>
-      <w:bookmarkStart w:id="147" w:name="_Зміст000016"/>
+      <w:bookmarkStart w:id="146" w:name="_Зміст000107"/>
+      <w:bookmarkStart w:id="147" w:name="_Toc23555"/>
       <w:bookmarkStart w:id="148" w:name="_Зміст000051"/>
-      <w:bookmarkStart w:id="149" w:name="_Toc23555"/>
-      <w:bookmarkStart w:id="150" w:name="_Зміст000107"/>
+      <w:bookmarkStart w:id="149" w:name="_Зміст000016"/>
+      <w:bookmarkStart w:id="150" w:name="_Toc196826540"/>
       <w:bookmarkEnd w:id="145"/>
       <w:r>
         <w:rPr>
@@ -10586,11 +10594,11 @@
         </w:rPr>
       </w:pPr>
       <w:bookmarkStart w:id="151" w:name="__RefHeading___Toc2445_792400555"/>
-      <w:bookmarkStart w:id="152" w:name="_Зміст000108"/>
-      <w:bookmarkStart w:id="153" w:name="_Зміст000052"/>
+      <w:bookmarkStart w:id="152" w:name="_Toc196826541"/>
+      <w:bookmarkStart w:id="153" w:name="_Зміст000017"/>
       <w:bookmarkStart w:id="154" w:name="_Toc19423"/>
-      <w:bookmarkStart w:id="155" w:name="_Зміст000017"/>
-      <w:bookmarkStart w:id="156" w:name="_Toc196826541"/>
+      <w:bookmarkStart w:id="155" w:name="_Зміст000052"/>
+      <w:bookmarkStart w:id="156" w:name="_Зміст000108"/>
       <w:bookmarkEnd w:id="151"/>
       <w:r>
         <w:rPr>
@@ -10636,11 +10644,11 @@
         </w:rPr>
       </w:pPr>
       <w:bookmarkStart w:id="157" w:name="__RefHeading___Toc2447_792400555"/>
-      <w:bookmarkStart w:id="158" w:name="_Toc196826542"/>
-      <w:bookmarkStart w:id="159" w:name="_Toc23903"/>
+      <w:bookmarkStart w:id="158" w:name="_Зміст000053"/>
+      <w:bookmarkStart w:id="159" w:name="_Зміст000018"/>
       <w:bookmarkStart w:id="160" w:name="_Зміст000109"/>
-      <w:bookmarkStart w:id="161" w:name="_Зміст000018"/>
-      <w:bookmarkStart w:id="162" w:name="_Зміст000053"/>
+      <w:bookmarkStart w:id="161" w:name="_Toc23903"/>
+      <w:bookmarkStart w:id="162" w:name="_Toc196826542"/>
       <w:bookmarkEnd w:id="157"/>
       <w:r>
         <w:rPr>
@@ -10663,11 +10671,11 @@
         </w:rPr>
       </w:pPr>
       <w:bookmarkStart w:id="163" w:name="__RefHeading___Toc2449_792400555"/>
-      <w:bookmarkStart w:id="164" w:name="_Зміст000019"/>
-      <w:bookmarkStart w:id="165" w:name="_Toc10522"/>
+      <w:bookmarkStart w:id="164" w:name="_Зміст000110"/>
+      <w:bookmarkStart w:id="165" w:name="_Toc196826543"/>
       <w:bookmarkStart w:id="166" w:name="_Зміст000054"/>
-      <w:bookmarkStart w:id="167" w:name="_Toc196826543"/>
-      <w:bookmarkStart w:id="168" w:name="_Зміст000110"/>
+      <w:bookmarkStart w:id="167" w:name="_Toc10522"/>
+      <w:bookmarkStart w:id="168" w:name="_Зміст000019"/>
       <w:bookmarkEnd w:id="163"/>
       <w:r>
         <w:rPr>
@@ -10737,11 +10745,11 @@
         </w:rPr>
       </w:pPr>
       <w:bookmarkStart w:id="169" w:name="__RefHeading___Toc2451_792400555"/>
-      <w:bookmarkStart w:id="170" w:name="_Зміст000111"/>
-      <w:bookmarkStart w:id="171" w:name="_Зміст000055"/>
+      <w:bookmarkStart w:id="170" w:name="_Toc6891"/>
+      <w:bookmarkStart w:id="171" w:name="_Toc196826544"/>
       <w:bookmarkStart w:id="172" w:name="_Зміст000020"/>
-      <w:bookmarkStart w:id="173" w:name="_Toc196826544"/>
-      <w:bookmarkStart w:id="174" w:name="_Toc6891"/>
+      <w:bookmarkStart w:id="173" w:name="_Зміст000055"/>
+      <w:bookmarkStart w:id="174" w:name="_Зміст000111"/>
       <w:bookmarkEnd w:id="169"/>
       <w:r>
         <w:rPr>
@@ -10826,9 +10834,9 @@
         </w:rPr>
       </w:pPr>
       <w:bookmarkStart w:id="175" w:name="__RefHeading___Toc2453_792400555"/>
-      <w:bookmarkStart w:id="176" w:name="_Toc1373"/>
+      <w:bookmarkStart w:id="176" w:name="_Зміст000112"/>
       <w:bookmarkStart w:id="177" w:name="_Toc196826545"/>
-      <w:bookmarkStart w:id="178" w:name="_Зміст000112"/>
+      <w:bookmarkStart w:id="178" w:name="_Toc1373"/>
       <w:bookmarkEnd w:id="175"/>
       <w:r>
         <w:rPr>
@@ -10894,9 +10902,9 @@
         </w:rPr>
       </w:pPr>
       <w:bookmarkStart w:id="179" w:name="__RefHeading___Toc2455_792400555"/>
-      <w:bookmarkStart w:id="180" w:name="_Toc2435"/>
+      <w:bookmarkStart w:id="180" w:name="_Toc196826546"/>
       <w:bookmarkStart w:id="181" w:name="_Зміст000113"/>
-      <w:bookmarkStart w:id="182" w:name="_Toc196826546"/>
+      <w:bookmarkStart w:id="182" w:name="_Toc2435"/>
       <w:bookmarkEnd w:id="179"/>
       <w:r>
         <w:rPr>
@@ -10979,11 +10987,11 @@
         </w:rPr>
       </w:pPr>
       <w:bookmarkStart w:id="183" w:name="__RefHeading___Toc2457_792400555"/>
-      <w:bookmarkStart w:id="184" w:name="_Toc196826547"/>
-      <w:bookmarkStart w:id="185" w:name="_Toc26896"/>
+      <w:bookmarkStart w:id="184" w:name="_Зміст000021"/>
+      <w:bookmarkStart w:id="185" w:name="_Зміст000114"/>
       <w:bookmarkStart w:id="186" w:name="_Зміст000056"/>
-      <w:bookmarkStart w:id="187" w:name="_Зміст000114"/>
-      <w:bookmarkStart w:id="188" w:name="_Зміст000021"/>
+      <w:bookmarkStart w:id="187" w:name="_Toc26896"/>
+      <w:bookmarkStart w:id="188" w:name="_Toc196826547"/>
       <w:bookmarkEnd w:id="183"/>
       <w:r>
         <w:rPr>
@@ -11094,11 +11102,11 @@
         </w:rPr>
       </w:pPr>
       <w:bookmarkStart w:id="189" w:name="__RefHeading___Toc2459_792400555"/>
-      <w:bookmarkStart w:id="190" w:name="_Зміст000115"/>
-      <w:bookmarkStart w:id="191" w:name="_Toc196826548"/>
+      <w:bookmarkStart w:id="190" w:name="_Toc8988"/>
+      <w:bookmarkStart w:id="191" w:name="_Зміст000022"/>
       <w:bookmarkStart w:id="192" w:name="_Зміст000057"/>
-      <w:bookmarkStart w:id="193" w:name="_Зміст000022"/>
-      <w:bookmarkStart w:id="194" w:name="_Toc8988"/>
+      <w:bookmarkStart w:id="193" w:name="_Toc196826548"/>
+      <w:bookmarkStart w:id="194" w:name="_Зміст000115"/>
       <w:bookmarkEnd w:id="189"/>
       <w:r>
         <w:rPr>
@@ -11231,11 +11239,11 @@
         </w:rPr>
       </w:pPr>
       <w:bookmarkStart w:id="195" w:name="__RefHeading___Toc2461_792400555"/>
-      <w:bookmarkStart w:id="196" w:name="_Зміст000116"/>
-      <w:bookmarkStart w:id="197" w:name="_Зміст000058"/>
+      <w:bookmarkStart w:id="196" w:name="_Зміст000023"/>
+      <w:bookmarkStart w:id="197" w:name="_Toc196826549"/>
       <w:bookmarkStart w:id="198" w:name="_Toc21715"/>
-      <w:bookmarkStart w:id="199" w:name="_Toc196826549"/>
-      <w:bookmarkStart w:id="200" w:name="_Зміст000023"/>
+      <w:bookmarkStart w:id="199" w:name="_Зміст000058"/>
+      <w:bookmarkStart w:id="200" w:name="_Зміст000116"/>
       <w:bookmarkEnd w:id="195"/>
       <w:r>
         <w:rPr>
@@ -11321,11 +11329,11 @@
         </w:rPr>
       </w:pPr>
       <w:bookmarkStart w:id="201" w:name="__RefHeading___Toc2463_792400555"/>
-      <w:bookmarkStart w:id="202" w:name="_Toc196826550"/>
-      <w:bookmarkStart w:id="203" w:name="_Зміст000059"/>
+      <w:bookmarkStart w:id="202" w:name="_Зміст000117"/>
+      <w:bookmarkStart w:id="203" w:name="_Зміст000024"/>
       <w:bookmarkStart w:id="204" w:name="_Toc8780"/>
-      <w:bookmarkStart w:id="205" w:name="_Зміст000024"/>
-      <w:bookmarkStart w:id="206" w:name="_Зміст000117"/>
+      <w:bookmarkStart w:id="205" w:name="_Зміст000059"/>
+      <w:bookmarkStart w:id="206" w:name="_Toc196826550"/>
       <w:bookmarkEnd w:id="201"/>
       <w:r>
         <w:rPr>
@@ -11761,9 +11769,9 @@
         </w:rPr>
       </w:pPr>
       <w:bookmarkStart w:id="208" w:name="__RefHeading___Toc2465_792400555"/>
-      <w:bookmarkStart w:id="209" w:name="_Зміст000118"/>
+      <w:bookmarkStart w:id="209" w:name="_Toc196826551"/>
       <w:bookmarkStart w:id="210" w:name="_Toc19314"/>
-      <w:bookmarkStart w:id="211" w:name="_Toc196826551"/>
+      <w:bookmarkStart w:id="211" w:name="_Зміст000118"/>
       <w:bookmarkEnd w:id="208"/>
       <w:r>
         <w:rPr>
@@ -11918,9 +11926,9 @@
         </w:rPr>
       </w:pPr>
       <w:bookmarkStart w:id="212" w:name="__RefHeading___Toc2467_792400555"/>
-      <w:bookmarkStart w:id="213" w:name="_Toc196826552"/>
+      <w:bookmarkStart w:id="213" w:name="_Зміст000119"/>
       <w:bookmarkStart w:id="214" w:name="_Toc12028"/>
-      <w:bookmarkStart w:id="215" w:name="_Зміст000119"/>
+      <w:bookmarkStart w:id="215" w:name="_Toc196826552"/>
       <w:bookmarkEnd w:id="212"/>
       <w:r>
         <w:rPr>
@@ -11941,11 +11949,11 @@
         </w:rPr>
       </w:pPr>
       <w:bookmarkStart w:id="216" w:name="__RefHeading___Toc2469_792400555"/>
-      <w:bookmarkStart w:id="217" w:name="_Зміст000025"/>
-      <w:bookmarkStart w:id="218" w:name="_Зміст000060"/>
+      <w:bookmarkStart w:id="217" w:name="_Toc27737"/>
+      <w:bookmarkStart w:id="218" w:name="_Toc196826553"/>
       <w:bookmarkStart w:id="219" w:name="_Зміст000120"/>
-      <w:bookmarkStart w:id="220" w:name="_Toc196826553"/>
-      <w:bookmarkStart w:id="221" w:name="_Toc27737"/>
+      <w:bookmarkStart w:id="220" w:name="_Зміст000060"/>
+      <w:bookmarkStart w:id="221" w:name="_Зміст000025"/>
       <w:bookmarkEnd w:id="216"/>
       <w:r>
         <w:rPr>
@@ -12093,11 +12101,11 @@
         </w:rPr>
       </w:pPr>
       <w:bookmarkStart w:id="222" w:name="__RefHeading___Toc2471_792400555"/>
-      <w:bookmarkStart w:id="223" w:name="_Зміст000026"/>
+      <w:bookmarkStart w:id="223" w:name="_Зміст000061"/>
       <w:bookmarkStart w:id="224" w:name="_Зміст000121"/>
-      <w:bookmarkStart w:id="225" w:name="_Зміст000061"/>
-      <w:bookmarkStart w:id="226" w:name="_Toc196826554"/>
-      <w:bookmarkStart w:id="227" w:name="_Toc11650"/>
+      <w:bookmarkStart w:id="225" w:name="_Зміст000026"/>
+      <w:bookmarkStart w:id="226" w:name="_Toc11650"/>
+      <w:bookmarkStart w:id="227" w:name="_Toc196826554"/>
       <w:bookmarkEnd w:id="222"/>
       <w:r>
         <w:rPr>
@@ -12273,11 +12281,11 @@
         </w:rPr>
       </w:pPr>
       <w:bookmarkStart w:id="228" w:name="__RefHeading___Toc2473_792400555"/>
-      <w:bookmarkStart w:id="229" w:name="_Toc10935"/>
-      <w:bookmarkStart w:id="230" w:name="_Зміст000062"/>
+      <w:bookmarkStart w:id="229" w:name="_Toc196826555"/>
+      <w:bookmarkStart w:id="230" w:name="_Зміст000027"/>
       <w:bookmarkStart w:id="231" w:name="_Зміст000122"/>
-      <w:bookmarkStart w:id="232" w:name="_Зміст000027"/>
-      <w:bookmarkStart w:id="233" w:name="_Toc196826555"/>
+      <w:bookmarkStart w:id="232" w:name="_Зміст000062"/>
+      <w:bookmarkStart w:id="233" w:name="_Toc10935"/>
       <w:bookmarkEnd w:id="228"/>
       <w:r>
         <w:rPr>
@@ -12610,8 +12618,8 @@
         </w:rPr>
       </w:pPr>
       <w:bookmarkStart w:id="234" w:name="__RefHeading___Toc2475_792400555"/>
-      <w:bookmarkStart w:id="235" w:name="_Toc11195"/>
-      <w:bookmarkStart w:id="236" w:name="_Зміст000127"/>
+      <w:bookmarkStart w:id="235" w:name="_Зміст000127"/>
+      <w:bookmarkStart w:id="236" w:name="_Toc11195"/>
       <w:bookmarkEnd w:id="234"/>
       <w:r>
         <w:rPr>
@@ -17440,7 +17448,7 @@
       <mc:AlternateContent>
         <mc:Choice Requires="wps">
           <w:drawing>
-            <wp:anchor behindDoc="1" distT="635" distB="635" distL="635" distR="635" simplePos="0" locked="0" layoutInCell="1" allowOverlap="1" relativeHeight="44">
+            <wp:anchor behindDoc="1" distT="635" distB="635" distL="635" distR="635" simplePos="0" locked="0" layoutInCell="1" allowOverlap="1" relativeHeight="62">
               <wp:simplePos x="0" y="0"/>
               <wp:positionH relativeFrom="column">
                 <wp:posOffset>5395595</wp:posOffset>
@@ -17508,7 +17516,7 @@
     </w:r>
     <w:r>
       <w:rPr/>
-      <w:t>44</w:t>
+      <w:t>3</w:t>
     </w:r>
     <w:r>
       <w:rPr/>
@@ -19253,13 +19261,13 @@
       <w:sz w:val="28"/>
     </w:rPr>
   </w:style>
-  <w:style w:type="character" w:styleId="Style18">
-    <w:name w:val="Посилання покажчика"/>
+  <w:style w:type="character" w:styleId="user">
+    <w:name w:val="Посилання покажчика (user)"/>
     <w:qFormat/>
     <w:rPr/>
   </w:style>
-  <w:style w:type="character" w:styleId="user">
-    <w:name w:val="Посилання покажчика (user)"/>
+  <w:style w:type="character" w:styleId="Style18">
+    <w:name w:val="Посилання покажчика"/>
     <w:qFormat/>
     <w:rPr/>
   </w:style>
@@ -19361,15 +19369,15 @@
       <w:szCs w:val="16"/>
     </w:rPr>
   </w:style>
-  <w:style w:type="paragraph" w:styleId="Style21">
-    <w:name w:val="Верхній і нижній колонтитули"/>
+  <w:style w:type="paragraph" w:styleId="user3">
+    <w:name w:val="Верхній і нижній колонтитули (user)"/>
     <w:basedOn w:val="Normal"/>
     <w:qFormat/>
     <w:pPr/>
     <w:rPr/>
   </w:style>
-  <w:style w:type="paragraph" w:styleId="user3">
-    <w:name w:val="Верхній і нижній колонтитули (user)"/>
+  <w:style w:type="paragraph" w:styleId="Style21">
+    <w:name w:val="Верхній і нижній колонтитули"/>
     <w:basedOn w:val="Normal"/>
     <w:qFormat/>
     <w:pPr/>
@@ -19938,8 +19946,8 @@
       <w:lang w:val="ru-RU" w:eastAsia="ru-RU" w:bidi="ar-SA"/>
     </w:rPr>
   </w:style>
-  <w:style w:type="paragraph" w:styleId="Style28">
-    <w:name w:val="Вміст таблиці"/>
+  <w:style w:type="paragraph" w:styleId="user4">
+    <w:name w:val="Вміст таблиці (user)"/>
     <w:basedOn w:val="Normal"/>
     <w:qFormat/>
     <w:pPr>

</xml_diff>

<commit_message>
41K done some work
</commit_message>
<xml_diff>
--- a/41BZ Bezpeka ta zahyst program/K/KNT-122_Onyshchenko_Variant-19_PZ.docx
+++ b/41BZ Bezpeka ta zahyst program/K/KNT-122_Onyshchenko_Variant-19_PZ.docx
@@ -468,9 +468,9 @@
         </w:rPr>
       </w:pPr>
       <w:bookmarkStart w:id="0" w:name="__RefHeading___Toc2365_792400555"/>
-      <w:bookmarkStart w:id="1" w:name="_Зміст000002"/>
+      <w:bookmarkStart w:id="1" w:name="_Зміст000064"/>
       <w:bookmarkStart w:id="2" w:name="_Зміст000028"/>
-      <w:bookmarkStart w:id="3" w:name="_Зміст000064"/>
+      <w:bookmarkStart w:id="3" w:name="_Зміст000002"/>
       <w:bookmarkEnd w:id="0"/>
       <w:r>
         <w:rPr>
@@ -1453,19 +1453,20 @@
           <w:tab w:val="left" w:pos="8477" w:leader="none"/>
         </w:tabs>
         <w:spacing w:before="0" w:after="600"/>
+        <w:ind w:hanging="0" w:start="0"/>
         <w:rPr>
           <w:rFonts w:eastAsia="Times New Roman" w:cs="Times New Roman"/>
           <w:lang w:val="uk-UA"/>
         </w:rPr>
       </w:pPr>
       <w:bookmarkStart w:id="4" w:name="__RefHeading___Toc2367_792400555"/>
-      <w:bookmarkStart w:id="5" w:name="_Toc533520909"/>
-      <w:bookmarkStart w:id="6" w:name="_Зміст000003"/>
-      <w:bookmarkStart w:id="7" w:name="_Зміст000029"/>
+      <w:bookmarkStart w:id="5" w:name="_Toc196826519"/>
+      <w:bookmarkStart w:id="6" w:name="_Toc27554778"/>
+      <w:bookmarkStart w:id="7" w:name="_Зміст000066"/>
       <w:bookmarkStart w:id="8" w:name="_Toc12274"/>
-      <w:bookmarkStart w:id="9" w:name="_Зміст000066"/>
-      <w:bookmarkStart w:id="10" w:name="_Toc27554778"/>
-      <w:bookmarkStart w:id="11" w:name="_Toc196826519"/>
+      <w:bookmarkStart w:id="9" w:name="_Зміст000029"/>
+      <w:bookmarkStart w:id="10" w:name="_Зміст000003"/>
+      <w:bookmarkStart w:id="11" w:name="_Toc533520909"/>
       <w:bookmarkEnd w:id="4"/>
       <w:r>
         <w:rPr>
@@ -1567,11 +1568,10 @@
     <w:p>
       <w:pPr>
         <w:pStyle w:val="Common"/>
-        <w:ind w:hanging="0" w:start="0"/>
         <w:rPr>
           <w:rFonts w:eastAsia="Times New Roman" w:cs="Times New Roman"/>
           <w:szCs w:val="28"/>
-          <w:lang w:val="uk-UA"/>
+          <w:lang w:val="en-US"/>
         </w:rPr>
       </w:pPr>
       <w:r>
@@ -1580,32 +1580,33 @@
           <w:szCs w:val="28"/>
           <w:lang w:val="uk-UA"/>
         </w:rPr>
-      </w:r>
-    </w:p>
-    <w:p>
-      <w:pPr>
-        <w:pStyle w:val="Common"/>
+        <w:t xml:space="preserve">ВІЖЕНЕР, ВЕБ ЗАСТОСУНОК, ВІДКРИТИЙ КОД, ШИФРУВАННЯ, ДЕШИФРУВАННЯ, </w:t>
+      </w:r>
+      <w:r>
         <w:rPr>
           <w:rFonts w:eastAsia="Times New Roman" w:cs="Times New Roman"/>
           <w:szCs w:val="28"/>
           <w:lang w:val="en-US"/>
         </w:rPr>
-      </w:pPr>
-      <w:r>
+        <w:t>FLASK, NEXT.JS</w:t>
+      </w:r>
+    </w:p>
+    <w:p>
+      <w:pPr>
+        <w:pStyle w:val="Common"/>
         <w:rPr>
           <w:rFonts w:eastAsia="Times New Roman" w:cs="Times New Roman"/>
           <w:szCs w:val="28"/>
           <w:lang w:val="uk-UA"/>
         </w:rPr>
-        <w:t xml:space="preserve">ВІЖЕНЕР, ВЕБ ЗАСТОСУНОК, ВІДКРИТИЙ КОД, ШИФРУВАННЯ, ДЕШИФРУВАННЯ, </w:t>
-      </w:r>
+      </w:pPr>
       <w:r>
         <w:rPr>
           <w:rFonts w:eastAsia="Times New Roman" w:cs="Times New Roman"/>
           <w:szCs w:val="28"/>
-          <w:lang w:val="en-US"/>
-        </w:rPr>
-        <w:t>FLASK, NEXT.JS</w:t>
+          <w:lang w:val="uk-UA"/>
+        </w:rPr>
+        <w:t>Об’єкт проєктування – сучасні системи шифрування та дешифрування.</w:t>
       </w:r>
     </w:p>
     <w:p>
@@ -1614,15 +1615,16 @@
         <w:rPr>
           <w:rFonts w:eastAsia="Times New Roman" w:cs="Times New Roman"/>
           <w:szCs w:val="28"/>
-          <w:lang w:val="en-US"/>
+          <w:lang w:val="uk-UA"/>
         </w:rPr>
       </w:pPr>
       <w:r>
         <w:rPr>
           <w:rFonts w:eastAsia="Times New Roman" w:cs="Times New Roman"/>
           <w:szCs w:val="28"/>
-          <w:lang w:val="en-US"/>
-        </w:rPr>
+          <w:lang w:val="uk-UA"/>
+        </w:rPr>
+        <w:t>Предмет дослідження — шифрування алгоритмом Віженера.</w:t>
       </w:r>
     </w:p>
     <w:p>
@@ -1640,7 +1642,7 @@
           <w:szCs w:val="28"/>
           <w:lang w:val="uk-UA"/>
         </w:rPr>
-        <w:t>Об’єкт проєктування – сучасні системи шифрування та дешифрування.</w:t>
+        <w:t>Мета роботи – криптографічна система з використанням шифру Віженера.</w:t>
       </w:r>
     </w:p>
     <w:p>
@@ -1658,104 +1660,43 @@
           <w:szCs w:val="28"/>
           <w:lang w:val="uk-UA"/>
         </w:rPr>
-        <w:t xml:space="preserve">Предмет </w:t>
-      </w:r>
-      <w:r>
+        <w:t>Методи дослідження – використання відкритих джерел інформації та відомих засобів розробки.</w:t>
+      </w:r>
+    </w:p>
+    <w:p>
+      <w:pPr>
+        <w:pStyle w:val="Common"/>
         <w:rPr>
           <w:rFonts w:eastAsia="Times New Roman" w:cs="Times New Roman"/>
           <w:szCs w:val="28"/>
           <w:lang w:val="uk-UA"/>
         </w:rPr>
-        <w:t>дослідження — шифрування алгоритмом Віженера.</w:t>
-      </w:r>
-    </w:p>
-    <w:p>
-      <w:pPr>
-        <w:pStyle w:val="Common"/>
+      </w:pPr>
+      <w:r>
         <w:rPr>
           <w:rFonts w:eastAsia="Times New Roman" w:cs="Times New Roman"/>
           <w:szCs w:val="28"/>
           <w:lang w:val="uk-UA"/>
         </w:rPr>
-      </w:pPr>
-      <w:r>
+        <w:t>Результатом роботи має бути готова програма, пояснювальна записка, презентація проєкту.</w:t>
+      </w:r>
+    </w:p>
+    <w:p>
+      <w:pPr>
+        <w:pStyle w:val="Common"/>
         <w:rPr>
           <w:rFonts w:eastAsia="Times New Roman" w:cs="Times New Roman"/>
           <w:szCs w:val="28"/>
           <w:lang w:val="uk-UA"/>
         </w:rPr>
-        <w:t>Мета роботи – криптографічна система з використанням шифру Віженера.</w:t>
-      </w:r>
-    </w:p>
-    <w:p>
-      <w:pPr>
-        <w:pStyle w:val="Common"/>
+      </w:pPr>
+      <w:r>
         <w:rPr>
           <w:rFonts w:eastAsia="Times New Roman" w:cs="Times New Roman"/>
           <w:szCs w:val="28"/>
           <w:lang w:val="uk-UA"/>
         </w:rPr>
-      </w:pPr>
-      <w:r>
-        <w:rPr>
-          <w:rFonts w:eastAsia="Times New Roman" w:cs="Times New Roman"/>
-          <w:szCs w:val="28"/>
-          <w:lang w:val="uk-UA"/>
-        </w:rPr>
-        <w:t>Методи дослідження – використання відкритих джерел інформації та відомих засобів розробки.</w:t>
-      </w:r>
-    </w:p>
-    <w:p>
-      <w:pPr>
-        <w:pStyle w:val="Common"/>
-        <w:rPr>
-          <w:rFonts w:eastAsia="Times New Roman" w:cs="Times New Roman"/>
-          <w:szCs w:val="28"/>
-          <w:lang w:val="uk-UA"/>
-        </w:rPr>
-      </w:pPr>
-      <w:r>
-        <w:rPr>
-          <w:rFonts w:eastAsia="Times New Roman" w:cs="Times New Roman"/>
-          <w:szCs w:val="28"/>
-          <w:lang w:val="uk-UA"/>
-        </w:rPr>
-        <w:t>Результатом роботи має бути готова програма, пояснювальна записка, презентація проєкту.</w:t>
-      </w:r>
-    </w:p>
-    <w:p>
-      <w:pPr>
-        <w:pStyle w:val="Common"/>
-        <w:rPr>
-          <w:rFonts w:eastAsia="Times New Roman" w:cs="Times New Roman"/>
-          <w:szCs w:val="28"/>
-          <w:lang w:val="uk-UA"/>
-        </w:rPr>
-      </w:pPr>
-      <w:r>
-        <w:rPr>
-          <w:rFonts w:eastAsia="Times New Roman" w:cs="Times New Roman"/>
-          <w:szCs w:val="28"/>
-          <w:lang w:val="uk-UA"/>
-        </w:rPr>
         <w:t>Основні показники:</w:t>
-      </w:r>
-    </w:p>
-    <w:p>
-      <w:pPr>
-        <w:pStyle w:val="Common"/>
-        <w:rPr>
-          <w:rFonts w:eastAsia="Times New Roman" w:cs="Times New Roman"/>
-          <w:szCs w:val="28"/>
-          <w:lang w:val="uk-UA"/>
-        </w:rPr>
-      </w:pPr>
-      <w:r>
-        <w:rPr>
-          <w:rFonts w:eastAsia="Times New Roman" w:cs="Times New Roman"/>
-          <w:szCs w:val="28"/>
-          <w:lang w:val="uk-UA"/>
-        </w:rPr>
       </w:r>
     </w:p>
     <w:p>
@@ -1763,7 +1704,7 @@
         <w:pStyle w:val="Common"/>
         <w:numPr>
           <w:ilvl w:val="0"/>
-          <w:numId w:val="5"/>
+          <w:numId w:val="4"/>
         </w:numPr>
         <w:ind w:hanging="360" w:start="1211"/>
         <w:rPr>
@@ -1786,7 +1727,7 @@
         <w:pStyle w:val="Common"/>
         <w:numPr>
           <w:ilvl w:val="0"/>
-          <w:numId w:val="5"/>
+          <w:numId w:val="4"/>
         </w:numPr>
         <w:ind w:hanging="360" w:start="1211"/>
         <w:rPr>
@@ -1809,7 +1750,7 @@
         <w:pStyle w:val="Common"/>
         <w:numPr>
           <w:ilvl w:val="0"/>
-          <w:numId w:val="5"/>
+          <w:numId w:val="4"/>
         </w:numPr>
         <w:ind w:hanging="360" w:start="1211"/>
         <w:rPr>
@@ -1834,17 +1775,18 @@
       <w:pPr>
         <w:pStyle w:val="Title1st"/>
         <w:spacing w:before="0" w:after="600"/>
+        <w:ind w:hanging="0" w:start="0"/>
         <w:rPr>
           <w:rFonts w:eastAsia="Times New Roman" w:cs="Times New Roman"/>
           <w:lang w:val="uk-UA"/>
         </w:rPr>
       </w:pPr>
       <w:bookmarkStart w:id="12" w:name="__RefHeading___Toc2369_792400555"/>
-      <w:bookmarkStart w:id="13" w:name="_Toc196826520"/>
-      <w:bookmarkStart w:id="14" w:name="_Toc1235"/>
+      <w:bookmarkStart w:id="13" w:name="_Зміст000030"/>
+      <w:bookmarkStart w:id="14" w:name="_Зміст000067"/>
       <w:bookmarkStart w:id="15" w:name="_Зміст000004"/>
-      <w:bookmarkStart w:id="16" w:name="_Зміст000067"/>
-      <w:bookmarkStart w:id="17" w:name="_Зміст000030"/>
+      <w:bookmarkStart w:id="16" w:name="_Toc1235"/>
+      <w:bookmarkStart w:id="17" w:name="_Toc196826520"/>
       <w:bookmarkEnd w:id="12"/>
       <w:r>
         <w:rPr>
@@ -2018,7 +1960,7 @@
               </w:rPr>
               <w:t>1.1 Огляд існуючих методів вирішення завдання</w:t>
               <w:tab/>
-              <w:t>8</w:t>
+              <w:t>7</w:t>
             </w:r>
           </w:hyperlink>
         </w:p>
@@ -2038,7 +1980,7 @@
               </w:rPr>
               <w:t>1.2 Огляд існуючих програмних засобів, що вирішують аналогічні завдання</w:t>
               <w:tab/>
-              <w:t>9</w:t>
+              <w:t>7</w:t>
             </w:r>
           </w:hyperlink>
         </w:p>
@@ -2058,7 +2000,7 @@
               </w:rPr>
               <w:t>1.2.1 Програма Dcode</w:t>
               <w:tab/>
-              <w:t>9</w:t>
+              <w:t>7</w:t>
             </w:r>
           </w:hyperlink>
         </w:p>
@@ -2078,7 +2020,7 @@
               </w:rPr>
               <w:t>1.2.2 Програма Boxentriq</w:t>
               <w:tab/>
-              <w:t>10</w:t>
+              <w:t>8</w:t>
             </w:r>
           </w:hyperlink>
         </w:p>
@@ -2098,7 +2040,7 @@
               </w:rPr>
               <w:t>1.2.4 Порівняльна таблиця розглянутих програм</w:t>
               <w:tab/>
-              <w:t>11</w:t>
+              <w:t>10</w:t>
             </w:r>
           </w:hyperlink>
         </w:p>
@@ -2118,7 +2060,7 @@
               </w:rPr>
               <w:t>1.3 Постановка завдання роботи</w:t>
               <w:tab/>
-              <w:t>12</w:t>
+              <w:t>11</w:t>
             </w:r>
           </w:hyperlink>
         </w:p>
@@ -2138,7 +2080,7 @@
               </w:rPr>
               <w:t>1.4 Висновки за першим розділом</w:t>
               <w:tab/>
-              <w:t>12</w:t>
+              <w:t>11</w:t>
             </w:r>
           </w:hyperlink>
         </w:p>
@@ -2158,7 +2100,7 @@
               </w:rPr>
               <w:t>2 Вибір та обґрунтування структури системи, яка проєктується</w:t>
               <w:tab/>
-              <w:t>13</w:t>
+              <w:t>12</w:t>
             </w:r>
           </w:hyperlink>
         </w:p>
@@ -2178,7 +2120,7 @@
               </w:rPr>
               <w:t>2.1 Вибір інструментарію розробки програмного забезпечення</w:t>
               <w:tab/>
-              <w:t>13</w:t>
+              <w:t>12</w:t>
             </w:r>
           </w:hyperlink>
         </w:p>
@@ -2198,7 +2140,7 @@
               </w:rPr>
               <w:t>2.1.1 Огляд особливостей мови програмування, клієнт</w:t>
               <w:tab/>
-              <w:t>13</w:t>
+              <w:t>12</w:t>
             </w:r>
           </w:hyperlink>
         </w:p>
@@ -2218,7 +2160,7 @@
               </w:rPr>
               <w:t>2.1.2 Огляд особливостей мови програмування, сервер</w:t>
               <w:tab/>
-              <w:t>14</w:t>
+              <w:t>13</w:t>
             </w:r>
           </w:hyperlink>
         </w:p>
@@ -2238,7 +2180,7 @@
               </w:rPr>
               <w:t>2.1.2 Огляд особливостей обраного середовища розробки</w:t>
               <w:tab/>
-              <w:t>14</w:t>
+              <w:t>13</w:t>
             </w:r>
           </w:hyperlink>
         </w:p>
@@ -2258,7 +2200,7 @@
               </w:rPr>
               <w:t>2.2 Структурна схема програми</w:t>
               <w:tab/>
-              <w:t>15</w:t>
+              <w:t>14</w:t>
             </w:r>
           </w:hyperlink>
         </w:p>
@@ -2278,7 +2220,7 @@
               </w:rPr>
               <w:t>2.3 Функціональна схема</w:t>
               <w:tab/>
-              <w:t>15</w:t>
+              <w:t>14</w:t>
             </w:r>
           </w:hyperlink>
         </w:p>
@@ -2298,7 +2240,7 @@
               </w:rPr>
               <w:t>2.4 Опис модулів розроблюваної системи</w:t>
               <w:tab/>
-              <w:t>15</w:t>
+              <w:t>14</w:t>
             </w:r>
           </w:hyperlink>
         </w:p>
@@ -2318,7 +2260,7 @@
               </w:rPr>
               <w:t>2.5 Висновки за другим розділом</w:t>
               <w:tab/>
-              <w:t>16</w:t>
+              <w:t>15</w:t>
             </w:r>
           </w:hyperlink>
         </w:p>
@@ -2338,7 +2280,7 @@
               </w:rPr>
               <w:t>3 Основні рішення щодо реалізації компонентів системи</w:t>
               <w:tab/>
-              <w:t>17</w:t>
+              <w:t>16</w:t>
             </w:r>
           </w:hyperlink>
         </w:p>
@@ -2358,7 +2300,7 @@
               </w:rPr>
               <w:t>3.1 Алгоритм функціонування розробленої програми</w:t>
               <w:tab/>
-              <w:t>17</w:t>
+              <w:t>16</w:t>
             </w:r>
           </w:hyperlink>
         </w:p>
@@ -2378,7 +2320,7 @@
               </w:rPr>
               <w:t>3.3 Розробка алгоритму</w:t>
               <w:tab/>
-              <w:t>17</w:t>
+              <w:t>16</w:t>
             </w:r>
           </w:hyperlink>
         </w:p>
@@ -2398,7 +2340,7 @@
               </w:rPr>
               <w:t>3.4 Висновки за третім розділом</w:t>
               <w:tab/>
-              <w:t>18</w:t>
+              <w:t>17</w:t>
             </w:r>
           </w:hyperlink>
         </w:p>
@@ -2418,7 +2360,7 @@
               </w:rPr>
               <w:t>4 Інтерфейс застосунку</w:t>
               <w:tab/>
-              <w:t>19</w:t>
+              <w:t>18</w:t>
             </w:r>
           </w:hyperlink>
         </w:p>
@@ -2438,7 +2380,7 @@
               </w:rPr>
               <w:t>4.1 Вимоги до інтерфейсу</w:t>
               <w:tab/>
-              <w:t>19</w:t>
+              <w:t>18</w:t>
             </w:r>
           </w:hyperlink>
         </w:p>
@@ -2458,7 +2400,7 @@
               </w:rPr>
               <w:t>4.2 Вигляд інтерфейсу</w:t>
               <w:tab/>
-              <w:t>19</w:t>
+              <w:t>18</w:t>
             </w:r>
           </w:hyperlink>
         </w:p>
@@ -2478,7 +2420,7 @@
               </w:rPr>
               <w:t>5 Керівництво користувача</w:t>
               <w:tab/>
-              <w:t>22</w:t>
+              <w:t>21</w:t>
             </w:r>
           </w:hyperlink>
         </w:p>
@@ -2498,7 +2440,7 @@
               </w:rPr>
               <w:t>5.1 Призначення програми</w:t>
               <w:tab/>
-              <w:t>22</w:t>
+              <w:t>21</w:t>
             </w:r>
           </w:hyperlink>
         </w:p>
@@ -2518,7 +2460,7 @@
               </w:rPr>
               <w:t>5.2 Умови виконання програми</w:t>
               <w:tab/>
-              <w:t>22</w:t>
+              <w:t>21</w:t>
             </w:r>
           </w:hyperlink>
         </w:p>
@@ -2538,7 +2480,7 @@
               </w:rPr>
               <w:t>5.3 Виконання програми</w:t>
               <w:tab/>
-              <w:t>22</w:t>
+              <w:t>21</w:t>
             </w:r>
           </w:hyperlink>
         </w:p>
@@ -2558,7 +2500,7 @@
               </w:rPr>
               <w:t>Висновки</w:t>
               <w:tab/>
-              <w:t>23</w:t>
+              <w:t>22</w:t>
             </w:r>
           </w:hyperlink>
         </w:p>
@@ -2578,7 +2520,7 @@
               </w:rPr>
               <w:t>Список використаних джерел</w:t>
               <w:tab/>
-              <w:t>24</w:t>
+              <w:t>23</w:t>
             </w:r>
           </w:hyperlink>
         </w:p>
@@ -2598,7 +2540,7 @@
               </w:rPr>
               <w:t>Додаток А</w:t>
               <w:tab/>
-              <w:t>25</w:t>
+              <w:t>24</w:t>
             </w:r>
           </w:hyperlink>
         </w:p>
@@ -2618,7 +2560,7 @@
               </w:rPr>
               <w:t>А.1 Вступ</w:t>
               <w:tab/>
-              <w:t>26</w:t>
+              <w:t>25</w:t>
             </w:r>
           </w:hyperlink>
         </w:p>
@@ -2638,7 +2580,7 @@
               </w:rPr>
               <w:t>А.1.1 Назва програми</w:t>
               <w:tab/>
-              <w:t>26</w:t>
+              <w:t>25</w:t>
             </w:r>
           </w:hyperlink>
         </w:p>
@@ -2658,7 +2600,7 @@
               </w:rPr>
               <w:t>А.1.2 Призначення та область застосування</w:t>
               <w:tab/>
-              <w:t>26</w:t>
+              <w:t>25</w:t>
             </w:r>
           </w:hyperlink>
         </w:p>
@@ -2678,7 +2620,7 @@
               </w:rPr>
               <w:t>А.2 Підстави для розробки</w:t>
               <w:tab/>
-              <w:t>26</w:t>
+              <w:t>25</w:t>
             </w:r>
           </w:hyperlink>
         </w:p>
@@ -2698,7 +2640,7 @@
               </w:rPr>
               <w:t>А.3 Призначення розробки</w:t>
               <w:tab/>
-              <w:t>26</w:t>
+              <w:t>25</w:t>
             </w:r>
           </w:hyperlink>
         </w:p>
@@ -2718,7 +2660,7 @@
               </w:rPr>
               <w:t>А.4 Вимоги до програми</w:t>
               <w:tab/>
-              <w:t>26</w:t>
+              <w:t>25</w:t>
             </w:r>
           </w:hyperlink>
         </w:p>
@@ -2738,7 +2680,7 @@
               </w:rPr>
               <w:t>А.4.1 Вимоги до функціональних характеристик</w:t>
               <w:tab/>
-              <w:t>27</w:t>
+              <w:t>26</w:t>
             </w:r>
           </w:hyperlink>
         </w:p>
@@ -2758,7 +2700,7 @@
               </w:rPr>
               <w:t>А.4.2 Вимоги до надійності</w:t>
               <w:tab/>
-              <w:t>27</w:t>
+              <w:t>26</w:t>
             </w:r>
           </w:hyperlink>
         </w:p>
@@ -2778,7 +2720,7 @@
               </w:rPr>
               <w:t>А.4.3 Вимоги до технічних та програмних засобів</w:t>
               <w:tab/>
-              <w:t>27</w:t>
+              <w:t>26</w:t>
             </w:r>
           </w:hyperlink>
         </w:p>
@@ -2798,7 +2740,7 @@
               </w:rPr>
               <w:t>А.4.4 Вимоги до вхідних даних</w:t>
               <w:tab/>
-              <w:t>28</w:t>
+              <w:t>27</w:t>
             </w:r>
           </w:hyperlink>
         </w:p>
@@ -2818,7 +2760,7 @@
               </w:rPr>
               <w:t>А.5 Вимоги до програмної документації</w:t>
               <w:tab/>
-              <w:t>28</w:t>
+              <w:t>27</w:t>
             </w:r>
           </w:hyperlink>
         </w:p>
@@ -2838,7 +2780,7 @@
               </w:rPr>
               <w:t>А.6 Стадії і етапи розробки</w:t>
               <w:tab/>
-              <w:t>28</w:t>
+              <w:t>27</w:t>
             </w:r>
           </w:hyperlink>
         </w:p>
@@ -2858,7 +2800,7 @@
               </w:rPr>
               <w:t>А.6.1 Стадії розробки</w:t>
               <w:tab/>
-              <w:t>28</w:t>
+              <w:t>27</w:t>
             </w:r>
           </w:hyperlink>
         </w:p>
@@ -2878,7 +2820,7 @@
               </w:rPr>
               <w:t>А.6.2 Етапи розробки</w:t>
               <w:tab/>
-              <w:t>29</w:t>
+              <w:t>28</w:t>
             </w:r>
           </w:hyperlink>
         </w:p>
@@ -2898,7 +2840,7 @@
               </w:rPr>
               <w:t>А.6.3 Зміст робіт по етапах</w:t>
               <w:tab/>
-              <w:t>29</w:t>
+              <w:t>28</w:t>
             </w:r>
           </w:hyperlink>
         </w:p>
@@ -2918,7 +2860,7 @@
               </w:rPr>
               <w:t>Додаток Б</w:t>
               <w:tab/>
-              <w:t>30</w:t>
+              <w:t>29</w:t>
             </w:r>
           </w:hyperlink>
         </w:p>
@@ -2938,7 +2880,7 @@
               </w:rPr>
               <w:t>Б.1 Загальні відомості</w:t>
               <w:tab/>
-              <w:t>31</w:t>
+              <w:t>30</w:t>
             </w:r>
           </w:hyperlink>
         </w:p>
@@ -2958,7 +2900,7 @@
               </w:rPr>
               <w:t>Б.2 Функціональне призначення</w:t>
               <w:tab/>
-              <w:t>31</w:t>
+              <w:t>30</w:t>
             </w:r>
           </w:hyperlink>
         </w:p>
@@ -2978,7 +2920,7 @@
               </w:rPr>
               <w:t>Б.3 Опис логічної структури програми</w:t>
               <w:tab/>
-              <w:t>31</w:t>
+              <w:t>30</w:t>
             </w:r>
           </w:hyperlink>
         </w:p>
@@ -2998,7 +2940,7 @@
               </w:rPr>
               <w:t>Б.3.1 Алгоритм шифрування/дешифрування</w:t>
               <w:tab/>
-              <w:t>31</w:t>
+              <w:t>30</w:t>
             </w:r>
           </w:hyperlink>
         </w:p>
@@ -3018,7 +2960,7 @@
               </w:rPr>
               <w:t>Б.4 Використані технічні засоби</w:t>
               <w:tab/>
-              <w:t>32</w:t>
+              <w:t>31</w:t>
             </w:r>
           </w:hyperlink>
         </w:p>
@@ -3038,7 +2980,7 @@
               </w:rPr>
               <w:t>Б.5 Виклик і завантаження</w:t>
               <w:tab/>
-              <w:t>32</w:t>
+              <w:t>31</w:t>
             </w:r>
           </w:hyperlink>
         </w:p>
@@ -3058,7 +3000,7 @@
               </w:rPr>
               <w:t>Б.6 Початкові дані</w:t>
               <w:tab/>
-              <w:t>33</w:t>
+              <w:t>32</w:t>
             </w:r>
           </w:hyperlink>
         </w:p>
@@ -3078,7 +3020,7 @@
               </w:rPr>
               <w:t>Додаток В</w:t>
               <w:tab/>
-              <w:t>34</w:t>
+              <w:t>33</w:t>
             </w:r>
           </w:hyperlink>
         </w:p>
@@ -3098,7 +3040,7 @@
               </w:rPr>
               <w:t>Текст серверу — server.py</w:t>
               <w:tab/>
-              <w:t>35</w:t>
+              <w:t>34</w:t>
             </w:r>
           </w:hyperlink>
         </w:p>
@@ -3118,7 +3060,7 @@
               </w:rPr>
               <w:t>Текст сторінки — page.tsx</w:t>
               <w:tab/>
-              <w:t>35</w:t>
+              <w:t>34</w:t>
             </w:r>
           </w:hyperlink>
         </w:p>
@@ -3138,7 +3080,7 @@
               </w:rPr>
               <w:t>Додаток Г</w:t>
               <w:tab/>
-              <w:t>39</w:t>
+              <w:t>38</w:t>
             </w:r>
           </w:hyperlink>
           <w:r>
@@ -3185,6 +3127,7 @@
     <w:p>
       <w:pPr>
         <w:pStyle w:val="Title1st"/>
+        <w:ind w:hanging="0" w:start="0"/>
         <w:rPr>
           <w:rFonts w:eastAsia="Times New Roman" w:cs="Times New Roman"/>
           <w:szCs w:val="32"/>
@@ -3192,14 +3135,14 @@
         </w:rPr>
       </w:pPr>
       <w:bookmarkStart w:id="18" w:name="__RefHeading___Toc2371_792400555"/>
-      <w:bookmarkStart w:id="19" w:name="_Toc533520912"/>
-      <w:bookmarkStart w:id="20" w:name="_Зміст000031"/>
-      <w:bookmarkStart w:id="21" w:name="_Зміст000005"/>
-      <w:bookmarkStart w:id="22" w:name="_Зміст000065"/>
-      <w:bookmarkStart w:id="23" w:name="_Toc196826521"/>
-      <w:bookmarkStart w:id="24" w:name="_Зміст000068"/>
-      <w:bookmarkStart w:id="25" w:name="_Toc27554779"/>
-      <w:bookmarkStart w:id="26" w:name="_Toc29924"/>
+      <w:bookmarkStart w:id="19" w:name="_Toc29924"/>
+      <w:bookmarkStart w:id="20" w:name="_Toc27554779"/>
+      <w:bookmarkStart w:id="21" w:name="_Зміст000068"/>
+      <w:bookmarkStart w:id="22" w:name="_Toc196826521"/>
+      <w:bookmarkStart w:id="23" w:name="_Зміст000065"/>
+      <w:bookmarkStart w:id="24" w:name="_Зміст000005"/>
+      <w:bookmarkStart w:id="25" w:name="_Зміст000031"/>
+      <w:bookmarkStart w:id="26" w:name="_Toc533520912"/>
       <w:bookmarkEnd w:id="18"/>
       <w:r>
         <w:rPr>
@@ -3377,19 +3320,20 @@
       <w:pPr>
         <w:pStyle w:val="Title1st"/>
         <w:spacing w:before="0" w:after="600"/>
+        <w:ind w:hanging="0" w:start="0"/>
         <w:rPr>
           <w:rFonts w:eastAsia="Times New Roman" w:cs="Times New Roman"/>
           <w:lang w:val="uk-UA"/>
         </w:rPr>
       </w:pPr>
       <w:bookmarkStart w:id="27" w:name="__RefHeading___Toc2373_792400555"/>
-      <w:bookmarkStart w:id="28" w:name="_Toc31110"/>
-      <w:bookmarkStart w:id="29" w:name="_Зміст000032"/>
-      <w:bookmarkStart w:id="30" w:name="_Toc533520911"/>
+      <w:bookmarkStart w:id="28" w:name="_Toc196826522"/>
+      <w:bookmarkStart w:id="29" w:name="_Зміст000006"/>
+      <w:bookmarkStart w:id="30" w:name="_Toc27554780"/>
       <w:bookmarkStart w:id="31" w:name="_Зміст000069"/>
-      <w:bookmarkStart w:id="32" w:name="_Toc27554780"/>
-      <w:bookmarkStart w:id="33" w:name="_Зміст000006"/>
-      <w:bookmarkStart w:id="34" w:name="_Toc196826522"/>
+      <w:bookmarkStart w:id="32" w:name="_Toc533520911"/>
+      <w:bookmarkStart w:id="33" w:name="_Зміст000032"/>
+      <w:bookmarkStart w:id="34" w:name="_Toc31110"/>
       <w:bookmarkEnd w:id="27"/>
       <w:r>
         <w:rPr>
@@ -3567,17 +3511,18 @@
       <w:pPr>
         <w:pStyle w:val="Title1st"/>
         <w:spacing w:before="0" w:after="600"/>
+        <w:ind w:hanging="0" w:start="0"/>
         <w:rPr>
           <w:rFonts w:eastAsia="Times New Roman" w:cs="Times New Roman"/>
           <w:lang w:val="en-US"/>
         </w:rPr>
       </w:pPr>
       <w:bookmarkStart w:id="35" w:name="__RefHeading___Toc2375_792400555"/>
-      <w:bookmarkStart w:id="36" w:name="_Toc196826523"/>
-      <w:bookmarkStart w:id="37" w:name="_Toc27554781"/>
+      <w:bookmarkStart w:id="36" w:name="_Toc533520913"/>
+      <w:bookmarkStart w:id="37" w:name="_Зміст000070"/>
       <w:bookmarkStart w:id="38" w:name="_Toc19024"/>
-      <w:bookmarkStart w:id="39" w:name="_Зміст000070"/>
-      <w:bookmarkStart w:id="40" w:name="_Toc533520913"/>
+      <w:bookmarkStart w:id="39" w:name="_Toc27554781"/>
+      <w:bookmarkStart w:id="40" w:name="_Toc196826523"/>
       <w:bookmarkEnd w:id="35"/>
       <w:r>
         <w:rPr>
@@ -3607,14 +3552,15 @@
     <w:p>
       <w:pPr>
         <w:pStyle w:val="Title2nd1"/>
+        <w:ind w:hanging="0" w:start="0"/>
         <w:rPr>
           <w:rFonts w:eastAsia="Times New Roman" w:cs="Times New Roman"/>
         </w:rPr>
       </w:pPr>
       <w:bookmarkStart w:id="41" w:name="__RefHeading___Toc2377_792400555"/>
-      <w:bookmarkStart w:id="42" w:name="_Зміст000071"/>
+      <w:bookmarkStart w:id="42" w:name="_Toc196826524"/>
       <w:bookmarkStart w:id="43" w:name="_Toc25684"/>
-      <w:bookmarkStart w:id="44" w:name="_Toc196826524"/>
+      <w:bookmarkStart w:id="44" w:name="_Зміст000071"/>
       <w:bookmarkStart w:id="45" w:name="_Toc27554782"/>
       <w:bookmarkEnd w:id="41"/>
       <w:r>
@@ -3660,49 +3606,7 @@
           <w:rFonts w:eastAsia="Times New Roman" w:cs="Times New Roman"/>
           <w:lang w:val="uk-UA"/>
         </w:rPr>
-        <w:t xml:space="preserve">Знайдені приклади є </w:t>
-      </w:r>
-      <w:r>
-        <w:rPr>
-          <w:rFonts w:eastAsia="Times New Roman" w:cs="Times New Roman"/>
-          <w:lang w:val="uk-UA"/>
-        </w:rPr>
-        <w:t>вебсайтами</w:t>
-      </w:r>
-      <w:r>
-        <w:rPr>
-          <w:rFonts w:eastAsia="Times New Roman" w:cs="Times New Roman"/>
-          <w:lang w:val="uk-UA"/>
-        </w:rPr>
-        <w:t xml:space="preserve">, що дозволяють </w:t>
-      </w:r>
-      <w:r>
-        <w:rPr>
-          <w:rFonts w:eastAsia="Times New Roman" w:cs="Times New Roman"/>
-          <w:lang w:val="uk-UA"/>
-        </w:rPr>
-        <w:t xml:space="preserve">купувати та продавати </w:t>
-      </w:r>
-      <w:r>
-        <w:rPr>
-          <w:rFonts w:eastAsia="Times New Roman" w:cs="Times New Roman"/>
-          <w:lang w:val="uk-UA"/>
-        </w:rPr>
-        <w:t>вантажівки</w:t>
-      </w:r>
-      <w:r>
-        <w:rPr>
-          <w:rFonts w:eastAsia="Times New Roman" w:cs="Times New Roman"/>
-          <w:lang w:val="uk-UA"/>
-        </w:rPr>
-        <w:t xml:space="preserve">. </w:t>
-      </w:r>
-      <w:r>
-        <w:rPr>
-          <w:rFonts w:eastAsia="Times New Roman" w:cs="Times New Roman"/>
-          <w:lang w:val="uk-UA"/>
-        </w:rPr>
-        <w:t>Корисною функцією є авторизація.</w:t>
+        <w:t>Знайдені приклади є вебсайтами, що дозволяють купувати та продавати вантажівки. Корисною функцією є авторизація.</w:t>
       </w:r>
     </w:p>
     <w:p>
@@ -3723,19 +3627,20 @@
     <w:p>
       <w:pPr>
         <w:pStyle w:val="Title2nd1"/>
+        <w:ind w:hanging="0" w:start="0"/>
         <w:rPr>
           <w:rFonts w:eastAsia="Times New Roman" w:cs="Times New Roman"/>
           <w:bCs/>
         </w:rPr>
       </w:pPr>
       <w:bookmarkStart w:id="46" w:name="__RefHeading___Toc2379_792400555"/>
-      <w:bookmarkStart w:id="47" w:name="_Зміст000072"/>
-      <w:bookmarkStart w:id="48" w:name="_Toc196826525"/>
+      <w:bookmarkStart w:id="47" w:name="_Зміст000007"/>
+      <w:bookmarkStart w:id="48" w:name="_Toc14290"/>
       <w:bookmarkStart w:id="49" w:name="_Зміст000033"/>
-      <w:bookmarkStart w:id="50" w:name="_Toc14290"/>
-      <w:bookmarkStart w:id="51" w:name="_Зміст000007"/>
-      <w:bookmarkStart w:id="52" w:name="_Toc533520914"/>
-      <w:bookmarkStart w:id="53" w:name="_Toc27554783"/>
+      <w:bookmarkStart w:id="50" w:name="_Toc196826525"/>
+      <w:bookmarkStart w:id="51" w:name="_Зміст000072"/>
+      <w:bookmarkStart w:id="52" w:name="_Toc27554783"/>
+      <w:bookmarkStart w:id="53" w:name="_Toc533520914"/>
       <w:bookmarkEnd w:id="46"/>
       <w:r>
         <w:rPr>
@@ -3761,6 +3666,7 @@
     <w:p>
       <w:pPr>
         <w:pStyle w:val="Title3rd1"/>
+        <w:ind w:hanging="0" w:start="0"/>
         <w:rPr>
           <w:rFonts w:eastAsia="Times New Roman" w:cs="Times New Roman"/>
           <w:lang w:val="en-US"/>
@@ -3768,10 +3674,10 @@
       </w:pPr>
       <w:bookmarkStart w:id="54" w:name="__RefHeading___Toc2381_792400555"/>
       <w:bookmarkStart w:id="55" w:name="_Toc17577"/>
-      <w:bookmarkStart w:id="56" w:name="_Зміст000073"/>
-      <w:bookmarkStart w:id="57" w:name="_Зміст000034"/>
-      <w:bookmarkStart w:id="58" w:name="_Toc196826526"/>
-      <w:bookmarkStart w:id="59" w:name="_Зміст000008"/>
+      <w:bookmarkStart w:id="56" w:name="_Зміст000008"/>
+      <w:bookmarkStart w:id="57" w:name="_Toc196826526"/>
+      <w:bookmarkStart w:id="58" w:name="_Зміст000034"/>
+      <w:bookmarkStart w:id="59" w:name="_Зміст000073"/>
       <w:bookmarkEnd w:id="54"/>
       <w:r>
         <w:rPr>
@@ -3874,7 +3780,7 @@
         <w:pStyle w:val="Common"/>
         <w:numPr>
           <w:ilvl w:val="0"/>
-          <w:numId w:val="5"/>
+          <w:numId w:val="4"/>
         </w:numPr>
         <w:ind w:hanging="360" w:start="1211"/>
         <w:rPr>
@@ -3895,7 +3801,7 @@
         <w:pStyle w:val="Common"/>
         <w:numPr>
           <w:ilvl w:val="0"/>
-          <w:numId w:val="5"/>
+          <w:numId w:val="4"/>
         </w:numPr>
         <w:ind w:hanging="360" w:start="1211"/>
         <w:rPr>
@@ -3916,7 +3822,7 @@
         <w:pStyle w:val="Common"/>
         <w:numPr>
           <w:ilvl w:val="0"/>
-          <w:numId w:val="5"/>
+          <w:numId w:val="4"/>
         </w:numPr>
         <w:ind w:hanging="360" w:start="1211"/>
         <w:rPr>
@@ -4037,6 +3943,7 @@
     <w:p>
       <w:pPr>
         <w:pStyle w:val="Title3rd1"/>
+        <w:ind w:hanging="0" w:start="0"/>
         <w:rPr>
           <w:rFonts w:eastAsia="Times New Roman" w:cs="Times New Roman"/>
           <w:lang w:val="en-US"/>
@@ -4044,10 +3951,10 @@
       </w:pPr>
       <w:bookmarkStart w:id="60" w:name="__RefHeading___Toc2383_792400555"/>
       <w:bookmarkStart w:id="61" w:name="_Toc1121"/>
-      <w:bookmarkStart w:id="62" w:name="_Toc196826527"/>
-      <w:bookmarkStart w:id="63" w:name="_Зміст000074"/>
-      <w:bookmarkStart w:id="64" w:name="_Зміст000009"/>
-      <w:bookmarkStart w:id="65" w:name="_Зміст000035"/>
+      <w:bookmarkStart w:id="62" w:name="_Зміст000035"/>
+      <w:bookmarkStart w:id="63" w:name="_Зміст000009"/>
+      <w:bookmarkStart w:id="64" w:name="_Зміст000074"/>
+      <w:bookmarkStart w:id="65" w:name="_Toc196826527"/>
       <w:bookmarkEnd w:id="60"/>
       <w:r>
         <w:rPr>
@@ -4150,7 +4057,7 @@
         <w:pStyle w:val="Common"/>
         <w:numPr>
           <w:ilvl w:val="0"/>
-          <w:numId w:val="5"/>
+          <w:numId w:val="4"/>
         </w:numPr>
         <w:ind w:hanging="360" w:start="1211"/>
         <w:rPr>
@@ -4171,7 +4078,7 @@
         <w:pStyle w:val="Common"/>
         <w:numPr>
           <w:ilvl w:val="0"/>
-          <w:numId w:val="5"/>
+          <w:numId w:val="4"/>
         </w:numPr>
         <w:ind w:hanging="360" w:start="1211"/>
         <w:rPr>
@@ -4192,7 +4099,7 @@
         <w:pStyle w:val="Common"/>
         <w:numPr>
           <w:ilvl w:val="0"/>
-          <w:numId w:val="5"/>
+          <w:numId w:val="4"/>
         </w:numPr>
         <w:ind w:hanging="360" w:start="1211"/>
         <w:rPr>
@@ -4425,17 +4332,18 @@
     <w:p>
       <w:pPr>
         <w:pStyle w:val="Title3rd1"/>
+        <w:ind w:hanging="0" w:start="0"/>
         <w:rPr>
           <w:rFonts w:eastAsia="Times New Roman" w:cs="Times New Roman"/>
           <w:lang w:val="en-US"/>
         </w:rPr>
       </w:pPr>
       <w:bookmarkStart w:id="66" w:name="__RefHeading___Toc2385_792400555"/>
-      <w:bookmarkStart w:id="67" w:name="_Toc24053"/>
-      <w:bookmarkStart w:id="68" w:name="_Зміст000037"/>
+      <w:bookmarkStart w:id="67" w:name="_Toc196826529"/>
+      <w:bookmarkStart w:id="68" w:name="_Зміст000011"/>
       <w:bookmarkStart w:id="69" w:name="_Зміст000076"/>
-      <w:bookmarkStart w:id="70" w:name="_Зміст000011"/>
-      <w:bookmarkStart w:id="71" w:name="_Toc196826529"/>
+      <w:bookmarkStart w:id="70" w:name="_Зміст000037"/>
+      <w:bookmarkStart w:id="71" w:name="_Toc24053"/>
       <w:bookmarkEnd w:id="66"/>
       <w:r>
         <w:rPr>
@@ -5145,14 +5053,15 @@
     <w:p>
       <w:pPr>
         <w:pStyle w:val="Title2nd1"/>
+        <w:ind w:hanging="0" w:start="0"/>
         <w:rPr>
           <w:rFonts w:eastAsia="Times New Roman" w:cs="Times New Roman"/>
         </w:rPr>
       </w:pPr>
       <w:bookmarkStart w:id="72" w:name="__RefHeading___Toc2387_792400555"/>
-      <w:bookmarkStart w:id="73" w:name="_Toc25781"/>
+      <w:bookmarkStart w:id="73" w:name="_Зміст000077"/>
       <w:bookmarkStart w:id="74" w:name="_Toc196826530"/>
-      <w:bookmarkStart w:id="75" w:name="_Зміст000077"/>
+      <w:bookmarkStart w:id="75" w:name="_Toc25781"/>
       <w:bookmarkEnd w:id="72"/>
       <w:r>
         <w:rPr>
@@ -5226,14 +5135,15 @@
     <w:p>
       <w:pPr>
         <w:pStyle w:val="Title2nd1"/>
+        <w:ind w:hanging="0" w:start="0"/>
         <w:rPr>
           <w:rFonts w:eastAsia="Times New Roman" w:cs="Times New Roman"/>
         </w:rPr>
       </w:pPr>
       <w:bookmarkStart w:id="76" w:name="__RefHeading___Toc2389_792400555"/>
-      <w:bookmarkStart w:id="77" w:name="_Зміст000078"/>
+      <w:bookmarkStart w:id="77" w:name="_Toc15598"/>
       <w:bookmarkStart w:id="78" w:name="_Toc196826531"/>
-      <w:bookmarkStart w:id="79" w:name="_Toc15598"/>
+      <w:bookmarkStart w:id="79" w:name="_Зміст000078"/>
       <w:bookmarkEnd w:id="76"/>
       <w:r>
         <w:rPr>
@@ -5321,18 +5231,19 @@
       <w:pPr>
         <w:pStyle w:val="Title1st"/>
         <w:spacing w:before="0" w:after="600"/>
+        <w:ind w:hanging="0" w:start="0"/>
         <w:rPr>
           <w:rFonts w:eastAsia="Times New Roman" w:cs="Times New Roman"/>
           <w:lang w:val="uk-UA"/>
         </w:rPr>
       </w:pPr>
       <w:bookmarkStart w:id="80" w:name="__RefHeading___Toc2391_792400555"/>
-      <w:bookmarkStart w:id="81" w:name="_Зміст000012"/>
-      <w:bookmarkStart w:id="82" w:name="_Зміст000038"/>
-      <w:bookmarkStart w:id="83" w:name="_Toc196826532"/>
-      <w:bookmarkStart w:id="84" w:name="_Toc14854"/>
-      <w:bookmarkStart w:id="85" w:name="_Зміст000079"/>
-      <w:bookmarkStart w:id="86" w:name="_Зміст000063"/>
+      <w:bookmarkStart w:id="81" w:name="_Зміст000063"/>
+      <w:bookmarkStart w:id="82" w:name="_Зміст000079"/>
+      <w:bookmarkStart w:id="83" w:name="_Toc14854"/>
+      <w:bookmarkStart w:id="84" w:name="_Toc196826532"/>
+      <w:bookmarkStart w:id="85" w:name="_Зміст000038"/>
+      <w:bookmarkStart w:id="86" w:name="_Зміст000012"/>
       <w:bookmarkEnd w:id="80"/>
       <w:r>
         <w:rPr>
@@ -5351,15 +5262,16 @@
     <w:p>
       <w:pPr>
         <w:pStyle w:val="Title2nd1"/>
+        <w:ind w:hanging="0" w:start="0"/>
         <w:rPr>
           <w:rFonts w:eastAsia="Times New Roman" w:cs="Times New Roman"/>
           <w:lang w:val="uk-UA"/>
         </w:rPr>
       </w:pPr>
       <w:bookmarkStart w:id="87" w:name="__RefHeading___Toc2393_792400555"/>
-      <w:bookmarkStart w:id="88" w:name="_Зміст000080"/>
+      <w:bookmarkStart w:id="88" w:name="_Toc196826533"/>
       <w:bookmarkStart w:id="89" w:name="_Toc4063"/>
-      <w:bookmarkStart w:id="90" w:name="_Toc196826533"/>
+      <w:bookmarkStart w:id="90" w:name="_Зміст000080"/>
       <w:bookmarkEnd w:id="87"/>
       <w:r>
         <w:rPr>
@@ -5625,17 +5537,18 @@
     <w:p>
       <w:pPr>
         <w:pStyle w:val="Title3rd1"/>
+        <w:ind w:hanging="0" w:start="0"/>
         <w:rPr>
           <w:rFonts w:eastAsia="Times New Roman" w:cs="Times New Roman"/>
           <w:lang w:val="uk-UA"/>
         </w:rPr>
       </w:pPr>
       <w:bookmarkStart w:id="91" w:name="__RefHeading___Toc2395_792400555"/>
-      <w:bookmarkStart w:id="92" w:name="_Toc19360"/>
-      <w:bookmarkStart w:id="93" w:name="_Зміст000013"/>
+      <w:bookmarkStart w:id="92" w:name="_Зміст000081"/>
+      <w:bookmarkStart w:id="93" w:name="_Toc196826534"/>
       <w:bookmarkStart w:id="94" w:name="_Зміст000039"/>
-      <w:bookmarkStart w:id="95" w:name="_Toc196826534"/>
-      <w:bookmarkStart w:id="96" w:name="_Зміст000081"/>
+      <w:bookmarkStart w:id="95" w:name="_Зміст000013"/>
+      <w:bookmarkStart w:id="96" w:name="_Toc19360"/>
       <w:bookmarkEnd w:id="91"/>
       <w:r>
         <w:rPr>
@@ -5904,7 +5817,7 @@
           </w:tcPr>
           <w:p>
             <w:pPr>
-              <w:pStyle w:val="user4"/>
+              <w:pStyle w:val="Style28"/>
               <w:spacing w:lineRule="auto" w:line="240" w:before="0" w:after="0"/>
               <w:rPr>
                 <w:rFonts w:ascii="Times New Roman" w:hAnsi="Times New Roman"/>
@@ -5939,7 +5852,7 @@
           </w:tcPr>
           <w:p>
             <w:pPr>
-              <w:pStyle w:val="user4"/>
+              <w:pStyle w:val="Style28"/>
               <w:spacing w:lineRule="auto" w:line="240" w:before="0" w:after="0"/>
               <w:rPr>
                 <w:rFonts w:ascii="Times New Roman" w:hAnsi="Times New Roman"/>
@@ -5974,7 +5887,7 @@
           </w:tcPr>
           <w:p>
             <w:pPr>
-              <w:pStyle w:val="user4"/>
+              <w:pStyle w:val="Style28"/>
               <w:spacing w:lineRule="auto" w:line="240" w:before="0" w:after="0"/>
               <w:rPr>
                 <w:rFonts w:ascii="Times New Roman" w:hAnsi="Times New Roman"/>
@@ -6010,7 +5923,7 @@
           </w:tcPr>
           <w:p>
             <w:pPr>
-              <w:pStyle w:val="user4"/>
+              <w:pStyle w:val="Style28"/>
               <w:spacing w:lineRule="auto" w:line="240" w:before="0" w:after="0"/>
               <w:rPr>
                 <w:rFonts w:ascii="Times New Roman" w:hAnsi="Times New Roman"/>
@@ -6047,7 +5960,7 @@
           </w:tcPr>
           <w:p>
             <w:pPr>
-              <w:pStyle w:val="user4"/>
+              <w:pStyle w:val="Style28"/>
               <w:spacing w:lineRule="auto" w:line="240" w:before="0" w:after="0"/>
               <w:rPr>
                 <w:rFonts w:ascii="Times New Roman" w:hAnsi="Times New Roman"/>
@@ -6077,7 +5990,7 @@
           </w:tcPr>
           <w:p>
             <w:pPr>
-              <w:pStyle w:val="user4"/>
+              <w:pStyle w:val="Style28"/>
               <w:spacing w:lineRule="auto" w:line="240" w:before="0" w:after="0"/>
               <w:rPr>
                 <w:rFonts w:ascii="Times New Roman" w:hAnsi="Times New Roman"/>
@@ -6107,7 +6020,7 @@
           </w:tcPr>
           <w:p>
             <w:pPr>
-              <w:pStyle w:val="user4"/>
+              <w:pStyle w:val="Style28"/>
               <w:spacing w:lineRule="auto" w:line="240" w:before="0" w:after="0"/>
               <w:rPr>
                 <w:rFonts w:ascii="Times New Roman" w:hAnsi="Times New Roman"/>
@@ -6138,7 +6051,7 @@
           </w:tcPr>
           <w:p>
             <w:pPr>
-              <w:pStyle w:val="user4"/>
+              <w:pStyle w:val="Style28"/>
               <w:spacing w:lineRule="auto" w:line="240" w:before="0" w:after="0"/>
               <w:rPr>
                 <w:rFonts w:ascii="Times New Roman" w:hAnsi="Times New Roman"/>
@@ -6171,7 +6084,7 @@
           </w:tcPr>
           <w:p>
             <w:pPr>
-              <w:pStyle w:val="user4"/>
+              <w:pStyle w:val="Style28"/>
               <w:spacing w:lineRule="auto" w:line="240" w:before="0" w:after="0"/>
               <w:rPr>
                 <w:rFonts w:ascii="Times New Roman" w:hAnsi="Times New Roman"/>
@@ -6201,7 +6114,7 @@
           </w:tcPr>
           <w:p>
             <w:pPr>
-              <w:pStyle w:val="user4"/>
+              <w:pStyle w:val="Style28"/>
               <w:spacing w:lineRule="auto" w:line="240" w:before="0" w:after="0"/>
               <w:rPr>
                 <w:rFonts w:ascii="Times New Roman" w:hAnsi="Times New Roman"/>
@@ -6231,7 +6144,7 @@
           </w:tcPr>
           <w:p>
             <w:pPr>
-              <w:pStyle w:val="user4"/>
+              <w:pStyle w:val="Style28"/>
               <w:spacing w:lineRule="auto" w:line="240" w:before="0" w:after="0"/>
               <w:rPr>
                 <w:rFonts w:ascii="Times New Roman" w:hAnsi="Times New Roman"/>
@@ -6262,7 +6175,7 @@
           </w:tcPr>
           <w:p>
             <w:pPr>
-              <w:pStyle w:val="user4"/>
+              <w:pStyle w:val="Style28"/>
               <w:spacing w:lineRule="auto" w:line="240" w:before="0" w:after="0"/>
               <w:rPr>
                 <w:rFonts w:ascii="Times New Roman" w:hAnsi="Times New Roman"/>
@@ -6295,7 +6208,7 @@
           </w:tcPr>
           <w:p>
             <w:pPr>
-              <w:pStyle w:val="user4"/>
+              <w:pStyle w:val="Style28"/>
               <w:spacing w:lineRule="auto" w:line="240" w:before="0" w:after="0"/>
               <w:rPr>
                 <w:rFonts w:ascii="Times New Roman" w:hAnsi="Times New Roman"/>
@@ -6325,7 +6238,7 @@
           </w:tcPr>
           <w:p>
             <w:pPr>
-              <w:pStyle w:val="user4"/>
+              <w:pStyle w:val="Style28"/>
               <w:spacing w:lineRule="auto" w:line="240" w:before="0" w:after="0"/>
               <w:rPr>
                 <w:rFonts w:ascii="Times New Roman" w:hAnsi="Times New Roman"/>
@@ -6355,7 +6268,7 @@
           </w:tcPr>
           <w:p>
             <w:pPr>
-              <w:pStyle w:val="user4"/>
+              <w:pStyle w:val="Style28"/>
               <w:spacing w:lineRule="auto" w:line="240" w:before="0" w:after="0"/>
               <w:rPr>
                 <w:rFonts w:ascii="Times New Roman" w:hAnsi="Times New Roman"/>
@@ -6386,7 +6299,7 @@
           </w:tcPr>
           <w:p>
             <w:pPr>
-              <w:pStyle w:val="user4"/>
+              <w:pStyle w:val="Style28"/>
               <w:spacing w:lineRule="auto" w:line="240" w:before="0" w:after="0"/>
               <w:rPr>
                 <w:rFonts w:ascii="Times New Roman" w:hAnsi="Times New Roman"/>
@@ -6426,6 +6339,7 @@
     <w:p>
       <w:pPr>
         <w:pStyle w:val="Title3rd1"/>
+        <w:ind w:hanging="0" w:start="0"/>
         <w:rPr>
           <w:rFonts w:eastAsia="Times New Roman" w:cs="Times New Roman"/>
           <w:lang w:val="uk-UA"/>
@@ -6548,7 +6462,7 @@
         <w:pStyle w:val="Common"/>
         <w:numPr>
           <w:ilvl w:val="0"/>
-          <w:numId w:val="5"/>
+          <w:numId w:val="4"/>
         </w:numPr>
         <w:ind w:hanging="360" w:start="1211"/>
         <w:rPr>
@@ -6569,7 +6483,7 @@
         <w:pStyle w:val="Common"/>
         <w:numPr>
           <w:ilvl w:val="0"/>
-          <w:numId w:val="5"/>
+          <w:numId w:val="4"/>
         </w:numPr>
         <w:ind w:hanging="360" w:start="1211"/>
         <w:rPr>
@@ -6590,7 +6504,7 @@
         <w:pStyle w:val="Common"/>
         <w:numPr>
           <w:ilvl w:val="0"/>
-          <w:numId w:val="5"/>
+          <w:numId w:val="4"/>
         </w:numPr>
         <w:ind w:hanging="360" w:start="1211"/>
         <w:rPr>
@@ -6715,7 +6629,7 @@
           </w:tcPr>
           <w:p>
             <w:pPr>
-              <w:pStyle w:val="user4"/>
+              <w:pStyle w:val="Style28"/>
               <w:spacing w:lineRule="auto" w:line="240" w:before="0" w:after="0"/>
               <w:rPr>
                 <w:rFonts w:ascii="Times New Roman" w:hAnsi="Times New Roman"/>
@@ -6750,7 +6664,7 @@
           </w:tcPr>
           <w:p>
             <w:pPr>
-              <w:pStyle w:val="user4"/>
+              <w:pStyle w:val="Style28"/>
               <w:spacing w:lineRule="auto" w:line="240" w:before="0" w:after="0"/>
               <w:rPr>
                 <w:rFonts w:ascii="Times New Roman" w:hAnsi="Times New Roman"/>
@@ -6786,7 +6700,7 @@
           </w:tcPr>
           <w:p>
             <w:pPr>
-              <w:pStyle w:val="user4"/>
+              <w:pStyle w:val="Style28"/>
               <w:spacing w:lineRule="auto" w:line="240" w:before="0" w:after="0"/>
               <w:rPr>
                 <w:rFonts w:ascii="Times New Roman" w:hAnsi="Times New Roman"/>
@@ -6823,7 +6737,7 @@
           </w:tcPr>
           <w:p>
             <w:pPr>
-              <w:pStyle w:val="user4"/>
+              <w:pStyle w:val="Style28"/>
               <w:spacing w:lineRule="auto" w:line="240" w:before="0" w:after="0"/>
               <w:rPr>
                 <w:rFonts w:ascii="Times New Roman" w:hAnsi="Times New Roman"/>
@@ -6853,7 +6767,7 @@
           </w:tcPr>
           <w:p>
             <w:pPr>
-              <w:pStyle w:val="user4"/>
+              <w:pStyle w:val="Style28"/>
               <w:spacing w:lineRule="auto" w:line="240" w:before="0" w:after="0"/>
               <w:rPr>
                 <w:rFonts w:ascii="Times New Roman" w:hAnsi="Times New Roman"/>
@@ -6884,7 +6798,7 @@
           </w:tcPr>
           <w:p>
             <w:pPr>
-              <w:pStyle w:val="user4"/>
+              <w:pStyle w:val="Style28"/>
               <w:spacing w:lineRule="auto" w:line="240" w:before="0" w:after="0"/>
               <w:rPr>
                 <w:rFonts w:ascii="Times New Roman" w:hAnsi="Times New Roman"/>
@@ -6917,7 +6831,7 @@
           </w:tcPr>
           <w:p>
             <w:pPr>
-              <w:pStyle w:val="user4"/>
+              <w:pStyle w:val="Style28"/>
               <w:spacing w:lineRule="auto" w:line="240" w:before="0" w:after="0"/>
               <w:rPr>
                 <w:rFonts w:ascii="Times New Roman" w:hAnsi="Times New Roman"/>
@@ -6947,7 +6861,7 @@
           </w:tcPr>
           <w:p>
             <w:pPr>
-              <w:pStyle w:val="user4"/>
+              <w:pStyle w:val="Style28"/>
               <w:spacing w:lineRule="auto" w:line="240" w:before="0" w:after="0"/>
               <w:rPr>
                 <w:rFonts w:ascii="Times New Roman" w:hAnsi="Times New Roman"/>
@@ -6978,7 +6892,7 @@
           </w:tcPr>
           <w:p>
             <w:pPr>
-              <w:pStyle w:val="user4"/>
+              <w:pStyle w:val="Style28"/>
               <w:spacing w:lineRule="auto" w:line="240" w:before="0" w:after="0"/>
               <w:rPr>
                 <w:rFonts w:ascii="Times New Roman" w:hAnsi="Times New Roman"/>
@@ -7011,7 +6925,7 @@
           </w:tcPr>
           <w:p>
             <w:pPr>
-              <w:pStyle w:val="user4"/>
+              <w:pStyle w:val="Style28"/>
               <w:spacing w:lineRule="auto" w:line="240" w:before="0" w:after="0"/>
               <w:rPr>
                 <w:rFonts w:ascii="Times New Roman" w:hAnsi="Times New Roman"/>
@@ -7041,7 +6955,7 @@
           </w:tcPr>
           <w:p>
             <w:pPr>
-              <w:pStyle w:val="user4"/>
+              <w:pStyle w:val="Style28"/>
               <w:spacing w:lineRule="auto" w:line="240" w:before="0" w:after="0"/>
               <w:rPr>
                 <w:rFonts w:ascii="Times New Roman" w:hAnsi="Times New Roman"/>
@@ -7072,7 +6986,7 @@
           </w:tcPr>
           <w:p>
             <w:pPr>
-              <w:pStyle w:val="user4"/>
+              <w:pStyle w:val="Style28"/>
               <w:spacing w:lineRule="auto" w:line="240" w:before="0" w:after="0"/>
               <w:rPr>
                 <w:rFonts w:ascii="Times New Roman" w:hAnsi="Times New Roman"/>
@@ -7127,17 +7041,18 @@
     <w:p>
       <w:pPr>
         <w:pStyle w:val="Title3rd1"/>
+        <w:ind w:hanging="0" w:start="0"/>
         <w:rPr>
           <w:rFonts w:eastAsia="Times New Roman" w:cs="Times New Roman"/>
           <w:lang w:val="uk-UA"/>
         </w:rPr>
       </w:pPr>
       <w:bookmarkStart w:id="98" w:name="__RefHeading___Toc2397_792400555"/>
-      <w:bookmarkStart w:id="99" w:name="_Toc196826535"/>
-      <w:bookmarkStart w:id="100" w:name="_Зміст000014"/>
+      <w:bookmarkStart w:id="99" w:name="_Зміст000082"/>
+      <w:bookmarkStart w:id="100" w:name="_Зміст000040"/>
       <w:bookmarkStart w:id="101" w:name="_Toc12907"/>
-      <w:bookmarkStart w:id="102" w:name="_Зміст000040"/>
-      <w:bookmarkStart w:id="103" w:name="_Зміст000082"/>
+      <w:bookmarkStart w:id="102" w:name="_Зміст000014"/>
+      <w:bookmarkStart w:id="103" w:name="_Toc196826535"/>
       <w:bookmarkEnd w:id="98"/>
       <w:r>
         <w:rPr>
@@ -7870,14 +7785,15 @@
     <w:p>
       <w:pPr>
         <w:pStyle w:val="Title2nd1"/>
+        <w:ind w:hanging="0" w:start="0"/>
         <w:rPr>
           <w:rFonts w:eastAsia="Times New Roman" w:cs="Times New Roman"/>
         </w:rPr>
       </w:pPr>
       <w:bookmarkStart w:id="104" w:name="__RefHeading___Toc2399_792400555"/>
-      <w:bookmarkStart w:id="105" w:name="_Toc31252"/>
+      <w:bookmarkStart w:id="105" w:name="_Toc196826537"/>
       <w:bookmarkStart w:id="106" w:name="_Зміст000084"/>
-      <w:bookmarkStart w:id="107" w:name="_Toc196826537"/>
+      <w:bookmarkStart w:id="107" w:name="_Toc31252"/>
       <w:bookmarkEnd w:id="104"/>
       <w:r>
         <w:rPr>
@@ -8016,6 +7932,7 @@
     <w:p>
       <w:pPr>
         <w:pStyle w:val="Title2nd1"/>
+        <w:ind w:hanging="0" w:start="0"/>
         <w:rPr/>
       </w:pPr>
       <w:bookmarkStart w:id="108" w:name="__RefHeading___Toc2641_2362981076"/>
@@ -8158,14 +8075,15 @@
     <w:p>
       <w:pPr>
         <w:pStyle w:val="Title2nd1"/>
+        <w:ind w:hanging="0" w:start="0"/>
         <w:rPr>
           <w:rFonts w:eastAsia="Times New Roman" w:cs="Times New Roman"/>
         </w:rPr>
       </w:pPr>
       <w:bookmarkStart w:id="109" w:name="__RefHeading___Toc2401_792400555"/>
-      <w:bookmarkStart w:id="110" w:name="_Toc4204"/>
+      <w:bookmarkStart w:id="110" w:name="_Зміст000085"/>
       <w:bookmarkStart w:id="111" w:name="_Toc196826538"/>
-      <w:bookmarkStart w:id="112" w:name="_Зміст000085"/>
+      <w:bookmarkStart w:id="112" w:name="_Toc4204"/>
       <w:bookmarkEnd w:id="109"/>
       <w:r>
         <w:rPr>
@@ -8363,14 +8281,15 @@
     <w:p>
       <w:pPr>
         <w:pStyle w:val="Title2nd1"/>
+        <w:ind w:hanging="0" w:start="0"/>
         <w:rPr>
           <w:rFonts w:eastAsia="Times New Roman" w:cs="Times New Roman"/>
         </w:rPr>
       </w:pPr>
       <w:bookmarkStart w:id="113" w:name="__RefHeading___Toc2403_792400555"/>
-      <w:bookmarkStart w:id="114" w:name="_Toc8474"/>
+      <w:bookmarkStart w:id="114" w:name="_Зміст000086"/>
       <w:bookmarkStart w:id="115" w:name="_Toc196826539"/>
-      <w:bookmarkStart w:id="116" w:name="_Зміст000086"/>
+      <w:bookmarkStart w:id="116" w:name="_Toc8474"/>
       <w:bookmarkEnd w:id="113"/>
       <w:r>
         <w:rPr>
@@ -8476,14 +8395,15 @@
       <w:pPr>
         <w:pStyle w:val="Title1st"/>
         <w:spacing w:before="0" w:after="600"/>
+        <w:ind w:hanging="0" w:start="0"/>
         <w:rPr>
           <w:rFonts w:eastAsia="Times New Roman" w:cs="Times New Roman"/>
         </w:rPr>
       </w:pPr>
       <w:bookmarkStart w:id="117" w:name="__RefHeading___Toc2405_792400555"/>
-      <w:bookmarkStart w:id="118" w:name="_Toc24797"/>
+      <w:bookmarkStart w:id="118" w:name="_Зміст000042"/>
       <w:bookmarkStart w:id="119" w:name="_Зміст000087"/>
-      <w:bookmarkStart w:id="120" w:name="_Зміст000042"/>
+      <w:bookmarkStart w:id="120" w:name="_Toc24797"/>
       <w:bookmarkEnd w:id="117"/>
       <w:r>
         <w:rPr>
@@ -8498,14 +8418,15 @@
     <w:p>
       <w:pPr>
         <w:pStyle w:val="Title2nd1"/>
+        <w:ind w:hanging="0" w:start="0"/>
         <w:rPr>
           <w:rFonts w:eastAsia="Times New Roman" w:cs="Times New Roman"/>
         </w:rPr>
       </w:pPr>
       <w:bookmarkStart w:id="121" w:name="__RefHeading___Toc2407_792400555"/>
-      <w:bookmarkStart w:id="122" w:name="_Toc17760"/>
+      <w:bookmarkStart w:id="122" w:name="_Зміст000088"/>
       <w:bookmarkStart w:id="123" w:name="_Зміст000043"/>
-      <w:bookmarkStart w:id="124" w:name="_Зміст000088"/>
+      <w:bookmarkStart w:id="124" w:name="_Toc17760"/>
       <w:bookmarkEnd w:id="121"/>
       <w:r>
         <w:rPr>
@@ -8754,6 +8675,7 @@
     <w:p>
       <w:pPr>
         <w:pStyle w:val="Title2nd1"/>
+        <w:ind w:hanging="0" w:start="0"/>
         <w:rPr/>
       </w:pPr>
       <w:bookmarkStart w:id="125" w:name="__RefHeading___Toc2643_2362981076"/>
@@ -8947,14 +8869,15 @@
     <w:p>
       <w:pPr>
         <w:pStyle w:val="Title2nd1"/>
+        <w:ind w:hanging="0" w:start="0"/>
         <w:rPr>
           <w:rFonts w:eastAsia="Times New Roman" w:cs="Times New Roman"/>
         </w:rPr>
       </w:pPr>
       <w:bookmarkStart w:id="126" w:name="__RefHeading___Toc2411_792400555"/>
-      <w:bookmarkStart w:id="127" w:name="_Зміст000095"/>
+      <w:bookmarkStart w:id="127" w:name="_Toc21967"/>
       <w:bookmarkStart w:id="128" w:name="_Зміст000050"/>
-      <w:bookmarkStart w:id="129" w:name="_Toc21967"/>
+      <w:bookmarkStart w:id="129" w:name="_Зміст000095"/>
       <w:bookmarkEnd w:id="126"/>
       <w:r>
         <w:rPr>
@@ -9059,6 +8982,7 @@
       <w:pPr>
         <w:pStyle w:val="Title1st"/>
         <w:spacing w:before="0" w:after="600"/>
+        <w:ind w:hanging="0" w:start="0"/>
         <w:rPr/>
       </w:pPr>
       <w:bookmarkStart w:id="130" w:name="__RefHeading___Toc2413_792400555"/>
@@ -9079,6 +9003,7 @@
     <w:p>
       <w:pPr>
         <w:pStyle w:val="Title2nd1"/>
+        <w:ind w:hanging="0" w:start="0"/>
         <w:rPr/>
       </w:pPr>
       <w:bookmarkStart w:id="132" w:name="__RefHeading___Toc2423_792400555"/>
@@ -9206,6 +9131,7 @@
     <w:p>
       <w:pPr>
         <w:pStyle w:val="Title2nd1"/>
+        <w:ind w:hanging="0" w:start="0"/>
         <w:rPr/>
       </w:pPr>
       <w:bookmarkStart w:id="134" w:name="__RefHeading___Toc2645_2362981076"/>
@@ -9382,6 +9308,7 @@
       <w:pPr>
         <w:pStyle w:val="Title1st"/>
         <w:spacing w:before="0" w:after="600"/>
+        <w:ind w:hanging="0" w:start="0"/>
         <w:rPr/>
       </w:pPr>
       <w:bookmarkStart w:id="135" w:name="__RefHeading___Toc2425_792400555"/>
@@ -9402,6 +9329,7 @@
     <w:p>
       <w:pPr>
         <w:pStyle w:val="Title2nd1"/>
+        <w:ind w:hanging="0" w:start="0"/>
         <w:rPr/>
       </w:pPr>
       <w:bookmarkStart w:id="137" w:name="__RefHeading___Toc2427_792400555"/>
@@ -9464,6 +9392,7 @@
     <w:p>
       <w:pPr>
         <w:pStyle w:val="Title2nd1"/>
+        <w:ind w:hanging="0" w:start="0"/>
         <w:rPr/>
       </w:pPr>
       <w:bookmarkStart w:id="139" w:name="__RefHeading___Toc2429_792400555"/>
@@ -9524,6 +9453,7 @@
     <w:p>
       <w:pPr>
         <w:pStyle w:val="Title2nd1"/>
+        <w:ind w:hanging="0" w:start="0"/>
         <w:rPr/>
       </w:pPr>
       <w:bookmarkStart w:id="141" w:name="__RefHeading___Toc2431_792400555"/>
@@ -9720,6 +9650,7 @@
       <w:pPr>
         <w:pStyle w:val="Title1st"/>
         <w:spacing w:before="0" w:after="600"/>
+        <w:ind w:hanging="0" w:start="0"/>
         <w:rPr/>
       </w:pPr>
       <w:bookmarkStart w:id="143" w:name="__RefHeading___Toc2441_792400555"/>
@@ -9971,17 +9902,18 @@
       <w:pPr>
         <w:pStyle w:val="Title1st"/>
         <w:spacing w:before="0" w:after="600"/>
+        <w:ind w:hanging="0" w:start="0"/>
         <w:rPr>
           <w:rFonts w:eastAsia="Times New Roman" w:cs="Times New Roman"/>
           <w:lang w:val="uk-UA"/>
         </w:rPr>
       </w:pPr>
       <w:bookmarkStart w:id="145" w:name="__RefHeading___Toc2443_792400555"/>
-      <w:bookmarkStart w:id="146" w:name="_Toc196826540"/>
-      <w:bookmarkStart w:id="147" w:name="_Зміст000016"/>
+      <w:bookmarkStart w:id="146" w:name="_Зміст000107"/>
+      <w:bookmarkStart w:id="147" w:name="_Toc23555"/>
       <w:bookmarkStart w:id="148" w:name="_Зміст000051"/>
-      <w:bookmarkStart w:id="149" w:name="_Toc23555"/>
-      <w:bookmarkStart w:id="150" w:name="_Зміст000107"/>
+      <w:bookmarkStart w:id="149" w:name="_Зміст000016"/>
+      <w:bookmarkStart w:id="150" w:name="_Toc196826540"/>
       <w:bookmarkEnd w:id="145"/>
       <w:r>
         <w:rPr>
@@ -10400,17 +10332,18 @@
     <w:p>
       <w:pPr>
         <w:pStyle w:val="Title1st"/>
+        <w:ind w:hanging="0" w:start="0"/>
         <w:rPr>
           <w:rFonts w:eastAsia="Times New Roman" w:cs="Times New Roman"/>
           <w:lang w:val="en-US"/>
         </w:rPr>
       </w:pPr>
       <w:bookmarkStart w:id="151" w:name="__RefHeading___Toc2445_792400555"/>
-      <w:bookmarkStart w:id="152" w:name="_Зміст000108"/>
-      <w:bookmarkStart w:id="153" w:name="_Зміст000052"/>
+      <w:bookmarkStart w:id="152" w:name="_Toc196826541"/>
+      <w:bookmarkStart w:id="153" w:name="_Зміст000017"/>
       <w:bookmarkStart w:id="154" w:name="_Toc19423"/>
-      <w:bookmarkStart w:id="155" w:name="_Зміст000017"/>
-      <w:bookmarkStart w:id="156" w:name="_Toc196826541"/>
+      <w:bookmarkStart w:id="155" w:name="_Зміст000052"/>
+      <w:bookmarkStart w:id="156" w:name="_Зміст000108"/>
       <w:bookmarkEnd w:id="151"/>
       <w:r>
         <w:rPr>
@@ -10450,17 +10383,18 @@
       <w:pPr>
         <w:pStyle w:val="Title2nd1"/>
         <w:spacing w:before="0" w:after="0"/>
+        <w:ind w:hanging="0" w:start="0"/>
         <w:rPr>
           <w:rFonts w:eastAsia="Times New Roman" w:cs="Times New Roman"/>
           <w:lang w:val="en-US"/>
         </w:rPr>
       </w:pPr>
       <w:bookmarkStart w:id="157" w:name="__RefHeading___Toc2447_792400555"/>
-      <w:bookmarkStart w:id="158" w:name="_Toc196826542"/>
-      <w:bookmarkStart w:id="159" w:name="_Toc23903"/>
+      <w:bookmarkStart w:id="158" w:name="_Зміст000053"/>
+      <w:bookmarkStart w:id="159" w:name="_Зміст000018"/>
       <w:bookmarkStart w:id="160" w:name="_Зміст000109"/>
-      <w:bookmarkStart w:id="161" w:name="_Зміст000018"/>
-      <w:bookmarkStart w:id="162" w:name="_Зміст000053"/>
+      <w:bookmarkStart w:id="161" w:name="_Toc23903"/>
+      <w:bookmarkStart w:id="162" w:name="_Toc196826542"/>
       <w:bookmarkEnd w:id="157"/>
       <w:r>
         <w:rPr>
@@ -10477,17 +10411,18 @@
     <w:p>
       <w:pPr>
         <w:pStyle w:val="Title3rd1"/>
+        <w:ind w:hanging="0" w:start="0"/>
         <w:rPr>
           <w:rFonts w:eastAsia="Times New Roman" w:cs="Times New Roman"/>
           <w:lang w:val="en-US"/>
         </w:rPr>
       </w:pPr>
       <w:bookmarkStart w:id="163" w:name="__RefHeading___Toc2449_792400555"/>
-      <w:bookmarkStart w:id="164" w:name="_Зміст000019"/>
-      <w:bookmarkStart w:id="165" w:name="_Toc10522"/>
+      <w:bookmarkStart w:id="164" w:name="_Зміст000110"/>
+      <w:bookmarkStart w:id="165" w:name="_Toc196826543"/>
       <w:bookmarkStart w:id="166" w:name="_Зміст000054"/>
-      <w:bookmarkStart w:id="167" w:name="_Toc196826543"/>
-      <w:bookmarkStart w:id="168" w:name="_Зміст000110"/>
+      <w:bookmarkStart w:id="167" w:name="_Toc10522"/>
+      <w:bookmarkStart w:id="168" w:name="_Зміст000019"/>
       <w:bookmarkEnd w:id="163"/>
       <w:r>
         <w:rPr>
@@ -10551,17 +10486,18 @@
     <w:p>
       <w:pPr>
         <w:pStyle w:val="Title3rd1"/>
+        <w:ind w:hanging="0" w:start="0"/>
         <w:rPr>
           <w:rFonts w:eastAsia="Times New Roman" w:cs="Times New Roman"/>
           <w:lang w:val="uk-UA"/>
         </w:rPr>
       </w:pPr>
       <w:bookmarkStart w:id="169" w:name="__RefHeading___Toc2451_792400555"/>
-      <w:bookmarkStart w:id="170" w:name="_Зміст000111"/>
-      <w:bookmarkStart w:id="171" w:name="_Зміст000055"/>
+      <w:bookmarkStart w:id="170" w:name="_Toc6891"/>
+      <w:bookmarkStart w:id="171" w:name="_Toc196826544"/>
       <w:bookmarkStart w:id="172" w:name="_Зміст000020"/>
-      <w:bookmarkStart w:id="173" w:name="_Toc196826544"/>
-      <w:bookmarkStart w:id="174" w:name="_Toc6891"/>
+      <w:bookmarkStart w:id="173" w:name="_Зміст000055"/>
+      <w:bookmarkStart w:id="174" w:name="_Зміст000111"/>
       <w:bookmarkEnd w:id="169"/>
       <w:r>
         <w:rPr>
@@ -10641,14 +10577,15 @@
     <w:p>
       <w:pPr>
         <w:pStyle w:val="Title2nd1"/>
+        <w:ind w:hanging="0" w:start="0"/>
         <w:rPr>
           <w:rFonts w:eastAsia="Times New Roman" w:cs="Times New Roman"/>
         </w:rPr>
       </w:pPr>
       <w:bookmarkStart w:id="175" w:name="__RefHeading___Toc2453_792400555"/>
-      <w:bookmarkStart w:id="176" w:name="_Toc1373"/>
+      <w:bookmarkStart w:id="176" w:name="_Зміст000112"/>
       <w:bookmarkStart w:id="177" w:name="_Toc196826545"/>
-      <w:bookmarkStart w:id="178" w:name="_Зміст000112"/>
+      <w:bookmarkStart w:id="178" w:name="_Toc1373"/>
       <w:bookmarkEnd w:id="175"/>
       <w:r>
         <w:rPr>
@@ -10709,14 +10646,15 @@
     <w:p>
       <w:pPr>
         <w:pStyle w:val="Title2nd1"/>
+        <w:ind w:hanging="0" w:start="0"/>
         <w:rPr>
           <w:rFonts w:eastAsia="Times New Roman" w:cs="Times New Roman"/>
         </w:rPr>
       </w:pPr>
       <w:bookmarkStart w:id="179" w:name="__RefHeading___Toc2455_792400555"/>
-      <w:bookmarkStart w:id="180" w:name="_Toc2435"/>
+      <w:bookmarkStart w:id="180" w:name="_Toc196826546"/>
       <w:bookmarkStart w:id="181" w:name="_Зміст000113"/>
-      <w:bookmarkStart w:id="182" w:name="_Toc196826546"/>
+      <w:bookmarkStart w:id="182" w:name="_Toc2435"/>
       <w:bookmarkEnd w:id="179"/>
       <w:r>
         <w:rPr>
@@ -10793,17 +10731,18 @@
     <w:p>
       <w:pPr>
         <w:pStyle w:val="Title2nd1"/>
+        <w:ind w:hanging="0" w:start="0"/>
         <w:rPr>
           <w:rFonts w:eastAsia="Times New Roman" w:cs="Times New Roman"/>
           <w:lang w:val="en-US"/>
         </w:rPr>
       </w:pPr>
       <w:bookmarkStart w:id="183" w:name="__RefHeading___Toc2457_792400555"/>
-      <w:bookmarkStart w:id="184" w:name="_Toc196826547"/>
-      <w:bookmarkStart w:id="185" w:name="_Toc26896"/>
+      <w:bookmarkStart w:id="184" w:name="_Зміст000021"/>
+      <w:bookmarkStart w:id="185" w:name="_Зміст000114"/>
       <w:bookmarkStart w:id="186" w:name="_Зміст000056"/>
-      <w:bookmarkStart w:id="187" w:name="_Зміст000114"/>
-      <w:bookmarkStart w:id="188" w:name="_Зміст000021"/>
+      <w:bookmarkStart w:id="187" w:name="_Toc26896"/>
+      <w:bookmarkStart w:id="188" w:name="_Toc196826547"/>
       <w:bookmarkEnd w:id="183"/>
       <w:r>
         <w:rPr>
@@ -10853,7 +10792,7 @@
         <w:pStyle w:val="Common"/>
         <w:numPr>
           <w:ilvl w:val="0"/>
-          <w:numId w:val="5"/>
+          <w:numId w:val="4"/>
         </w:numPr>
         <w:ind w:hanging="360" w:start="1211"/>
         <w:rPr>
@@ -10867,6 +10806,970 @@
           <w:lang w:val="uk-UA"/>
         </w:rPr>
         <w:t>Зручний графічний користувацький інтерфейс;</w:t>
+      </w:r>
+    </w:p>
+    <w:p>
+      <w:pPr>
+        <w:pStyle w:val="Common"/>
+        <w:numPr>
+          <w:ilvl w:val="0"/>
+          <w:numId w:val="4"/>
+        </w:numPr>
+        <w:ind w:hanging="360" w:start="1211"/>
+        <w:rPr>
+          <w:rFonts w:eastAsia="Times New Roman" w:cs="Times New Roman"/>
+          <w:lang w:val="uk-UA"/>
+        </w:rPr>
+      </w:pPr>
+      <w:r>
+        <w:rPr>
+          <w:rFonts w:eastAsia="Times New Roman" w:cs="Times New Roman"/>
+          <w:lang w:val="uk-UA"/>
+        </w:rPr>
+        <w:t>Використання шифру Віженера.</w:t>
+      </w:r>
+    </w:p>
+    <w:p>
+      <w:pPr>
+        <w:pStyle w:val="Common"/>
+        <w:rPr>
+          <w:rFonts w:eastAsia="Times New Roman" w:cs="Times New Roman"/>
+          <w:lang w:val="en-US"/>
+        </w:rPr>
+      </w:pPr>
+      <w:r>
+        <w:rPr>
+          <w:rFonts w:eastAsia="Times New Roman" w:cs="Times New Roman"/>
+          <w:lang w:val="en-US"/>
+        </w:rPr>
+      </w:r>
+    </w:p>
+    <w:p>
+      <w:pPr>
+        <w:pStyle w:val="Title3rd1"/>
+        <w:ind w:hanging="0" w:start="0"/>
+        <w:rPr>
+          <w:rFonts w:eastAsia="Times New Roman" w:cs="Times New Roman"/>
+          <w:lang w:val="en-US"/>
+        </w:rPr>
+      </w:pPr>
+      <w:bookmarkStart w:id="189" w:name="__RefHeading___Toc2459_792400555"/>
+      <w:bookmarkStart w:id="190" w:name="_Toc8988"/>
+      <w:bookmarkStart w:id="191" w:name="_Зміст000022"/>
+      <w:bookmarkStart w:id="192" w:name="_Зміст000057"/>
+      <w:bookmarkStart w:id="193" w:name="_Toc196826548"/>
+      <w:bookmarkStart w:id="194" w:name="_Зміст000115"/>
+      <w:bookmarkEnd w:id="189"/>
+      <w:r>
+        <w:rPr>
+          <w:rFonts w:eastAsia="Times New Roman" w:cs="Times New Roman"/>
+          <w:lang w:val="uk-UA"/>
+        </w:rPr>
+        <w:t>А.4.1 Вимоги до функціональних характеристик</w:t>
+      </w:r>
+      <w:bookmarkEnd w:id="190"/>
+      <w:bookmarkEnd w:id="191"/>
+      <w:bookmarkEnd w:id="192"/>
+      <w:bookmarkEnd w:id="193"/>
+      <w:bookmarkEnd w:id="194"/>
+    </w:p>
+    <w:p>
+      <w:pPr>
+        <w:pStyle w:val="Common"/>
+        <w:rPr>
+          <w:rFonts w:eastAsia="Times New Roman" w:cs="Times New Roman"/>
+          <w:lang w:val="en-US"/>
+        </w:rPr>
+      </w:pPr>
+      <w:r>
+        <w:rPr>
+          <w:rFonts w:eastAsia="Times New Roman" w:cs="Times New Roman"/>
+          <w:lang w:val="en-US"/>
+        </w:rPr>
+      </w:r>
+    </w:p>
+    <w:p>
+      <w:pPr>
+        <w:pStyle w:val="Common"/>
+        <w:rPr>
+          <w:rFonts w:eastAsia="Times New Roman" w:cs="Times New Roman"/>
+          <w:lang w:val="uk-UA"/>
+        </w:rPr>
+      </w:pPr>
+      <w:r>
+        <w:rPr>
+          <w:rFonts w:eastAsia="Times New Roman" w:cs="Times New Roman"/>
+          <w:lang w:val="uk-UA"/>
+        </w:rPr>
+        <w:t>Програма має виконувати такі мінімальні функції:</w:t>
+      </w:r>
+    </w:p>
+    <w:p>
+      <w:pPr>
+        <w:pStyle w:val="Common"/>
+        <w:rPr>
+          <w:rFonts w:eastAsia="Times New Roman" w:cs="Times New Roman"/>
+          <w:lang w:val="uk-UA"/>
+        </w:rPr>
+      </w:pPr>
+      <w:r>
+        <w:rPr>
+          <w:rFonts w:eastAsia="Times New Roman" w:cs="Times New Roman"/>
+          <w:lang w:val="uk-UA"/>
+        </w:rPr>
+      </w:r>
+    </w:p>
+    <w:p>
+      <w:pPr>
+        <w:pStyle w:val="Common"/>
+        <w:rPr>
+          <w:rFonts w:eastAsia="Times New Roman" w:cs="Times New Roman"/>
+          <w:lang w:val="uk-UA"/>
+        </w:rPr>
+      </w:pPr>
+      <w:r>
+        <w:rPr>
+          <w:rFonts w:eastAsia="Times New Roman" w:cs="Times New Roman"/>
+          <w:lang w:val="uk-UA"/>
+        </w:rPr>
+        <w:t>- Введення тексту для шифрування;</w:t>
+      </w:r>
+    </w:p>
+    <w:p>
+      <w:pPr>
+        <w:pStyle w:val="Common"/>
+        <w:rPr>
+          <w:rFonts w:eastAsia="Times New Roman" w:cs="Times New Roman"/>
+          <w:lang w:val="uk-UA"/>
+        </w:rPr>
+      </w:pPr>
+      <w:r>
+        <w:rPr>
+          <w:rFonts w:eastAsia="Times New Roman" w:cs="Times New Roman"/>
+          <w:lang w:val="uk-UA"/>
+        </w:rPr>
+        <w:t>- Введення ключу шифрування;</w:t>
+      </w:r>
+    </w:p>
+    <w:p>
+      <w:pPr>
+        <w:pStyle w:val="Common"/>
+        <w:rPr>
+          <w:rFonts w:eastAsia="Times New Roman" w:cs="Times New Roman"/>
+          <w:lang w:val="uk-UA"/>
+        </w:rPr>
+      </w:pPr>
+      <w:r>
+        <w:rPr>
+          <w:rFonts w:eastAsia="Times New Roman" w:cs="Times New Roman"/>
+          <w:lang w:val="uk-UA"/>
+        </w:rPr>
+        <w:t>- Виведення результатів користувачеві.</w:t>
+      </w:r>
+    </w:p>
+    <w:p>
+      <w:pPr>
+        <w:pStyle w:val="Common"/>
+        <w:rPr>
+          <w:rFonts w:eastAsia="Times New Roman" w:cs="Times New Roman"/>
+          <w:lang w:val="en-US"/>
+        </w:rPr>
+      </w:pPr>
+      <w:r>
+        <w:rPr>
+          <w:rFonts w:eastAsia="Times New Roman" w:cs="Times New Roman"/>
+          <w:lang w:val="en-US"/>
+        </w:rPr>
+      </w:r>
+    </w:p>
+    <w:p>
+      <w:pPr>
+        <w:pStyle w:val="Title3rd1"/>
+        <w:ind w:hanging="0" w:start="0"/>
+        <w:rPr>
+          <w:rFonts w:eastAsia="Times New Roman" w:cs="Times New Roman"/>
+          <w:lang w:val="en-US"/>
+        </w:rPr>
+      </w:pPr>
+      <w:bookmarkStart w:id="195" w:name="__RefHeading___Toc2461_792400555"/>
+      <w:bookmarkStart w:id="196" w:name="_Зміст000023"/>
+      <w:bookmarkStart w:id="197" w:name="_Toc196826549"/>
+      <w:bookmarkStart w:id="198" w:name="_Toc21715"/>
+      <w:bookmarkStart w:id="199" w:name="_Зміст000058"/>
+      <w:bookmarkStart w:id="200" w:name="_Зміст000116"/>
+      <w:bookmarkEnd w:id="195"/>
+      <w:r>
+        <w:rPr>
+          <w:rFonts w:eastAsia="Times New Roman" w:cs="Times New Roman"/>
+          <w:lang w:val="uk-UA"/>
+        </w:rPr>
+        <w:t>А.4.2 Вимоги до надійності</w:t>
+      </w:r>
+      <w:bookmarkEnd w:id="196"/>
+      <w:bookmarkEnd w:id="197"/>
+      <w:bookmarkEnd w:id="198"/>
+      <w:bookmarkEnd w:id="199"/>
+      <w:bookmarkEnd w:id="200"/>
+    </w:p>
+    <w:p>
+      <w:pPr>
+        <w:pStyle w:val="Common"/>
+        <w:rPr>
+          <w:rFonts w:eastAsia="Times New Roman" w:cs="Times New Roman"/>
+          <w:lang w:val="en-US"/>
+        </w:rPr>
+      </w:pPr>
+      <w:r>
+        <w:rPr>
+          <w:rFonts w:eastAsia="Times New Roman" w:cs="Times New Roman"/>
+          <w:lang w:val="en-US"/>
+        </w:rPr>
+      </w:r>
+    </w:p>
+    <w:p>
+      <w:pPr>
+        <w:pStyle w:val="Common"/>
+        <w:rPr>
+          <w:rFonts w:eastAsia="Times New Roman" w:cs="Times New Roman"/>
+          <w:lang w:val="uk-UA"/>
+        </w:rPr>
+      </w:pPr>
+      <w:r>
+        <w:rPr>
+          <w:rFonts w:eastAsia="Times New Roman" w:cs="Times New Roman"/>
+          <w:lang w:val="uk-UA"/>
+        </w:rPr>
+        <w:t>Програма має містити обробники виключних ситуацій аби не допустити непланового завершення роботи.</w:t>
+      </w:r>
+    </w:p>
+    <w:p>
+      <w:pPr>
+        <w:pStyle w:val="Common"/>
+        <w:rPr>
+          <w:rFonts w:eastAsia="Times New Roman" w:cs="Times New Roman"/>
+          <w:lang w:val="uk-UA"/>
+        </w:rPr>
+      </w:pPr>
+      <w:r>
+        <w:rPr>
+          <w:rFonts w:eastAsia="Times New Roman" w:cs="Times New Roman"/>
+          <w:lang w:val="uk-UA"/>
+        </w:rPr>
+        <w:t>Для надійності даних вони можуть зберігатися у буфері обміну.</w:t>
+      </w:r>
+    </w:p>
+    <w:p>
+      <w:pPr>
+        <w:pStyle w:val="Common"/>
+        <w:rPr>
+          <w:rFonts w:eastAsia="Times New Roman" w:cs="Times New Roman"/>
+          <w:lang w:val="en-US"/>
+        </w:rPr>
+      </w:pPr>
+      <w:r>
+        <w:rPr>
+          <w:rFonts w:eastAsia="Times New Roman" w:cs="Times New Roman"/>
+          <w:lang w:val="en-US"/>
+        </w:rPr>
+      </w:r>
+    </w:p>
+    <w:p>
+      <w:pPr>
+        <w:pStyle w:val="Title3rd1"/>
+        <w:ind w:hanging="0" w:start="0"/>
+        <w:rPr>
+          <w:rFonts w:eastAsia="Times New Roman" w:cs="Times New Roman"/>
+          <w:lang w:val="uk-UA"/>
+        </w:rPr>
+      </w:pPr>
+      <w:bookmarkStart w:id="201" w:name="__RefHeading___Toc2463_792400555"/>
+      <w:bookmarkStart w:id="202" w:name="_Зміст000117"/>
+      <w:bookmarkStart w:id="203" w:name="_Зміст000024"/>
+      <w:bookmarkStart w:id="204" w:name="_Toc8780"/>
+      <w:bookmarkStart w:id="205" w:name="_Зміст000059"/>
+      <w:bookmarkStart w:id="206" w:name="_Toc196826550"/>
+      <w:bookmarkEnd w:id="201"/>
+      <w:r>
+        <w:rPr>
+          <w:rFonts w:eastAsia="Times New Roman" w:cs="Times New Roman"/>
+          <w:lang w:val="uk-UA"/>
+        </w:rPr>
+        <w:t>А.4.3 Вимоги до технічних та програмних засобів</w:t>
+      </w:r>
+      <w:bookmarkEnd w:id="202"/>
+      <w:bookmarkEnd w:id="203"/>
+      <w:bookmarkEnd w:id="204"/>
+      <w:bookmarkEnd w:id="205"/>
+      <w:bookmarkEnd w:id="206"/>
+    </w:p>
+    <w:p>
+      <w:pPr>
+        <w:pStyle w:val="Common"/>
+        <w:rPr>
+          <w:rFonts w:eastAsia="Times New Roman" w:cs="Times New Roman"/>
+          <w:lang w:val="uk-UA"/>
+        </w:rPr>
+      </w:pPr>
+      <w:r>
+        <w:rPr>
+          <w:rFonts w:eastAsia="Times New Roman" w:cs="Times New Roman"/>
+          <w:lang w:val="uk-UA"/>
+        </w:rPr>
+      </w:r>
+    </w:p>
+    <w:p>
+      <w:pPr>
+        <w:pStyle w:val="Common"/>
+        <w:rPr>
+          <w:rFonts w:eastAsia="Times New Roman" w:cs="Times New Roman"/>
+          <w:lang w:val="uk-UA"/>
+        </w:rPr>
+      </w:pPr>
+      <w:r>
+        <w:rPr>
+          <w:rFonts w:eastAsia="Times New Roman" w:cs="Times New Roman"/>
+          <w:lang w:val="uk-UA"/>
+        </w:rPr>
+        <w:t>Програма має запускатися у браузері і бути доступною як на мобільних, так і на домашніх комп’ютерах.</w:t>
+      </w:r>
+    </w:p>
+    <w:p>
+      <w:pPr>
+        <w:pStyle w:val="Common"/>
+        <w:rPr>
+          <w:rFonts w:eastAsia="Times New Roman" w:cs="Times New Roman"/>
+          <w:lang w:val="uk-UA"/>
+        </w:rPr>
+      </w:pPr>
+      <w:r>
+        <w:rPr>
+          <w:rFonts w:eastAsia="Times New Roman" w:cs="Times New Roman"/>
+          <w:lang w:val="uk-UA"/>
+        </w:rPr>
+        <w:t>Мінімальні вимоги до клієнтської частини:</w:t>
+      </w:r>
+    </w:p>
+    <w:p>
+      <w:pPr>
+        <w:pStyle w:val="Common"/>
+        <w:rPr>
+          <w:rFonts w:eastAsia="Times New Roman" w:cs="Times New Roman"/>
+          <w:lang w:val="uk-UA"/>
+        </w:rPr>
+      </w:pPr>
+      <w:r>
+        <w:rPr>
+          <w:rFonts w:eastAsia="Times New Roman" w:cs="Times New Roman"/>
+          <w:lang w:val="uk-UA"/>
+        </w:rPr>
+      </w:r>
+    </w:p>
+    <w:p>
+      <w:pPr>
+        <w:pStyle w:val="Common"/>
+        <w:numPr>
+          <w:ilvl w:val="0"/>
+          <w:numId w:val="4"/>
+        </w:numPr>
+        <w:ind w:hanging="360" w:start="1211"/>
+        <w:rPr>
+          <w:rFonts w:eastAsia="Times New Roman" w:cs="Times New Roman"/>
+          <w:lang w:val="uk-UA"/>
+        </w:rPr>
+      </w:pPr>
+      <w:r>
+        <w:rPr>
+          <w:rFonts w:eastAsia="Times New Roman" w:cs="Times New Roman"/>
+          <w:lang w:val="uk-UA"/>
+        </w:rPr>
+        <w:t>Процесор: х6</w:t>
+      </w:r>
+      <w:r>
+        <w:rPr>
+          <w:rFonts w:eastAsia="Times New Roman" w:cs="Times New Roman"/>
+          <w:lang w:val="en-US"/>
+        </w:rPr>
+        <w:t>4</w:t>
+      </w:r>
+      <w:r>
+        <w:rPr>
+          <w:rFonts w:eastAsia="Times New Roman" w:cs="Times New Roman"/>
+          <w:lang w:val="uk-UA"/>
+        </w:rPr>
+        <w:t xml:space="preserve"> / х86 </w:t>
+      </w:r>
+      <w:r>
+        <w:rPr>
+          <w:rFonts w:eastAsia="Times New Roman" w:cs="Times New Roman"/>
+          <w:lang w:val="en-US"/>
+        </w:rPr>
+        <w:t>/ ARM;</w:t>
+      </w:r>
+    </w:p>
+    <w:p>
+      <w:pPr>
+        <w:pStyle w:val="Common"/>
+        <w:numPr>
+          <w:ilvl w:val="0"/>
+          <w:numId w:val="4"/>
+        </w:numPr>
+        <w:ind w:hanging="360" w:start="1211"/>
+        <w:rPr>
+          <w:rFonts w:eastAsia="Times New Roman" w:cs="Times New Roman"/>
+          <w:lang w:val="uk-UA"/>
+        </w:rPr>
+      </w:pPr>
+      <w:r>
+        <w:rPr>
+          <w:rFonts w:eastAsia="Times New Roman" w:cs="Times New Roman"/>
+          <w:lang w:val="uk-UA"/>
+        </w:rPr>
+        <w:t>Оперативна пам’ять: 512 МБ;</w:t>
+      </w:r>
+    </w:p>
+    <w:p>
+      <w:pPr>
+        <w:pStyle w:val="Common"/>
+        <w:numPr>
+          <w:ilvl w:val="0"/>
+          <w:numId w:val="4"/>
+        </w:numPr>
+        <w:ind w:hanging="360" w:start="1211"/>
+        <w:rPr>
+          <w:rFonts w:eastAsia="Times New Roman" w:cs="Times New Roman"/>
+          <w:lang w:val="uk-UA"/>
+        </w:rPr>
+      </w:pPr>
+      <w:r>
+        <w:rPr>
+          <w:rFonts w:eastAsia="Times New Roman" w:cs="Times New Roman"/>
+          <w:lang w:val="uk-UA"/>
+        </w:rPr>
+        <w:t>Накопичувач: 1 ГБ вільного місця;</w:t>
+      </w:r>
+    </w:p>
+    <w:p>
+      <w:pPr>
+        <w:pStyle w:val="Common"/>
+        <w:numPr>
+          <w:ilvl w:val="0"/>
+          <w:numId w:val="4"/>
+        </w:numPr>
+        <w:ind w:hanging="360" w:start="1211"/>
+        <w:rPr>
+          <w:rFonts w:eastAsia="Times New Roman" w:cs="Times New Roman"/>
+          <w:lang w:val="uk-UA"/>
+        </w:rPr>
+      </w:pPr>
+      <w:r>
+        <w:rPr>
+          <w:rFonts w:eastAsia="Times New Roman" w:cs="Times New Roman"/>
+          <w:lang w:val="uk-UA"/>
+        </w:rPr>
+        <w:t>Операційна система:</w:t>
+      </w:r>
+      <w:r>
+        <w:rPr>
+          <w:rFonts w:eastAsia="Times New Roman" w:cs="Times New Roman"/>
+          <w:lang w:val="en-US"/>
+        </w:rPr>
+        <w:t xml:space="preserve"> Android, iOS, macOS, Linux, Windows. </w:t>
+      </w:r>
+    </w:p>
+    <w:p>
+      <w:pPr>
+        <w:pStyle w:val="Common"/>
+        <w:ind w:hanging="0"/>
+        <w:rPr>
+          <w:rFonts w:eastAsia="Times New Roman" w:cs="Times New Roman"/>
+          <w:lang w:val="uk-UA"/>
+        </w:rPr>
+      </w:pPr>
+      <w:r>
+        <w:rPr>
+          <w:rFonts w:eastAsia="Times New Roman" w:cs="Times New Roman"/>
+          <w:lang w:val="uk-UA"/>
+        </w:rPr>
+      </w:r>
+    </w:p>
+    <w:p>
+      <w:pPr>
+        <w:pStyle w:val="Common"/>
+        <w:rPr>
+          <w:rFonts w:eastAsia="Times New Roman" w:cs="Times New Roman"/>
+          <w:lang w:val="uk-UA"/>
+        </w:rPr>
+      </w:pPr>
+      <w:r>
+        <w:rPr>
+          <w:rFonts w:eastAsia="Times New Roman" w:cs="Times New Roman"/>
+          <w:lang w:val="uk-UA"/>
+        </w:rPr>
+        <w:t>Програмні засоби можуть змінюватись в ході розробки, але заплановано використати такі:</w:t>
+      </w:r>
+    </w:p>
+    <w:p>
+      <w:pPr>
+        <w:pStyle w:val="Common"/>
+        <w:rPr>
+          <w:rFonts w:eastAsia="Times New Roman" w:cs="Times New Roman"/>
+          <w:lang w:val="uk-UA"/>
+        </w:rPr>
+      </w:pPr>
+      <w:r>
+        <w:rPr>
+          <w:rFonts w:eastAsia="Times New Roman" w:cs="Times New Roman"/>
+          <w:lang w:val="uk-UA"/>
+        </w:rPr>
+      </w:r>
+    </w:p>
+    <w:p>
+      <w:pPr>
+        <w:pStyle w:val="Common"/>
+        <w:rPr>
+          <w:rFonts w:eastAsia="Times New Roman" w:cs="Times New Roman"/>
+          <w:lang w:val="en-US"/>
+        </w:rPr>
+      </w:pPr>
+      <w:r>
+        <w:rPr>
+          <w:rFonts w:eastAsia="Times New Roman" w:cs="Times New Roman"/>
+          <w:lang w:val="en-US"/>
+        </w:rPr>
+        <w:t>- Flask (</w:t>
+      </w:r>
+      <w:r>
+        <w:rPr>
+          <w:rFonts w:eastAsia="Times New Roman" w:cs="Times New Roman"/>
+          <w:lang w:val="uk-UA"/>
+        </w:rPr>
+        <w:t xml:space="preserve">бекенд фреймворк для </w:t>
+      </w:r>
+      <w:r>
+        <w:rPr>
+          <w:rFonts w:eastAsia="Times New Roman" w:cs="Times New Roman"/>
+          <w:lang w:val="en-US"/>
+        </w:rPr>
+        <w:t>Python);</w:t>
+      </w:r>
+    </w:p>
+    <w:p>
+      <w:pPr>
+        <w:pStyle w:val="Common"/>
+        <w:rPr>
+          <w:rFonts w:eastAsia="Times New Roman" w:cs="Times New Roman"/>
+          <w:lang w:val="en-US"/>
+        </w:rPr>
+      </w:pPr>
+      <w:r>
+        <w:rPr>
+          <w:rFonts w:eastAsia="Times New Roman" w:cs="Times New Roman"/>
+          <w:lang w:val="en-US"/>
+        </w:rPr>
+        <w:t>- TailwindCSS (</w:t>
+      </w:r>
+      <w:r>
+        <w:rPr>
+          <w:rFonts w:eastAsia="Times New Roman" w:cs="Times New Roman"/>
+          <w:lang w:val="uk-UA"/>
+        </w:rPr>
+        <w:t xml:space="preserve">класовий фреймворк </w:t>
+      </w:r>
+      <w:r>
+        <w:rPr>
+          <w:rFonts w:eastAsia="Times New Roman" w:cs="Times New Roman"/>
+          <w:lang w:val="en-US"/>
+        </w:rPr>
+        <w:t>CSS).</w:t>
+      </w:r>
+    </w:p>
+    <w:p>
+      <w:pPr>
+        <w:pStyle w:val="Common"/>
+        <w:rPr>
+          <w:rFonts w:eastAsia="Times New Roman" w:cs="Times New Roman"/>
+          <w:lang w:val="uk-UA"/>
+        </w:rPr>
+      </w:pPr>
+      <w:r>
+        <w:rPr>
+          <w:rFonts w:eastAsia="Times New Roman" w:cs="Times New Roman"/>
+          <w:lang w:val="uk-UA"/>
+        </w:rPr>
+      </w:r>
+    </w:p>
+    <w:p>
+      <w:pPr>
+        <w:pStyle w:val="Common"/>
+        <w:rPr>
+          <w:rFonts w:eastAsia="Times New Roman" w:cs="Times New Roman"/>
+          <w:lang w:val="uk-UA"/>
+        </w:rPr>
+      </w:pPr>
+      <w:r>
+        <w:rPr>
+          <w:rFonts w:eastAsia="Times New Roman" w:cs="Times New Roman"/>
+          <w:lang w:val="uk-UA"/>
+        </w:rPr>
+        <w:t xml:space="preserve">Для користувацького інтерфейсу програма має використовувати фреймворк </w:t>
+      </w:r>
+      <w:r>
+        <w:rPr>
+          <w:rFonts w:eastAsia="Times New Roman" w:cs="Times New Roman"/>
+          <w:lang w:val="en-US"/>
+        </w:rPr>
+        <w:t xml:space="preserve">Next.js. TailwindCSS </w:t>
+      </w:r>
+      <w:r>
+        <w:rPr>
+          <w:rFonts w:eastAsia="Times New Roman" w:cs="Times New Roman"/>
+          <w:lang w:val="uk-UA"/>
+        </w:rPr>
+        <w:t>має бути використаний для стилізації.</w:t>
+      </w:r>
+    </w:p>
+    <w:p>
+      <w:pPr>
+        <w:pStyle w:val="Common"/>
+        <w:rPr>
+          <w:rFonts w:eastAsia="Times New Roman" w:cs="Times New Roman"/>
+          <w:lang w:val="uk-UA"/>
+        </w:rPr>
+      </w:pPr>
+      <w:r>
+        <w:rPr>
+          <w:rFonts w:eastAsia="Times New Roman" w:cs="Times New Roman"/>
+          <w:lang w:val="uk-UA"/>
+        </w:rPr>
+      </w:r>
+    </w:p>
+    <w:p>
+      <w:pPr>
+        <w:pStyle w:val="Title3rd1"/>
+        <w:ind w:hanging="0" w:start="0"/>
+        <w:rPr/>
+      </w:pPr>
+      <w:bookmarkStart w:id="207" w:name="__RefHeading___Toc2647_2362981076"/>
+      <w:bookmarkEnd w:id="207"/>
+      <w:r>
+        <w:rPr/>
+        <w:t>А.4.4 Вимоги до вхідних даних</w:t>
+      </w:r>
+    </w:p>
+    <w:p>
+      <w:pPr>
+        <w:pStyle w:val="Common"/>
+        <w:rPr>
+          <w:rFonts w:eastAsia="Times New Roman" w:cs="Times New Roman"/>
+          <w:lang w:val="uk-UA"/>
+        </w:rPr>
+      </w:pPr>
+      <w:r>
+        <w:rPr>
+          <w:rFonts w:eastAsia="Times New Roman" w:cs="Times New Roman"/>
+          <w:lang w:val="uk-UA"/>
+        </w:rPr>
+      </w:r>
+    </w:p>
+    <w:p>
+      <w:pPr>
+        <w:pStyle w:val="Common"/>
+        <w:rPr>
+          <w:rFonts w:eastAsia="Times New Roman" w:cs="Times New Roman"/>
+          <w:lang w:val="uk-UA"/>
+        </w:rPr>
+      </w:pPr>
+      <w:r>
+        <w:rPr>
+          <w:rFonts w:eastAsia="Times New Roman" w:cs="Times New Roman"/>
+          <w:lang w:val="uk-UA"/>
+        </w:rPr>
+        <w:t xml:space="preserve">Вимогами до ключа та введеного тексту є підтримка повної таблиці </w:t>
+      </w:r>
+      <w:r>
+        <w:rPr>
+          <w:rFonts w:eastAsia="Times New Roman" w:cs="Times New Roman"/>
+          <w:lang w:val="en-US"/>
+        </w:rPr>
+        <w:t xml:space="preserve">ASCII, </w:t>
+      </w:r>
+      <w:r>
+        <w:rPr>
+          <w:rFonts w:eastAsia="Times New Roman" w:cs="Times New Roman"/>
+          <w:lang w:val="uk-UA"/>
+        </w:rPr>
+        <w:t>а не лише літер алфавіту.</w:t>
+      </w:r>
+    </w:p>
+    <w:p>
+      <w:pPr>
+        <w:pStyle w:val="Common"/>
+        <w:rPr>
+          <w:rFonts w:eastAsia="Times New Roman" w:cs="Times New Roman"/>
+          <w:lang w:val="uk-UA"/>
+        </w:rPr>
+      </w:pPr>
+      <w:r>
+        <w:rPr>
+          <w:rFonts w:eastAsia="Times New Roman" w:cs="Times New Roman"/>
+          <w:lang w:val="uk-UA"/>
+        </w:rPr>
+      </w:r>
+    </w:p>
+    <w:p>
+      <w:pPr>
+        <w:pStyle w:val="Title2nd1"/>
+        <w:ind w:hanging="0" w:start="0"/>
+        <w:rPr>
+          <w:rFonts w:eastAsia="Times New Roman" w:cs="Times New Roman"/>
+        </w:rPr>
+      </w:pPr>
+      <w:bookmarkStart w:id="208" w:name="__RefHeading___Toc2465_792400555"/>
+      <w:bookmarkStart w:id="209" w:name="_Toc196826551"/>
+      <w:bookmarkStart w:id="210" w:name="_Toc19314"/>
+      <w:bookmarkStart w:id="211" w:name="_Зміст000118"/>
+      <w:bookmarkEnd w:id="208"/>
+      <w:r>
+        <w:rPr>
+          <w:rFonts w:eastAsia="Times New Roman" w:cs="Times New Roman"/>
+        </w:rPr>
+        <w:t>А.5 Вимоги до програмної документації</w:t>
+      </w:r>
+      <w:bookmarkEnd w:id="209"/>
+      <w:bookmarkEnd w:id="210"/>
+      <w:bookmarkEnd w:id="211"/>
+    </w:p>
+    <w:p>
+      <w:pPr>
+        <w:pStyle w:val="Common"/>
+        <w:rPr>
+          <w:rFonts w:eastAsia="Times New Roman" w:cs="Times New Roman"/>
+          <w:lang w:val="uk-UA"/>
+        </w:rPr>
+      </w:pPr>
+      <w:r>
+        <w:rPr>
+          <w:rFonts w:eastAsia="Times New Roman" w:cs="Times New Roman"/>
+          <w:lang w:val="uk-UA"/>
+        </w:rPr>
+      </w:r>
+    </w:p>
+    <w:p>
+      <w:pPr>
+        <w:pStyle w:val="Common"/>
+        <w:rPr>
+          <w:rFonts w:eastAsia="Times New Roman" w:cs="Times New Roman"/>
+          <w:lang w:val="uk-UA"/>
+        </w:rPr>
+      </w:pPr>
+      <w:r>
+        <w:rPr>
+          <w:rFonts w:eastAsia="Times New Roman" w:cs="Times New Roman"/>
+          <w:lang w:val="uk-UA"/>
+        </w:rPr>
+        <w:t>Програмна документація має бути реалізована у:</w:t>
+      </w:r>
+    </w:p>
+    <w:p>
+      <w:pPr>
+        <w:pStyle w:val="Common"/>
+        <w:rPr>
+          <w:rFonts w:eastAsia="Times New Roman" w:cs="Times New Roman"/>
+          <w:lang w:val="uk-UA"/>
+        </w:rPr>
+      </w:pPr>
+      <w:r>
+        <w:rPr>
+          <w:rFonts w:eastAsia="Times New Roman" w:cs="Times New Roman"/>
+          <w:lang w:val="uk-UA"/>
+        </w:rPr>
+      </w:r>
+    </w:p>
+    <w:p>
+      <w:pPr>
+        <w:pStyle w:val="Common"/>
+        <w:numPr>
+          <w:ilvl w:val="0"/>
+          <w:numId w:val="4"/>
+        </w:numPr>
+        <w:ind w:hanging="360" w:start="1211"/>
+        <w:rPr>
+          <w:rFonts w:eastAsia="Times New Roman" w:cs="Times New Roman"/>
+          <w:lang w:val="uk-UA"/>
+        </w:rPr>
+      </w:pPr>
+      <w:r>
+        <w:rPr>
+          <w:rFonts w:eastAsia="Times New Roman" w:cs="Times New Roman"/>
+          <w:lang w:val="uk-UA"/>
+        </w:rPr>
+        <w:t>Пояснювальній записці;</w:t>
+      </w:r>
+    </w:p>
+    <w:p>
+      <w:pPr>
+        <w:pStyle w:val="Common"/>
+        <w:numPr>
+          <w:ilvl w:val="0"/>
+          <w:numId w:val="4"/>
+        </w:numPr>
+        <w:ind w:hanging="360" w:start="1211"/>
+        <w:rPr>
+          <w:rFonts w:eastAsia="Times New Roman" w:cs="Times New Roman"/>
+          <w:lang w:val="uk-UA"/>
+        </w:rPr>
+      </w:pPr>
+      <w:r>
+        <w:rPr>
+          <w:rFonts w:eastAsia="Times New Roman" w:cs="Times New Roman"/>
+          <w:lang w:val="uk-UA"/>
+        </w:rPr>
+        <w:t>Технічному завданні.</w:t>
+      </w:r>
+    </w:p>
+    <w:p>
+      <w:pPr>
+        <w:pStyle w:val="Common"/>
+        <w:ind w:hanging="360" w:start="1211"/>
+        <w:rPr>
+          <w:rFonts w:eastAsia="Times New Roman" w:cs="Times New Roman"/>
+          <w:lang w:val="uk-UA"/>
+        </w:rPr>
+      </w:pPr>
+      <w:r>
+        <w:rPr>
+          <w:rFonts w:eastAsia="Times New Roman" w:cs="Times New Roman"/>
+          <w:lang w:val="uk-UA"/>
+        </w:rPr>
+      </w:r>
+    </w:p>
+    <w:p>
+      <w:pPr>
+        <w:pStyle w:val="Common"/>
+        <w:rPr>
+          <w:rFonts w:eastAsia="Times New Roman" w:cs="Times New Roman"/>
+          <w:lang w:val="uk-UA"/>
+        </w:rPr>
+      </w:pPr>
+      <w:r>
+        <w:rPr>
+          <w:rFonts w:eastAsia="Times New Roman" w:cs="Times New Roman"/>
+          <w:lang w:val="uk-UA"/>
+        </w:rPr>
+        <w:t>Код програми має бути написаний зі зрозумілими назвами змінних/класів/методів і може включати коментарі.</w:t>
+      </w:r>
+    </w:p>
+    <w:p>
+      <w:pPr>
+        <w:pStyle w:val="Common"/>
+        <w:rPr>
+          <w:rFonts w:eastAsia="Times New Roman" w:cs="Times New Roman"/>
+          <w:lang w:val="uk-UA"/>
+        </w:rPr>
+      </w:pPr>
+      <w:r>
+        <w:rPr>
+          <w:rFonts w:eastAsia="Times New Roman" w:cs="Times New Roman"/>
+          <w:lang w:val="uk-UA"/>
+        </w:rPr>
+      </w:r>
+    </w:p>
+    <w:p>
+      <w:pPr>
+        <w:pStyle w:val="Title2nd1"/>
+        <w:ind w:hanging="0" w:start="0"/>
+        <w:rPr>
+          <w:rFonts w:eastAsia="Times New Roman" w:cs="Times New Roman"/>
+        </w:rPr>
+      </w:pPr>
+      <w:bookmarkStart w:id="212" w:name="__RefHeading___Toc2467_792400555"/>
+      <w:bookmarkStart w:id="213" w:name="_Зміст000119"/>
+      <w:bookmarkStart w:id="214" w:name="_Toc12028"/>
+      <w:bookmarkStart w:id="215" w:name="_Toc196826552"/>
+      <w:bookmarkEnd w:id="212"/>
+      <w:r>
+        <w:rPr>
+          <w:rFonts w:eastAsia="Times New Roman" w:cs="Times New Roman"/>
+        </w:rPr>
+        <w:t>А.6 Стадії і етапи розробки</w:t>
+      </w:r>
+      <w:bookmarkEnd w:id="213"/>
+      <w:bookmarkEnd w:id="214"/>
+      <w:bookmarkEnd w:id="215"/>
+    </w:p>
+    <w:p>
+      <w:pPr>
+        <w:pStyle w:val="Title3rd1"/>
+        <w:ind w:hanging="0" w:start="0"/>
+        <w:rPr>
+          <w:rFonts w:eastAsia="Times New Roman" w:cs="Times New Roman"/>
+          <w:lang w:val="uk-UA"/>
+        </w:rPr>
+      </w:pPr>
+      <w:bookmarkStart w:id="216" w:name="__RefHeading___Toc2469_792400555"/>
+      <w:bookmarkStart w:id="217" w:name="_Toc27737"/>
+      <w:bookmarkStart w:id="218" w:name="_Toc196826553"/>
+      <w:bookmarkStart w:id="219" w:name="_Зміст000120"/>
+      <w:bookmarkStart w:id="220" w:name="_Зміст000060"/>
+      <w:bookmarkStart w:id="221" w:name="_Зміст000025"/>
+      <w:bookmarkEnd w:id="216"/>
+      <w:r>
+        <w:rPr>
+          <w:rFonts w:eastAsia="Times New Roman" w:cs="Times New Roman"/>
+          <w:lang w:val="uk-UA"/>
+        </w:rPr>
+        <w:t>А.6.1 Стадії розробки</w:t>
+      </w:r>
+      <w:bookmarkEnd w:id="217"/>
+      <w:bookmarkEnd w:id="218"/>
+      <w:bookmarkEnd w:id="219"/>
+      <w:bookmarkEnd w:id="220"/>
+      <w:bookmarkEnd w:id="221"/>
+    </w:p>
+    <w:p>
+      <w:pPr>
+        <w:pStyle w:val="Common"/>
+        <w:rPr>
+          <w:rFonts w:eastAsia="Times New Roman" w:cs="Times New Roman"/>
+          <w:lang w:val="uk-UA"/>
+        </w:rPr>
+      </w:pPr>
+      <w:r>
+        <w:rPr>
+          <w:rFonts w:eastAsia="Times New Roman" w:cs="Times New Roman"/>
+          <w:lang w:val="uk-UA"/>
+        </w:rPr>
+      </w:r>
+    </w:p>
+    <w:p>
+      <w:pPr>
+        <w:pStyle w:val="Common"/>
+        <w:rPr>
+          <w:rFonts w:eastAsia="Times New Roman" w:cs="Times New Roman"/>
+          <w:lang w:val="uk-UA"/>
+        </w:rPr>
+      </w:pPr>
+      <w:r>
+        <w:rPr>
+          <w:rFonts w:eastAsia="Times New Roman" w:cs="Times New Roman"/>
+          <w:lang w:val="uk-UA"/>
+        </w:rPr>
+        <w:t>Стадії розробки:</w:t>
+      </w:r>
+    </w:p>
+    <w:p>
+      <w:pPr>
+        <w:pStyle w:val="Common"/>
+        <w:rPr>
+          <w:rFonts w:eastAsia="Times New Roman" w:cs="Times New Roman"/>
+          <w:lang w:val="uk-UA"/>
+        </w:rPr>
+      </w:pPr>
+      <w:r>
+        <w:rPr>
+          <w:rFonts w:eastAsia="Times New Roman" w:cs="Times New Roman"/>
+          <w:lang w:val="uk-UA"/>
+        </w:rPr>
       </w:r>
     </w:p>
     <w:p>
@@ -10887,339 +11790,7 @@
           <w:rFonts w:eastAsia="Times New Roman" w:cs="Times New Roman"/>
           <w:lang w:val="uk-UA"/>
         </w:rPr>
-        <w:t>Використання шифру Віженера.</w:t>
-      </w:r>
-    </w:p>
-    <w:p>
-      <w:pPr>
-        <w:pStyle w:val="Common"/>
-        <w:rPr>
-          <w:rFonts w:eastAsia="Times New Roman" w:cs="Times New Roman"/>
-          <w:lang w:val="en-US"/>
-        </w:rPr>
-      </w:pPr>
-      <w:r>
-        <w:rPr>
-          <w:rFonts w:eastAsia="Times New Roman" w:cs="Times New Roman"/>
-          <w:lang w:val="en-US"/>
-        </w:rPr>
-      </w:r>
-    </w:p>
-    <w:p>
-      <w:pPr>
-        <w:pStyle w:val="Title3rd1"/>
-        <w:rPr>
-          <w:rFonts w:eastAsia="Times New Roman" w:cs="Times New Roman"/>
-          <w:lang w:val="en-US"/>
-        </w:rPr>
-      </w:pPr>
-      <w:bookmarkStart w:id="189" w:name="__RefHeading___Toc2459_792400555"/>
-      <w:bookmarkStart w:id="190" w:name="_Зміст000115"/>
-      <w:bookmarkStart w:id="191" w:name="_Toc196826548"/>
-      <w:bookmarkStart w:id="192" w:name="_Зміст000057"/>
-      <w:bookmarkStart w:id="193" w:name="_Зміст000022"/>
-      <w:bookmarkStart w:id="194" w:name="_Toc8988"/>
-      <w:bookmarkEnd w:id="189"/>
-      <w:r>
-        <w:rPr>
-          <w:rFonts w:eastAsia="Times New Roman" w:cs="Times New Roman"/>
-          <w:lang w:val="uk-UA"/>
-        </w:rPr>
-        <w:t>А.4.1 Вимоги до функціональних характеристик</w:t>
-      </w:r>
-      <w:bookmarkEnd w:id="190"/>
-      <w:bookmarkEnd w:id="191"/>
-      <w:bookmarkEnd w:id="192"/>
-      <w:bookmarkEnd w:id="193"/>
-      <w:bookmarkEnd w:id="194"/>
-    </w:p>
-    <w:p>
-      <w:pPr>
-        <w:pStyle w:val="Common"/>
-        <w:rPr>
-          <w:rFonts w:eastAsia="Times New Roman" w:cs="Times New Roman"/>
-          <w:lang w:val="en-US"/>
-        </w:rPr>
-      </w:pPr>
-      <w:r>
-        <w:rPr>
-          <w:rFonts w:eastAsia="Times New Roman" w:cs="Times New Roman"/>
-          <w:lang w:val="en-US"/>
-        </w:rPr>
-      </w:r>
-    </w:p>
-    <w:p>
-      <w:pPr>
-        <w:pStyle w:val="Common"/>
-        <w:rPr>
-          <w:rFonts w:eastAsia="Times New Roman" w:cs="Times New Roman"/>
-          <w:lang w:val="uk-UA"/>
-        </w:rPr>
-      </w:pPr>
-      <w:r>
-        <w:rPr>
-          <w:rFonts w:eastAsia="Times New Roman" w:cs="Times New Roman"/>
-          <w:lang w:val="uk-UA"/>
-        </w:rPr>
-        <w:t>Програма має виконувати такі мінімальні функції:</w:t>
-      </w:r>
-    </w:p>
-    <w:p>
-      <w:pPr>
-        <w:pStyle w:val="Common"/>
-        <w:rPr>
-          <w:rFonts w:eastAsia="Times New Roman" w:cs="Times New Roman"/>
-          <w:lang w:val="uk-UA"/>
-        </w:rPr>
-      </w:pPr>
-      <w:r>
-        <w:rPr>
-          <w:rFonts w:eastAsia="Times New Roman" w:cs="Times New Roman"/>
-          <w:lang w:val="uk-UA"/>
-        </w:rPr>
-      </w:r>
-    </w:p>
-    <w:p>
-      <w:pPr>
-        <w:pStyle w:val="Common"/>
-        <w:rPr>
-          <w:rFonts w:eastAsia="Times New Roman" w:cs="Times New Roman"/>
-          <w:lang w:val="uk-UA"/>
-        </w:rPr>
-      </w:pPr>
-      <w:r>
-        <w:rPr>
-          <w:rFonts w:eastAsia="Times New Roman" w:cs="Times New Roman"/>
-          <w:lang w:val="uk-UA"/>
-        </w:rPr>
-        <w:t>- Введення тексту для шифрування;</w:t>
-      </w:r>
-    </w:p>
-    <w:p>
-      <w:pPr>
-        <w:pStyle w:val="Common"/>
-        <w:rPr>
-          <w:rFonts w:eastAsia="Times New Roman" w:cs="Times New Roman"/>
-          <w:lang w:val="uk-UA"/>
-        </w:rPr>
-      </w:pPr>
-      <w:r>
-        <w:rPr>
-          <w:rFonts w:eastAsia="Times New Roman" w:cs="Times New Roman"/>
-          <w:lang w:val="uk-UA"/>
-        </w:rPr>
-        <w:t>- Введення ключу шифрування;</w:t>
-      </w:r>
-    </w:p>
-    <w:p>
-      <w:pPr>
-        <w:pStyle w:val="Common"/>
-        <w:rPr>
-          <w:rFonts w:eastAsia="Times New Roman" w:cs="Times New Roman"/>
-          <w:lang w:val="uk-UA"/>
-        </w:rPr>
-      </w:pPr>
-      <w:r>
-        <w:rPr>
-          <w:rFonts w:eastAsia="Times New Roman" w:cs="Times New Roman"/>
-          <w:lang w:val="uk-UA"/>
-        </w:rPr>
-        <w:t>- Виведення результатів користувачеві.</w:t>
-      </w:r>
-    </w:p>
-    <w:p>
-      <w:pPr>
-        <w:pStyle w:val="Common"/>
-        <w:rPr>
-          <w:rFonts w:eastAsia="Times New Roman" w:cs="Times New Roman"/>
-          <w:lang w:val="en-US"/>
-        </w:rPr>
-      </w:pPr>
-      <w:r>
-        <w:rPr>
-          <w:rFonts w:eastAsia="Times New Roman" w:cs="Times New Roman"/>
-          <w:lang w:val="en-US"/>
-        </w:rPr>
-      </w:r>
-    </w:p>
-    <w:p>
-      <w:pPr>
-        <w:pStyle w:val="Title3rd1"/>
-        <w:rPr>
-          <w:rFonts w:eastAsia="Times New Roman" w:cs="Times New Roman"/>
-          <w:lang w:val="en-US"/>
-        </w:rPr>
-      </w:pPr>
-      <w:bookmarkStart w:id="195" w:name="__RefHeading___Toc2461_792400555"/>
-      <w:bookmarkStart w:id="196" w:name="_Зміст000116"/>
-      <w:bookmarkStart w:id="197" w:name="_Зміст000058"/>
-      <w:bookmarkStart w:id="198" w:name="_Toc21715"/>
-      <w:bookmarkStart w:id="199" w:name="_Toc196826549"/>
-      <w:bookmarkStart w:id="200" w:name="_Зміст000023"/>
-      <w:bookmarkEnd w:id="195"/>
-      <w:r>
-        <w:rPr>
-          <w:rFonts w:eastAsia="Times New Roman" w:cs="Times New Roman"/>
-          <w:lang w:val="uk-UA"/>
-        </w:rPr>
-        <w:t>А.4.2 Вимоги до надійності</w:t>
-      </w:r>
-      <w:bookmarkEnd w:id="196"/>
-      <w:bookmarkEnd w:id="197"/>
-      <w:bookmarkEnd w:id="198"/>
-      <w:bookmarkEnd w:id="199"/>
-      <w:bookmarkEnd w:id="200"/>
-    </w:p>
-    <w:p>
-      <w:pPr>
-        <w:pStyle w:val="Common"/>
-        <w:rPr>
-          <w:rFonts w:eastAsia="Times New Roman" w:cs="Times New Roman"/>
-          <w:lang w:val="en-US"/>
-        </w:rPr>
-      </w:pPr>
-      <w:r>
-        <w:rPr>
-          <w:rFonts w:eastAsia="Times New Roman" w:cs="Times New Roman"/>
-          <w:lang w:val="en-US"/>
-        </w:rPr>
-      </w:r>
-    </w:p>
-    <w:p>
-      <w:pPr>
-        <w:pStyle w:val="Common"/>
-        <w:rPr>
-          <w:rFonts w:eastAsia="Times New Roman" w:cs="Times New Roman"/>
-          <w:lang w:val="uk-UA"/>
-        </w:rPr>
-      </w:pPr>
-      <w:r>
-        <w:rPr>
-          <w:rFonts w:eastAsia="Times New Roman" w:cs="Times New Roman"/>
-          <w:lang w:val="uk-UA"/>
-        </w:rPr>
-        <w:t>Програма має містити обробники виключних ситуацій аби не допустити непланового завершення роботи.</w:t>
-      </w:r>
-    </w:p>
-    <w:p>
-      <w:pPr>
-        <w:pStyle w:val="Common"/>
-        <w:rPr>
-          <w:rFonts w:eastAsia="Times New Roman" w:cs="Times New Roman"/>
-          <w:lang w:val="uk-UA"/>
-        </w:rPr>
-      </w:pPr>
-      <w:r>
-        <w:rPr>
-          <w:rFonts w:eastAsia="Times New Roman" w:cs="Times New Roman"/>
-          <w:lang w:val="uk-UA"/>
-        </w:rPr>
-        <w:t>Для надійності даних вони можуть зберігатися у буфері обміну.</w:t>
-      </w:r>
-    </w:p>
-    <w:p>
-      <w:pPr>
-        <w:pStyle w:val="Common"/>
-        <w:rPr>
-          <w:rFonts w:eastAsia="Times New Roman" w:cs="Times New Roman"/>
-          <w:lang w:val="en-US"/>
-        </w:rPr>
-      </w:pPr>
-      <w:r>
-        <w:rPr>
-          <w:rFonts w:eastAsia="Times New Roman" w:cs="Times New Roman"/>
-          <w:lang w:val="en-US"/>
-        </w:rPr>
-      </w:r>
-    </w:p>
-    <w:p>
-      <w:pPr>
-        <w:pStyle w:val="Title3rd1"/>
-        <w:rPr>
-          <w:rFonts w:eastAsia="Times New Roman" w:cs="Times New Roman"/>
-          <w:lang w:val="uk-UA"/>
-        </w:rPr>
-      </w:pPr>
-      <w:bookmarkStart w:id="201" w:name="__RefHeading___Toc2463_792400555"/>
-      <w:bookmarkStart w:id="202" w:name="_Toc196826550"/>
-      <w:bookmarkStart w:id="203" w:name="_Зміст000059"/>
-      <w:bookmarkStart w:id="204" w:name="_Toc8780"/>
-      <w:bookmarkStart w:id="205" w:name="_Зміст000024"/>
-      <w:bookmarkStart w:id="206" w:name="_Зміст000117"/>
-      <w:bookmarkEnd w:id="201"/>
-      <w:r>
-        <w:rPr>
-          <w:rFonts w:eastAsia="Times New Roman" w:cs="Times New Roman"/>
-          <w:lang w:val="uk-UA"/>
-        </w:rPr>
-        <w:t>А.4.3 Вимоги до технічних та програмних засобів</w:t>
-      </w:r>
-      <w:bookmarkEnd w:id="202"/>
-      <w:bookmarkEnd w:id="203"/>
-      <w:bookmarkEnd w:id="204"/>
-      <w:bookmarkEnd w:id="205"/>
-      <w:bookmarkEnd w:id="206"/>
-    </w:p>
-    <w:p>
-      <w:pPr>
-        <w:pStyle w:val="Common"/>
-        <w:rPr>
-          <w:rFonts w:eastAsia="Times New Roman" w:cs="Times New Roman"/>
-          <w:lang w:val="uk-UA"/>
-        </w:rPr>
-      </w:pPr>
-      <w:r>
-        <w:rPr>
-          <w:rFonts w:eastAsia="Times New Roman" w:cs="Times New Roman"/>
-          <w:lang w:val="uk-UA"/>
-        </w:rPr>
-      </w:r>
-    </w:p>
-    <w:p>
-      <w:pPr>
-        <w:pStyle w:val="Common"/>
-        <w:rPr>
-          <w:rFonts w:eastAsia="Times New Roman" w:cs="Times New Roman"/>
-          <w:lang w:val="uk-UA"/>
-        </w:rPr>
-      </w:pPr>
-      <w:r>
-        <w:rPr>
-          <w:rFonts w:eastAsia="Times New Roman" w:cs="Times New Roman"/>
-          <w:lang w:val="uk-UA"/>
-        </w:rPr>
-        <w:t>Програма має запускатися у браузері і бути доступною як на мобільних, так і на домашніх комп’ютерах.</w:t>
-      </w:r>
-    </w:p>
-    <w:p>
-      <w:pPr>
-        <w:pStyle w:val="Common"/>
-        <w:rPr>
-          <w:rFonts w:eastAsia="Times New Roman" w:cs="Times New Roman"/>
-          <w:lang w:val="uk-UA"/>
-        </w:rPr>
-      </w:pPr>
-      <w:r>
-        <w:rPr>
-          <w:rFonts w:eastAsia="Times New Roman" w:cs="Times New Roman"/>
-          <w:lang w:val="uk-UA"/>
-        </w:rPr>
-        <w:t>Мінімальні вимоги до клієнтської частини:</w:t>
-      </w:r>
-    </w:p>
-    <w:p>
-      <w:pPr>
-        <w:pStyle w:val="Common"/>
-        <w:rPr>
-          <w:rFonts w:eastAsia="Times New Roman" w:cs="Times New Roman"/>
-          <w:lang w:val="uk-UA"/>
-        </w:rPr>
-      </w:pPr>
-      <w:r>
-        <w:rPr>
-          <w:rFonts w:eastAsia="Times New Roman" w:cs="Times New Roman"/>
-          <w:lang w:val="uk-UA"/>
-        </w:rPr>
+        <w:t>Розробка документації;</w:t>
       </w:r>
     </w:p>
     <w:p>
@@ -11240,28 +11811,7 @@
           <w:rFonts w:eastAsia="Times New Roman" w:cs="Times New Roman"/>
           <w:lang w:val="uk-UA"/>
         </w:rPr>
-        <w:t>Процесор: х6</w:t>
-      </w:r>
-      <w:r>
-        <w:rPr>
-          <w:rFonts w:eastAsia="Times New Roman" w:cs="Times New Roman"/>
-          <w:lang w:val="en-US"/>
-        </w:rPr>
-        <w:t>4</w:t>
-      </w:r>
-      <w:r>
-        <w:rPr>
-          <w:rFonts w:eastAsia="Times New Roman" w:cs="Times New Roman"/>
-          <w:lang w:val="uk-UA"/>
-        </w:rPr>
-        <w:t xml:space="preserve"> / х86 </w:t>
-      </w:r>
-      <w:r>
-        <w:rPr>
-          <w:rFonts w:eastAsia="Times New Roman" w:cs="Times New Roman"/>
-          <w:lang w:val="en-US"/>
-        </w:rPr>
-        <w:t>/ ARM;</w:t>
+        <w:t>Написання програми;</w:t>
       </w:r>
     </w:p>
     <w:p>
@@ -11282,208 +11832,7 @@
           <w:rFonts w:eastAsia="Times New Roman" w:cs="Times New Roman"/>
           <w:lang w:val="uk-UA"/>
         </w:rPr>
-        <w:t>Оперативна пам’ять: 512 МБ;</w:t>
-      </w:r>
-    </w:p>
-    <w:p>
-      <w:pPr>
-        <w:pStyle w:val="Common"/>
-        <w:numPr>
-          <w:ilvl w:val="0"/>
-          <w:numId w:val="5"/>
-        </w:numPr>
-        <w:ind w:hanging="360" w:start="1211"/>
-        <w:rPr>
-          <w:rFonts w:eastAsia="Times New Roman" w:cs="Times New Roman"/>
-          <w:lang w:val="uk-UA"/>
-        </w:rPr>
-      </w:pPr>
-      <w:r>
-        <w:rPr>
-          <w:rFonts w:eastAsia="Times New Roman" w:cs="Times New Roman"/>
-          <w:lang w:val="uk-UA"/>
-        </w:rPr>
-        <w:t>Накопичувач: 1 ГБ вільного місця;</w:t>
-      </w:r>
-    </w:p>
-    <w:p>
-      <w:pPr>
-        <w:pStyle w:val="Common"/>
-        <w:numPr>
-          <w:ilvl w:val="0"/>
-          <w:numId w:val="5"/>
-        </w:numPr>
-        <w:ind w:hanging="360" w:start="1211"/>
-        <w:rPr>
-          <w:rFonts w:eastAsia="Times New Roman" w:cs="Times New Roman"/>
-          <w:lang w:val="uk-UA"/>
-        </w:rPr>
-      </w:pPr>
-      <w:r>
-        <w:rPr>
-          <w:rFonts w:eastAsia="Times New Roman" w:cs="Times New Roman"/>
-          <w:lang w:val="uk-UA"/>
-        </w:rPr>
-        <w:t>Операційна система:</w:t>
-      </w:r>
-      <w:r>
-        <w:rPr>
-          <w:rFonts w:eastAsia="Times New Roman" w:cs="Times New Roman"/>
-          <w:lang w:val="en-US"/>
-        </w:rPr>
-        <w:t xml:space="preserve"> Android, iOS, macOS, Linux, Windows. </w:t>
-      </w:r>
-    </w:p>
-    <w:p>
-      <w:pPr>
-        <w:pStyle w:val="Common"/>
-        <w:ind w:hanging="0"/>
-        <w:rPr>
-          <w:rFonts w:eastAsia="Times New Roman" w:cs="Times New Roman"/>
-          <w:lang w:val="uk-UA"/>
-        </w:rPr>
-      </w:pPr>
-      <w:r>
-        <w:rPr>
-          <w:rFonts w:eastAsia="Times New Roman" w:cs="Times New Roman"/>
-          <w:lang w:val="uk-UA"/>
-        </w:rPr>
-      </w:r>
-    </w:p>
-    <w:p>
-      <w:pPr>
-        <w:pStyle w:val="Common"/>
-        <w:rPr>
-          <w:rFonts w:eastAsia="Times New Roman" w:cs="Times New Roman"/>
-          <w:lang w:val="uk-UA"/>
-        </w:rPr>
-      </w:pPr>
-      <w:r>
-        <w:rPr>
-          <w:rFonts w:eastAsia="Times New Roman" w:cs="Times New Roman"/>
-          <w:lang w:val="uk-UA"/>
-        </w:rPr>
-        <w:t>Програмні засоби можуть змінюватись в ході розробки, але заплановано використати такі:</w:t>
-      </w:r>
-    </w:p>
-    <w:p>
-      <w:pPr>
-        <w:pStyle w:val="Common"/>
-        <w:rPr>
-          <w:rFonts w:eastAsia="Times New Roman" w:cs="Times New Roman"/>
-          <w:lang w:val="uk-UA"/>
-        </w:rPr>
-      </w:pPr>
-      <w:r>
-        <w:rPr>
-          <w:rFonts w:eastAsia="Times New Roman" w:cs="Times New Roman"/>
-          <w:lang w:val="uk-UA"/>
-        </w:rPr>
-      </w:r>
-    </w:p>
-    <w:p>
-      <w:pPr>
-        <w:pStyle w:val="Common"/>
-        <w:rPr>
-          <w:rFonts w:eastAsia="Times New Roman" w:cs="Times New Roman"/>
-          <w:lang w:val="en-US"/>
-        </w:rPr>
-      </w:pPr>
-      <w:r>
-        <w:rPr>
-          <w:rFonts w:eastAsia="Times New Roman" w:cs="Times New Roman"/>
-          <w:lang w:val="en-US"/>
-        </w:rPr>
-        <w:t>- Flask (</w:t>
-      </w:r>
-      <w:r>
-        <w:rPr>
-          <w:rFonts w:eastAsia="Times New Roman" w:cs="Times New Roman"/>
-          <w:lang w:val="uk-UA"/>
-        </w:rPr>
-        <w:t xml:space="preserve">бекенд фреймворк для </w:t>
-      </w:r>
-      <w:r>
-        <w:rPr>
-          <w:rFonts w:eastAsia="Times New Roman" w:cs="Times New Roman"/>
-          <w:lang w:val="en-US"/>
-        </w:rPr>
-        <w:t>Python);</w:t>
-      </w:r>
-    </w:p>
-    <w:p>
-      <w:pPr>
-        <w:pStyle w:val="Common"/>
-        <w:rPr>
-          <w:rFonts w:eastAsia="Times New Roman" w:cs="Times New Roman"/>
-          <w:lang w:val="en-US"/>
-        </w:rPr>
-      </w:pPr>
-      <w:r>
-        <w:rPr>
-          <w:rFonts w:eastAsia="Times New Roman" w:cs="Times New Roman"/>
-          <w:lang w:val="en-US"/>
-        </w:rPr>
-        <w:t>- TailwindCSS (</w:t>
-      </w:r>
-      <w:r>
-        <w:rPr>
-          <w:rFonts w:eastAsia="Times New Roman" w:cs="Times New Roman"/>
-          <w:lang w:val="uk-UA"/>
-        </w:rPr>
-        <w:t xml:space="preserve">класовий фреймворк </w:t>
-      </w:r>
-      <w:r>
-        <w:rPr>
-          <w:rFonts w:eastAsia="Times New Roman" w:cs="Times New Roman"/>
-          <w:lang w:val="en-US"/>
-        </w:rPr>
-        <w:t>CSS).</w:t>
-      </w:r>
-    </w:p>
-    <w:p>
-      <w:pPr>
-        <w:pStyle w:val="Common"/>
-        <w:rPr>
-          <w:rFonts w:eastAsia="Times New Roman" w:cs="Times New Roman"/>
-          <w:lang w:val="uk-UA"/>
-        </w:rPr>
-      </w:pPr>
-      <w:r>
-        <w:rPr>
-          <w:rFonts w:eastAsia="Times New Roman" w:cs="Times New Roman"/>
-          <w:lang w:val="uk-UA"/>
-        </w:rPr>
-      </w:r>
-    </w:p>
-    <w:p>
-      <w:pPr>
-        <w:pStyle w:val="Common"/>
-        <w:rPr>
-          <w:rFonts w:eastAsia="Times New Roman" w:cs="Times New Roman"/>
-          <w:lang w:val="uk-UA"/>
-        </w:rPr>
-      </w:pPr>
-      <w:r>
-        <w:rPr>
-          <w:rFonts w:eastAsia="Times New Roman" w:cs="Times New Roman"/>
-          <w:lang w:val="uk-UA"/>
-        </w:rPr>
-        <w:t xml:space="preserve">Для користувацького інтерфейсу програма має використовувати фреймворк </w:t>
-      </w:r>
-      <w:r>
-        <w:rPr>
-          <w:rFonts w:eastAsia="Times New Roman" w:cs="Times New Roman"/>
-          <w:lang w:val="en-US"/>
-        </w:rPr>
-        <w:t xml:space="preserve">Next.js. TailwindCSS </w:t>
-      </w:r>
-      <w:r>
-        <w:rPr>
-          <w:rFonts w:eastAsia="Times New Roman" w:cs="Times New Roman"/>
-          <w:lang w:val="uk-UA"/>
-        </w:rPr>
-        <w:t>має бути використаний для стилізації.</w:t>
+        <w:t>Розробка презентації.</w:t>
       </w:r>
     </w:p>
     <w:p>
@@ -11504,311 +11853,68 @@
     <w:p>
       <w:pPr>
         <w:pStyle w:val="Title3rd1"/>
-        <w:rPr/>
-      </w:pPr>
-      <w:bookmarkStart w:id="207" w:name="__RefHeading___Toc2647_2362981076"/>
-      <w:bookmarkEnd w:id="207"/>
-      <w:r>
-        <w:rPr/>
-        <w:t>А.4.4 Вимоги до вхідних даних</w:t>
-      </w:r>
-    </w:p>
-    <w:p>
-      <w:pPr>
-        <w:pStyle w:val="Common"/>
-        <w:rPr>
-          <w:rFonts w:eastAsia="Times New Roman" w:cs="Times New Roman"/>
-          <w:lang w:val="uk-UA"/>
-        </w:rPr>
-      </w:pPr>
-      <w:r>
-        <w:rPr>
-          <w:rFonts w:eastAsia="Times New Roman" w:cs="Times New Roman"/>
-          <w:lang w:val="uk-UA"/>
-        </w:rPr>
-      </w:r>
-    </w:p>
-    <w:p>
-      <w:pPr>
-        <w:pStyle w:val="Common"/>
-        <w:rPr>
-          <w:rFonts w:eastAsia="Times New Roman" w:cs="Times New Roman"/>
-          <w:lang w:val="uk-UA"/>
-        </w:rPr>
-      </w:pPr>
-      <w:r>
-        <w:rPr>
-          <w:rFonts w:eastAsia="Times New Roman" w:cs="Times New Roman"/>
-          <w:lang w:val="uk-UA"/>
-        </w:rPr>
-        <w:t xml:space="preserve">Вимогами до ключа та введеного тексту є підтримка повної таблиці </w:t>
-      </w:r>
-      <w:r>
-        <w:rPr>
-          <w:rFonts w:eastAsia="Times New Roman" w:cs="Times New Roman"/>
-          <w:lang w:val="en-US"/>
-        </w:rPr>
-        <w:t xml:space="preserve">ASCII, </w:t>
-      </w:r>
-      <w:r>
-        <w:rPr>
-          <w:rFonts w:eastAsia="Times New Roman" w:cs="Times New Roman"/>
-          <w:lang w:val="uk-UA"/>
-        </w:rPr>
-        <w:t>а не лише літер алфавіту.</w:t>
-      </w:r>
-    </w:p>
-    <w:p>
-      <w:pPr>
-        <w:pStyle w:val="Common"/>
-        <w:rPr>
-          <w:rFonts w:eastAsia="Times New Roman" w:cs="Times New Roman"/>
-          <w:lang w:val="uk-UA"/>
-        </w:rPr>
-      </w:pPr>
-      <w:r>
-        <w:rPr>
-          <w:rFonts w:eastAsia="Times New Roman" w:cs="Times New Roman"/>
-          <w:lang w:val="uk-UA"/>
-        </w:rPr>
-      </w:r>
-    </w:p>
-    <w:p>
-      <w:pPr>
-        <w:pStyle w:val="Title2nd1"/>
-        <w:rPr>
-          <w:rFonts w:eastAsia="Times New Roman" w:cs="Times New Roman"/>
-        </w:rPr>
-      </w:pPr>
-      <w:bookmarkStart w:id="208" w:name="__RefHeading___Toc2465_792400555"/>
-      <w:bookmarkStart w:id="209" w:name="_Зміст000118"/>
-      <w:bookmarkStart w:id="210" w:name="_Toc19314"/>
-      <w:bookmarkStart w:id="211" w:name="_Toc196826551"/>
-      <w:bookmarkEnd w:id="208"/>
-      <w:r>
-        <w:rPr>
-          <w:rFonts w:eastAsia="Times New Roman" w:cs="Times New Roman"/>
-        </w:rPr>
-        <w:t>А.5 Вимоги до програмної документації</w:t>
-      </w:r>
-      <w:bookmarkEnd w:id="209"/>
-      <w:bookmarkEnd w:id="210"/>
-      <w:bookmarkEnd w:id="211"/>
-    </w:p>
-    <w:p>
-      <w:pPr>
-        <w:pStyle w:val="Common"/>
-        <w:rPr>
-          <w:rFonts w:eastAsia="Times New Roman" w:cs="Times New Roman"/>
-          <w:lang w:val="uk-UA"/>
-        </w:rPr>
-      </w:pPr>
-      <w:r>
-        <w:rPr>
-          <w:rFonts w:eastAsia="Times New Roman" w:cs="Times New Roman"/>
-          <w:lang w:val="uk-UA"/>
-        </w:rPr>
-      </w:r>
-    </w:p>
-    <w:p>
-      <w:pPr>
-        <w:pStyle w:val="Common"/>
-        <w:rPr>
-          <w:rFonts w:eastAsia="Times New Roman" w:cs="Times New Roman"/>
-          <w:lang w:val="uk-UA"/>
-        </w:rPr>
-      </w:pPr>
-      <w:r>
-        <w:rPr>
-          <w:rFonts w:eastAsia="Times New Roman" w:cs="Times New Roman"/>
-          <w:lang w:val="uk-UA"/>
-        </w:rPr>
-        <w:t>Програмна документація має бути реалізована у:</w:t>
-      </w:r>
-    </w:p>
-    <w:p>
-      <w:pPr>
-        <w:pStyle w:val="Common"/>
-        <w:rPr>
-          <w:rFonts w:eastAsia="Times New Roman" w:cs="Times New Roman"/>
-          <w:lang w:val="uk-UA"/>
-        </w:rPr>
-      </w:pPr>
-      <w:r>
-        <w:rPr>
-          <w:rFonts w:eastAsia="Times New Roman" w:cs="Times New Roman"/>
-          <w:lang w:val="uk-UA"/>
-        </w:rPr>
-      </w:r>
-    </w:p>
-    <w:p>
-      <w:pPr>
-        <w:pStyle w:val="Common"/>
-        <w:numPr>
-          <w:ilvl w:val="0"/>
-          <w:numId w:val="5"/>
-        </w:numPr>
-        <w:ind w:hanging="360" w:start="1211"/>
-        <w:rPr>
-          <w:rFonts w:eastAsia="Times New Roman" w:cs="Times New Roman"/>
-          <w:lang w:val="uk-UA"/>
-        </w:rPr>
-      </w:pPr>
-      <w:r>
-        <w:rPr>
-          <w:rFonts w:eastAsia="Times New Roman" w:cs="Times New Roman"/>
-          <w:lang w:val="uk-UA"/>
-        </w:rPr>
-        <w:t>Пояснювальній записці;</w:t>
-      </w:r>
-    </w:p>
-    <w:p>
-      <w:pPr>
-        <w:pStyle w:val="Common"/>
-        <w:numPr>
-          <w:ilvl w:val="0"/>
-          <w:numId w:val="5"/>
-        </w:numPr>
-        <w:ind w:hanging="360" w:start="1211"/>
-        <w:rPr>
-          <w:rFonts w:eastAsia="Times New Roman" w:cs="Times New Roman"/>
-          <w:lang w:val="uk-UA"/>
-        </w:rPr>
-      </w:pPr>
-      <w:r>
-        <w:rPr>
-          <w:rFonts w:eastAsia="Times New Roman" w:cs="Times New Roman"/>
-          <w:lang w:val="uk-UA"/>
-        </w:rPr>
-        <w:t>Технічному завданні.</w:t>
-      </w:r>
-    </w:p>
-    <w:p>
-      <w:pPr>
-        <w:pStyle w:val="Common"/>
-        <w:ind w:hanging="360" w:start="1211"/>
-        <w:rPr>
-          <w:rFonts w:eastAsia="Times New Roman" w:cs="Times New Roman"/>
-          <w:lang w:val="uk-UA"/>
-        </w:rPr>
-      </w:pPr>
-      <w:r>
-        <w:rPr>
-          <w:rFonts w:eastAsia="Times New Roman" w:cs="Times New Roman"/>
-          <w:lang w:val="uk-UA"/>
-        </w:rPr>
-      </w:r>
-    </w:p>
-    <w:p>
-      <w:pPr>
-        <w:pStyle w:val="Common"/>
-        <w:rPr>
-          <w:rFonts w:eastAsia="Times New Roman" w:cs="Times New Roman"/>
-          <w:lang w:val="uk-UA"/>
-        </w:rPr>
-      </w:pPr>
-      <w:r>
-        <w:rPr>
-          <w:rFonts w:eastAsia="Times New Roman" w:cs="Times New Roman"/>
-          <w:lang w:val="uk-UA"/>
-        </w:rPr>
-        <w:t>Код програми має бути написаний зі зрозумілими назвами змінних/класів/методів і може включати коментарі.</w:t>
-      </w:r>
-    </w:p>
-    <w:p>
-      <w:pPr>
-        <w:pStyle w:val="Common"/>
-        <w:rPr>
-          <w:rFonts w:eastAsia="Times New Roman" w:cs="Times New Roman"/>
-          <w:lang w:val="uk-UA"/>
-        </w:rPr>
-      </w:pPr>
-      <w:r>
-        <w:rPr>
-          <w:rFonts w:eastAsia="Times New Roman" w:cs="Times New Roman"/>
-          <w:lang w:val="uk-UA"/>
-        </w:rPr>
-      </w:r>
-    </w:p>
-    <w:p>
-      <w:pPr>
-        <w:pStyle w:val="Title2nd1"/>
-        <w:rPr>
-          <w:rFonts w:eastAsia="Times New Roman" w:cs="Times New Roman"/>
-        </w:rPr>
-      </w:pPr>
-      <w:bookmarkStart w:id="212" w:name="__RefHeading___Toc2467_792400555"/>
-      <w:bookmarkStart w:id="213" w:name="_Toc196826552"/>
-      <w:bookmarkStart w:id="214" w:name="_Toc12028"/>
-      <w:bookmarkStart w:id="215" w:name="_Зміст000119"/>
-      <w:bookmarkEnd w:id="212"/>
-      <w:r>
-        <w:rPr>
-          <w:rFonts w:eastAsia="Times New Roman" w:cs="Times New Roman"/>
-        </w:rPr>
-        <w:t>А.6 Стадії і етапи розробки</w:t>
-      </w:r>
-      <w:bookmarkEnd w:id="213"/>
-      <w:bookmarkEnd w:id="214"/>
-      <w:bookmarkEnd w:id="215"/>
-    </w:p>
-    <w:p>
-      <w:pPr>
-        <w:pStyle w:val="Title3rd1"/>
-        <w:rPr>
-          <w:rFonts w:eastAsia="Times New Roman" w:cs="Times New Roman"/>
-          <w:lang w:val="uk-UA"/>
-        </w:rPr>
-      </w:pPr>
-      <w:bookmarkStart w:id="216" w:name="__RefHeading___Toc2469_792400555"/>
-      <w:bookmarkStart w:id="217" w:name="_Зміст000025"/>
-      <w:bookmarkStart w:id="218" w:name="_Зміст000060"/>
-      <w:bookmarkStart w:id="219" w:name="_Зміст000120"/>
-      <w:bookmarkStart w:id="220" w:name="_Toc196826553"/>
-      <w:bookmarkStart w:id="221" w:name="_Toc27737"/>
-      <w:bookmarkEnd w:id="216"/>
-      <w:r>
-        <w:rPr>
-          <w:rFonts w:eastAsia="Times New Roman" w:cs="Times New Roman"/>
-          <w:lang w:val="uk-UA"/>
-        </w:rPr>
-        <w:t>А.6.1 Стадії розробки</w:t>
-      </w:r>
-      <w:bookmarkEnd w:id="217"/>
-      <w:bookmarkEnd w:id="218"/>
-      <w:bookmarkEnd w:id="219"/>
-      <w:bookmarkEnd w:id="220"/>
-      <w:bookmarkEnd w:id="221"/>
-    </w:p>
-    <w:p>
-      <w:pPr>
-        <w:pStyle w:val="Common"/>
-        <w:rPr>
-          <w:rFonts w:eastAsia="Times New Roman" w:cs="Times New Roman"/>
-          <w:lang w:val="uk-UA"/>
-        </w:rPr>
-      </w:pPr>
-      <w:r>
-        <w:rPr>
-          <w:rFonts w:eastAsia="Times New Roman" w:cs="Times New Roman"/>
-          <w:lang w:val="uk-UA"/>
-        </w:rPr>
-      </w:r>
-    </w:p>
-    <w:p>
-      <w:pPr>
-        <w:pStyle w:val="Common"/>
-        <w:rPr>
-          <w:rFonts w:eastAsia="Times New Roman" w:cs="Times New Roman"/>
-          <w:lang w:val="uk-UA"/>
-        </w:rPr>
-      </w:pPr>
-      <w:r>
-        <w:rPr>
-          <w:rFonts w:eastAsia="Times New Roman" w:cs="Times New Roman"/>
-          <w:lang w:val="uk-UA"/>
-        </w:rPr>
-        <w:t>Стадії розробки:</w:t>
+        <w:ind w:hanging="0" w:start="0"/>
+        <w:rPr>
+          <w:rFonts w:eastAsia="Times New Roman" w:cs="Times New Roman"/>
+          <w:lang w:val="uk-UA"/>
+        </w:rPr>
+      </w:pPr>
+      <w:bookmarkStart w:id="222" w:name="__RefHeading___Toc2471_792400555"/>
+      <w:bookmarkStart w:id="223" w:name="_Зміст000061"/>
+      <w:bookmarkStart w:id="224" w:name="_Зміст000121"/>
+      <w:bookmarkStart w:id="225" w:name="_Зміст000026"/>
+      <w:bookmarkStart w:id="226" w:name="_Toc11650"/>
+      <w:bookmarkStart w:id="227" w:name="_Toc196826554"/>
+      <w:bookmarkEnd w:id="222"/>
+      <w:r>
+        <w:rPr>
+          <w:rFonts w:eastAsia="Times New Roman" w:cs="Times New Roman"/>
+          <w:lang w:val="uk-UA"/>
+        </w:rPr>
+        <w:t>А.6.2 Етапи розробки</w:t>
+      </w:r>
+      <w:bookmarkEnd w:id="226"/>
+      <w:bookmarkEnd w:id="227"/>
+      <w:r>
+        <w:rPr>
+          <w:rFonts w:eastAsia="Times New Roman" w:cs="Times New Roman"/>
+          <w:lang w:val="uk-UA"/>
+        </w:rPr>
+        <w:t xml:space="preserve"> </w:t>
+      </w:r>
+      <w:bookmarkEnd w:id="223"/>
+      <w:bookmarkEnd w:id="224"/>
+      <w:bookmarkEnd w:id="225"/>
+    </w:p>
+    <w:p>
+      <w:pPr>
+        <w:pStyle w:val="Common"/>
+        <w:rPr>
+          <w:rFonts w:eastAsia="Times New Roman" w:cs="Times New Roman"/>
+          <w:lang w:val="uk-UA"/>
+        </w:rPr>
+      </w:pPr>
+      <w:r>
+        <w:rPr>
+          <w:rFonts w:eastAsia="Times New Roman" w:cs="Times New Roman"/>
+          <w:lang w:val="uk-UA"/>
+        </w:rPr>
+      </w:r>
+    </w:p>
+    <w:p>
+      <w:pPr>
+        <w:pStyle w:val="Common"/>
+        <w:rPr>
+          <w:rFonts w:eastAsia="Times New Roman" w:cs="Times New Roman"/>
+          <w:lang w:val="uk-UA"/>
+        </w:rPr>
+      </w:pPr>
+      <w:r>
+        <w:rPr>
+          <w:rFonts w:eastAsia="Times New Roman" w:cs="Times New Roman"/>
+          <w:lang w:val="uk-UA"/>
+        </w:rPr>
+        <w:t>Етапи розробки:</w:t>
       </w:r>
     </w:p>
     <w:p>
@@ -11844,7 +11950,7 @@
           <w:rFonts w:eastAsia="Times New Roman" w:cs="Times New Roman"/>
           <w:lang w:val="uk-UA"/>
         </w:rPr>
-        <w:t>Розробка документації;</w:t>
+        <w:t>Вибір технічних засобів;</w:t>
       </w:r>
     </w:p>
     <w:p>
@@ -11865,7 +11971,7 @@
           <w:rFonts w:eastAsia="Times New Roman" w:cs="Times New Roman"/>
           <w:lang w:val="uk-UA"/>
         </w:rPr>
-        <w:t>Написання програми;</w:t>
+        <w:t>Ітеративне написання програми;</w:t>
       </w:r>
     </w:p>
     <w:p>
@@ -11886,7 +11992,28 @@
           <w:rFonts w:eastAsia="Times New Roman" w:cs="Times New Roman"/>
           <w:lang w:val="uk-UA"/>
         </w:rPr>
-        <w:t>Розробка презентації.</w:t>
+        <w:t>Тестування та перероблювання;</w:t>
+      </w:r>
+    </w:p>
+    <w:p>
+      <w:pPr>
+        <w:pStyle w:val="Common"/>
+        <w:numPr>
+          <w:ilvl w:val="0"/>
+          <w:numId w:val="6"/>
+        </w:numPr>
+        <w:ind w:hanging="360" w:start="1211"/>
+        <w:rPr>
+          <w:rFonts w:eastAsia="Times New Roman" w:cs="Times New Roman"/>
+          <w:lang w:val="uk-UA"/>
+        </w:rPr>
+      </w:pPr>
+      <w:r>
+        <w:rPr>
+          <w:rFonts w:eastAsia="Times New Roman" w:cs="Times New Roman"/>
+          <w:lang w:val="uk-UA"/>
+        </w:rPr>
+        <w:t>Заповнення пояснювальної записки.</w:t>
       </w:r>
     </w:p>
     <w:p>
@@ -11907,67 +12034,61 @@
     <w:p>
       <w:pPr>
         <w:pStyle w:val="Title3rd1"/>
-        <w:rPr>
-          <w:rFonts w:eastAsia="Times New Roman" w:cs="Times New Roman"/>
-          <w:lang w:val="uk-UA"/>
-        </w:rPr>
-      </w:pPr>
-      <w:bookmarkStart w:id="222" w:name="__RefHeading___Toc2471_792400555"/>
-      <w:bookmarkStart w:id="223" w:name="_Зміст000026"/>
-      <w:bookmarkStart w:id="224" w:name="_Зміст000121"/>
-      <w:bookmarkStart w:id="225" w:name="_Зміст000061"/>
-      <w:bookmarkStart w:id="226" w:name="_Toc196826554"/>
-      <w:bookmarkStart w:id="227" w:name="_Toc11650"/>
-      <w:bookmarkEnd w:id="222"/>
-      <w:r>
-        <w:rPr>
-          <w:rFonts w:eastAsia="Times New Roman" w:cs="Times New Roman"/>
-          <w:lang w:val="uk-UA"/>
-        </w:rPr>
-        <w:t>А.6.2 Етапи розробки</w:t>
-      </w:r>
-      <w:bookmarkEnd w:id="226"/>
-      <w:bookmarkEnd w:id="227"/>
-      <w:r>
-        <w:rPr>
-          <w:rFonts w:eastAsia="Times New Roman" w:cs="Times New Roman"/>
-          <w:lang w:val="uk-UA"/>
-        </w:rPr>
-        <w:t xml:space="preserve"> </w:t>
-      </w:r>
-      <w:bookmarkEnd w:id="223"/>
-      <w:bookmarkEnd w:id="224"/>
-      <w:bookmarkEnd w:id="225"/>
-    </w:p>
-    <w:p>
-      <w:pPr>
-        <w:pStyle w:val="Common"/>
-        <w:rPr>
-          <w:rFonts w:eastAsia="Times New Roman" w:cs="Times New Roman"/>
-          <w:lang w:val="uk-UA"/>
-        </w:rPr>
-      </w:pPr>
-      <w:r>
-        <w:rPr>
-          <w:rFonts w:eastAsia="Times New Roman" w:cs="Times New Roman"/>
-          <w:lang w:val="uk-UA"/>
-        </w:rPr>
-      </w:r>
-    </w:p>
-    <w:p>
-      <w:pPr>
-        <w:pStyle w:val="Common"/>
-        <w:rPr>
-          <w:rFonts w:eastAsia="Times New Roman" w:cs="Times New Roman"/>
-          <w:lang w:val="uk-UA"/>
-        </w:rPr>
-      </w:pPr>
-      <w:r>
-        <w:rPr>
-          <w:rFonts w:eastAsia="Times New Roman" w:cs="Times New Roman"/>
-          <w:lang w:val="uk-UA"/>
-        </w:rPr>
-        <w:t>Етапи розробки:</w:t>
+        <w:ind w:hanging="0" w:start="0"/>
+        <w:rPr>
+          <w:rFonts w:eastAsia="Times New Roman" w:cs="Times New Roman"/>
+          <w:lang w:val="uk-UA"/>
+        </w:rPr>
+      </w:pPr>
+      <w:bookmarkStart w:id="228" w:name="__RefHeading___Toc2473_792400555"/>
+      <w:bookmarkStart w:id="229" w:name="_Toc196826555"/>
+      <w:bookmarkStart w:id="230" w:name="_Зміст000027"/>
+      <w:bookmarkStart w:id="231" w:name="_Зміст000122"/>
+      <w:bookmarkStart w:id="232" w:name="_Зміст000062"/>
+      <w:bookmarkStart w:id="233" w:name="_Toc10935"/>
+      <w:bookmarkEnd w:id="228"/>
+      <w:r>
+        <w:rPr>
+          <w:rFonts w:eastAsia="Times New Roman" w:cs="Times New Roman"/>
+          <w:lang w:val="uk-UA"/>
+        </w:rPr>
+        <w:t>А.6.3 Зміст робіт по етапах</w:t>
+      </w:r>
+      <w:bookmarkEnd w:id="229"/>
+      <w:bookmarkEnd w:id="230"/>
+      <w:bookmarkEnd w:id="231"/>
+      <w:bookmarkEnd w:id="232"/>
+      <w:bookmarkEnd w:id="233"/>
+    </w:p>
+    <w:p>
+      <w:pPr>
+        <w:pStyle w:val="Common"/>
+        <w:rPr>
+          <w:rFonts w:eastAsia="Times New Roman" w:cs="Times New Roman"/>
+          <w:lang w:val="uk-UA"/>
+        </w:rPr>
+      </w:pPr>
+      <w:r>
+        <w:rPr>
+          <w:rFonts w:eastAsia="Times New Roman" w:cs="Times New Roman"/>
+          <w:lang w:val="uk-UA"/>
+        </w:rPr>
+      </w:r>
+    </w:p>
+    <w:p>
+      <w:pPr>
+        <w:pStyle w:val="Common"/>
+        <w:rPr>
+          <w:rFonts w:eastAsia="Times New Roman" w:cs="Times New Roman"/>
+          <w:lang w:val="uk-UA"/>
+        </w:rPr>
+      </w:pPr>
+      <w:r>
+        <w:rPr>
+          <w:rFonts w:eastAsia="Times New Roman" w:cs="Times New Roman"/>
+          <w:lang w:val="uk-UA"/>
+        </w:rPr>
+        <w:t>Зміст роботи може бути таким на кожному етапі:</w:t>
       </w:r>
     </w:p>
     <w:p>
@@ -12003,7 +12124,7 @@
           <w:rFonts w:eastAsia="Times New Roman" w:cs="Times New Roman"/>
           <w:lang w:val="uk-UA"/>
         </w:rPr>
-        <w:t>Вибір технічних засобів;</w:t>
+        <w:t>Початкова документація, тестові програми;</w:t>
       </w:r>
     </w:p>
     <w:p>
@@ -12024,7 +12145,7 @@
           <w:rFonts w:eastAsia="Times New Roman" w:cs="Times New Roman"/>
           <w:lang w:val="uk-UA"/>
         </w:rPr>
-        <w:t>Ітеративне написання програми;</w:t>
+        <w:t>Робоча програма, більш заповнена документація, підготовка до презентації;</w:t>
       </w:r>
     </w:p>
     <w:p>
@@ -12045,179 +12166,6 @@
           <w:rFonts w:eastAsia="Times New Roman" w:cs="Times New Roman"/>
           <w:lang w:val="uk-UA"/>
         </w:rPr>
-        <w:t>Тестування та перероблювання;</w:t>
-      </w:r>
-    </w:p>
-    <w:p>
-      <w:pPr>
-        <w:pStyle w:val="Common"/>
-        <w:numPr>
-          <w:ilvl w:val="0"/>
-          <w:numId w:val="7"/>
-        </w:numPr>
-        <w:ind w:hanging="360" w:start="1211"/>
-        <w:rPr>
-          <w:rFonts w:eastAsia="Times New Roman" w:cs="Times New Roman"/>
-          <w:lang w:val="uk-UA"/>
-        </w:rPr>
-      </w:pPr>
-      <w:r>
-        <w:rPr>
-          <w:rFonts w:eastAsia="Times New Roman" w:cs="Times New Roman"/>
-          <w:lang w:val="uk-UA"/>
-        </w:rPr>
-        <w:t>Заповнення пояснювальної записки.</w:t>
-      </w:r>
-    </w:p>
-    <w:p>
-      <w:pPr>
-        <w:pStyle w:val="Common"/>
-        <w:rPr>
-          <w:rFonts w:eastAsia="Times New Roman" w:cs="Times New Roman"/>
-          <w:lang w:val="uk-UA"/>
-        </w:rPr>
-      </w:pPr>
-      <w:r>
-        <w:rPr>
-          <w:rFonts w:eastAsia="Times New Roman" w:cs="Times New Roman"/>
-          <w:lang w:val="uk-UA"/>
-        </w:rPr>
-      </w:r>
-    </w:p>
-    <w:p>
-      <w:pPr>
-        <w:pStyle w:val="Title3rd1"/>
-        <w:rPr>
-          <w:rFonts w:eastAsia="Times New Roman" w:cs="Times New Roman"/>
-          <w:lang w:val="uk-UA"/>
-        </w:rPr>
-      </w:pPr>
-      <w:bookmarkStart w:id="228" w:name="__RefHeading___Toc2473_792400555"/>
-      <w:bookmarkStart w:id="229" w:name="_Toc10935"/>
-      <w:bookmarkStart w:id="230" w:name="_Зміст000062"/>
-      <w:bookmarkStart w:id="231" w:name="_Зміст000122"/>
-      <w:bookmarkStart w:id="232" w:name="_Зміст000027"/>
-      <w:bookmarkStart w:id="233" w:name="_Toc196826555"/>
-      <w:bookmarkEnd w:id="228"/>
-      <w:r>
-        <w:rPr>
-          <w:rFonts w:eastAsia="Times New Roman" w:cs="Times New Roman"/>
-          <w:lang w:val="uk-UA"/>
-        </w:rPr>
-        <w:t>А.6.3 Зміст робіт по етапах</w:t>
-      </w:r>
-      <w:bookmarkEnd w:id="229"/>
-      <w:bookmarkEnd w:id="230"/>
-      <w:bookmarkEnd w:id="231"/>
-      <w:bookmarkEnd w:id="232"/>
-      <w:bookmarkEnd w:id="233"/>
-    </w:p>
-    <w:p>
-      <w:pPr>
-        <w:pStyle w:val="Common"/>
-        <w:rPr>
-          <w:rFonts w:eastAsia="Times New Roman" w:cs="Times New Roman"/>
-          <w:lang w:val="uk-UA"/>
-        </w:rPr>
-      </w:pPr>
-      <w:r>
-        <w:rPr>
-          <w:rFonts w:eastAsia="Times New Roman" w:cs="Times New Roman"/>
-          <w:lang w:val="uk-UA"/>
-        </w:rPr>
-      </w:r>
-    </w:p>
-    <w:p>
-      <w:pPr>
-        <w:pStyle w:val="Common"/>
-        <w:rPr>
-          <w:rFonts w:eastAsia="Times New Roman" w:cs="Times New Roman"/>
-          <w:lang w:val="uk-UA"/>
-        </w:rPr>
-      </w:pPr>
-      <w:r>
-        <w:rPr>
-          <w:rFonts w:eastAsia="Times New Roman" w:cs="Times New Roman"/>
-          <w:lang w:val="uk-UA"/>
-        </w:rPr>
-        <w:t>Зміст роботи може бути таким на кожному етапі:</w:t>
-      </w:r>
-    </w:p>
-    <w:p>
-      <w:pPr>
-        <w:pStyle w:val="Common"/>
-        <w:rPr>
-          <w:rFonts w:eastAsia="Times New Roman" w:cs="Times New Roman"/>
-          <w:lang w:val="uk-UA"/>
-        </w:rPr>
-      </w:pPr>
-      <w:r>
-        <w:rPr>
-          <w:rFonts w:eastAsia="Times New Roman" w:cs="Times New Roman"/>
-          <w:lang w:val="uk-UA"/>
-        </w:rPr>
-      </w:r>
-    </w:p>
-    <w:p>
-      <w:pPr>
-        <w:pStyle w:val="Common"/>
-        <w:numPr>
-          <w:ilvl w:val="0"/>
-          <w:numId w:val="8"/>
-        </w:numPr>
-        <w:ind w:hanging="360" w:start="1211"/>
-        <w:rPr>
-          <w:rFonts w:eastAsia="Times New Roman" w:cs="Times New Roman"/>
-          <w:lang w:val="uk-UA"/>
-        </w:rPr>
-      </w:pPr>
-      <w:r>
-        <w:rPr>
-          <w:rFonts w:eastAsia="Times New Roman" w:cs="Times New Roman"/>
-          <w:lang w:val="uk-UA"/>
-        </w:rPr>
-        <w:t>Початкова документація, тестові програми;</w:t>
-      </w:r>
-    </w:p>
-    <w:p>
-      <w:pPr>
-        <w:pStyle w:val="Common"/>
-        <w:numPr>
-          <w:ilvl w:val="0"/>
-          <w:numId w:val="8"/>
-        </w:numPr>
-        <w:ind w:hanging="360" w:start="1211"/>
-        <w:rPr>
-          <w:rFonts w:eastAsia="Times New Roman" w:cs="Times New Roman"/>
-          <w:lang w:val="uk-UA"/>
-        </w:rPr>
-      </w:pPr>
-      <w:r>
-        <w:rPr>
-          <w:rFonts w:eastAsia="Times New Roman" w:cs="Times New Roman"/>
-          <w:lang w:val="uk-UA"/>
-        </w:rPr>
-        <w:t>Робоча програма, більш заповнена документація, підготовка до презентації;</w:t>
-      </w:r>
-    </w:p>
-    <w:p>
-      <w:pPr>
-        <w:pStyle w:val="Common"/>
-        <w:numPr>
-          <w:ilvl w:val="0"/>
-          <w:numId w:val="8"/>
-        </w:numPr>
-        <w:ind w:hanging="360" w:start="1211"/>
-        <w:rPr>
-          <w:rFonts w:eastAsia="Times New Roman" w:cs="Times New Roman"/>
-          <w:lang w:val="uk-UA"/>
-        </w:rPr>
-      </w:pPr>
-      <w:r>
-        <w:rPr>
-          <w:rFonts w:eastAsia="Times New Roman" w:cs="Times New Roman"/>
-          <w:lang w:val="uk-UA"/>
-        </w:rPr>
         <w:t>Готова програма, готова документація, готова презентація.</w:t>
       </w:r>
     </w:p>
@@ -12424,14 +12372,15 @@
     <w:p>
       <w:pPr>
         <w:pStyle w:val="Title1st"/>
+        <w:ind w:hanging="0" w:start="0"/>
         <w:rPr>
           <w:rFonts w:eastAsia="Times New Roman" w:cs="Times New Roman"/>
           <w:lang w:val="uk-UA"/>
         </w:rPr>
       </w:pPr>
       <w:bookmarkStart w:id="234" w:name="__RefHeading___Toc2475_792400555"/>
-      <w:bookmarkStart w:id="235" w:name="_Toc11195"/>
-      <w:bookmarkStart w:id="236" w:name="_Зміст000127"/>
+      <w:bookmarkStart w:id="235" w:name="_Зміст000127"/>
+      <w:bookmarkStart w:id="236" w:name="_Toc11195"/>
       <w:bookmarkEnd w:id="234"/>
       <w:r>
         <w:rPr>
@@ -12468,6 +12417,7 @@
       <w:pPr>
         <w:pStyle w:val="Title2nd1"/>
         <w:spacing w:before="0" w:after="0"/>
+        <w:ind w:hanging="0" w:start="0"/>
         <w:rPr/>
       </w:pPr>
       <w:bookmarkStart w:id="237" w:name="__RefHeading___Toc2477_792400555"/>
@@ -12556,6 +12506,7 @@
     <w:p>
       <w:pPr>
         <w:pStyle w:val="Title2nd1"/>
+        <w:ind w:hanging="0" w:start="0"/>
         <w:rPr/>
       </w:pPr>
       <w:bookmarkStart w:id="239" w:name="__RefHeading___Toc2479_792400555"/>
@@ -12602,6 +12553,7 @@
     <w:p>
       <w:pPr>
         <w:pStyle w:val="Title2nd1"/>
+        <w:ind w:hanging="0" w:start="0"/>
         <w:rPr/>
       </w:pPr>
       <w:bookmarkStart w:id="241" w:name="__RefHeading___Toc2481_792400555"/>
@@ -12648,6 +12600,7 @@
     <w:p>
       <w:pPr>
         <w:pStyle w:val="Title3rd1"/>
+        <w:ind w:hanging="0" w:start="0"/>
         <w:rPr>
           <w:lang w:val="uk-UA"/>
         </w:rPr>
@@ -12793,6 +12746,7 @@
     <w:p>
       <w:pPr>
         <w:pStyle w:val="Title2nd1"/>
+        <w:ind w:hanging="0" w:start="0"/>
         <w:rPr/>
       </w:pPr>
       <w:bookmarkStart w:id="245" w:name="__RefHeading___Toc2485_792400555"/>
@@ -13115,6 +13069,7 @@
     <w:p>
       <w:pPr>
         <w:pStyle w:val="Title2nd1"/>
+        <w:ind w:hanging="0" w:start="0"/>
         <w:rPr/>
       </w:pPr>
       <w:bookmarkStart w:id="247" w:name="__RefHeading___Toc2487_792400555"/>
@@ -13302,6 +13257,7 @@
     <w:p>
       <w:pPr>
         <w:pStyle w:val="Title2nd1"/>
+        <w:ind w:hanging="0" w:start="0"/>
         <w:rPr/>
       </w:pPr>
       <w:bookmarkStart w:id="249" w:name="__RefHeading___Toc2489_792400555"/>
@@ -13554,6 +13510,7 @@
     <w:p>
       <w:pPr>
         <w:pStyle w:val="Title1st"/>
+        <w:ind w:hanging="0" w:start="0"/>
         <w:rPr>
           <w:rFonts w:eastAsia="Times New Roman" w:cs="Times New Roman"/>
           <w:lang w:val="uk-UA"/>
@@ -13597,6 +13554,7 @@
         <w:pStyle w:val="Title2nd1"/>
         <w:bidi w:val="0"/>
         <w:spacing w:before="0" w:after="0"/>
+        <w:ind w:hanging="0" w:start="0"/>
         <w:rPr>
           <w:lang w:val="en-US"/>
         </w:rPr>
@@ -14246,6 +14204,7 @@
     <w:p>
       <w:pPr>
         <w:pStyle w:val="Title2nd1"/>
+        <w:ind w:hanging="0" w:start="0"/>
         <w:rPr/>
       </w:pPr>
       <w:bookmarkStart w:id="255" w:name="__RefHeading___Toc2649_2362981076"/>
@@ -16316,6 +16275,7 @@
     <w:p>
       <w:pPr>
         <w:pStyle w:val="Title1st"/>
+        <w:ind w:hanging="0" w:start="0"/>
         <w:rPr>
           <w:rFonts w:eastAsia="Times New Roman" w:cs="Times New Roman"/>
           <w:lang w:val="uk-UA"/>
@@ -17223,8 +17183,9 @@
       </w:r>
     </w:p>
     <w:sectPr>
-      <w:headerReference w:type="default" r:id="rId29"/>
-      <w:headerReference w:type="first" r:id="rId30"/>
+      <w:headerReference w:type="even" r:id="rId29"/>
+      <w:headerReference w:type="default" r:id="rId30"/>
+      <w:headerReference w:type="first" r:id="rId31"/>
       <w:type w:val="nextPage"/>
       <w:pgSz w:w="11906" w:h="16838"/>
       <w:pgMar w:left="1701" w:right="851" w:gutter="0" w:header="709" w:top="1134" w:footer="0" w:bottom="1134"/>
@@ -17243,6 +17204,20 @@
   <w:p>
     <w:pPr>
       <w:pStyle w:val="Header"/>
+      <w:rPr/>
+    </w:pPr>
+    <w:r>
+      <w:rPr/>
+    </w:r>
+  </w:p>
+</w:hdr>
+</file>
+
+<file path=word/header2.xml><?xml version="1.0" encoding="utf-8"?>
+<w:hdr xmlns:o="urn:schemas-microsoft-com:office:office" xmlns:r="http://schemas.openxmlformats.org/officeDocument/2006/relationships" xmlns:v="urn:schemas-microsoft-com:vml" xmlns:w="http://schemas.openxmlformats.org/wordprocessingml/2006/main" xmlns:w10="urn:schemas-microsoft-com:office:word" xmlns:wp="http://schemas.openxmlformats.org/drawingml/2006/wordprocessingDrawing" xmlns:pic="http://schemas.openxmlformats.org/drawingml/2006/picture" xmlns:wps="http://schemas.microsoft.com/office/word/2010/wordprocessingShape" xmlns:wpg="http://schemas.microsoft.com/office/word/2010/wordprocessingGroup" xmlns:mc="http://schemas.openxmlformats.org/markup-compatibility/2006" xmlns:wp14="http://schemas.microsoft.com/office/word/2010/wordprocessingDrawing" xmlns:w14="http://schemas.microsoft.com/office/word/2010/wordml" xmlns:w15="http://schemas.microsoft.com/office/word/2012/wordml" mc:Ignorable="w14 wp14 w15">
+  <w:p>
+    <w:pPr>
+      <w:pStyle w:val="Header"/>
       <w:jc w:val="end"/>
       <w:rPr/>
     </w:pPr>
@@ -17251,7 +17226,7 @@
       <mc:AlternateContent>
         <mc:Choice Requires="wps">
           <w:drawing>
-            <wp:anchor behindDoc="1" distT="635" distB="635" distL="635" distR="635" simplePos="0" locked="0" layoutInCell="1" allowOverlap="1" relativeHeight="43">
+            <wp:anchor behindDoc="1" distT="635" distB="635" distL="635" distR="635" simplePos="0" locked="0" layoutInCell="1" allowOverlap="1" relativeHeight="59">
               <wp:simplePos x="0" y="0"/>
               <wp:positionH relativeFrom="column">
                 <wp:posOffset>5395595</wp:posOffset>
@@ -17329,7 +17304,7 @@
 </w:hdr>
 </file>
 
-<file path=word/header2.xml><?xml version="1.0" encoding="utf-8"?>
+<file path=word/header3.xml><?xml version="1.0" encoding="utf-8"?>
 <w:hdr xmlns:o="urn:schemas-microsoft-com:office:office" xmlns:r="http://schemas.openxmlformats.org/officeDocument/2006/relationships" xmlns:v="urn:schemas-microsoft-com:vml" xmlns:w="http://schemas.openxmlformats.org/wordprocessingml/2006/main" xmlns:w10="urn:schemas-microsoft-com:office:word" xmlns:wp="http://schemas.openxmlformats.org/drawingml/2006/wordprocessingDrawing" xmlns:pic="http://schemas.openxmlformats.org/drawingml/2006/picture" xmlns:wps="http://schemas.microsoft.com/office/word/2010/wordprocessingShape" xmlns:wpg="http://schemas.microsoft.com/office/word/2010/wordprocessingGroup" xmlns:mc="http://schemas.openxmlformats.org/markup-compatibility/2006" xmlns:wp14="http://schemas.microsoft.com/office/word/2010/wordprocessingDrawing" xmlns:w14="http://schemas.microsoft.com/office/word/2010/wordml" xmlns:w15="http://schemas.microsoft.com/office/word/2012/wordml" mc:Ignorable="w14 wp14 w15">
   <w:p>
     <w:pPr>
@@ -17348,125 +17323,6 @@
   <w:abstractNum w:abstractNumId="1">
     <w:lvl w:ilvl="0">
       <w:start w:val="1"/>
-      <w:numFmt w:val="none"/>
-      <w:suff w:val="nothing"/>
-      <w:lvlText w:val="%1"/>
-      <w:lvlJc w:val="start"/>
-      <w:pPr>
-        <w:tabs>
-          <w:tab w:val="num" w:pos="0"/>
-        </w:tabs>
-        <w:ind w:start="0" w:hanging="0"/>
-      </w:pPr>
-    </w:lvl>
-    <w:lvl w:ilvl="1">
-      <w:start w:val="1"/>
-      <w:numFmt w:val="none"/>
-      <w:suff w:val="nothing"/>
-      <w:lvlText w:val="%2"/>
-      <w:lvlJc w:val="start"/>
-      <w:pPr>
-        <w:tabs>
-          <w:tab w:val="num" w:pos="0"/>
-        </w:tabs>
-        <w:ind w:start="0" w:hanging="0"/>
-      </w:pPr>
-    </w:lvl>
-    <w:lvl w:ilvl="2">
-      <w:start w:val="1"/>
-      <w:numFmt w:val="none"/>
-      <w:suff w:val="nothing"/>
-      <w:lvlText w:val="%3"/>
-      <w:lvlJc w:val="start"/>
-      <w:pPr>
-        <w:tabs>
-          <w:tab w:val="num" w:pos="0"/>
-        </w:tabs>
-        <w:ind w:start="0" w:hanging="0"/>
-      </w:pPr>
-    </w:lvl>
-    <w:lvl w:ilvl="3">
-      <w:start w:val="1"/>
-      <w:numFmt w:val="none"/>
-      <w:suff w:val="nothing"/>
-      <w:lvlText w:val="%4"/>
-      <w:lvlJc w:val="start"/>
-      <w:pPr>
-        <w:tabs>
-          <w:tab w:val="num" w:pos="0"/>
-        </w:tabs>
-        <w:ind w:start="0" w:hanging="0"/>
-      </w:pPr>
-    </w:lvl>
-    <w:lvl w:ilvl="4">
-      <w:start w:val="1"/>
-      <w:numFmt w:val="none"/>
-      <w:suff w:val="nothing"/>
-      <w:lvlText w:val="%5"/>
-      <w:lvlJc w:val="start"/>
-      <w:pPr>
-        <w:tabs>
-          <w:tab w:val="num" w:pos="0"/>
-        </w:tabs>
-        <w:ind w:start="0" w:hanging="0"/>
-      </w:pPr>
-    </w:lvl>
-    <w:lvl w:ilvl="5">
-      <w:start w:val="1"/>
-      <w:numFmt w:val="none"/>
-      <w:suff w:val="nothing"/>
-      <w:lvlText w:val="%6"/>
-      <w:lvlJc w:val="start"/>
-      <w:pPr>
-        <w:tabs>
-          <w:tab w:val="num" w:pos="0"/>
-        </w:tabs>
-        <w:ind w:start="0" w:hanging="0"/>
-      </w:pPr>
-    </w:lvl>
-    <w:lvl w:ilvl="6">
-      <w:start w:val="1"/>
-      <w:numFmt w:val="none"/>
-      <w:suff w:val="nothing"/>
-      <w:lvlText w:val="%7"/>
-      <w:lvlJc w:val="start"/>
-      <w:pPr>
-        <w:tabs>
-          <w:tab w:val="num" w:pos="0"/>
-        </w:tabs>
-        <w:ind w:start="0" w:hanging="0"/>
-      </w:pPr>
-    </w:lvl>
-    <w:lvl w:ilvl="7">
-      <w:start w:val="1"/>
-      <w:numFmt w:val="none"/>
-      <w:suff w:val="nothing"/>
-      <w:lvlText w:val="%8"/>
-      <w:lvlJc w:val="start"/>
-      <w:pPr>
-        <w:tabs>
-          <w:tab w:val="num" w:pos="0"/>
-        </w:tabs>
-        <w:ind w:start="0" w:hanging="0"/>
-      </w:pPr>
-    </w:lvl>
-    <w:lvl w:ilvl="8">
-      <w:start w:val="1"/>
-      <w:numFmt w:val="none"/>
-      <w:suff w:val="nothing"/>
-      <w:lvlText w:val="%9"/>
-      <w:lvlJc w:val="start"/>
-      <w:pPr>
-        <w:tabs>
-          <w:tab w:val="num" w:pos="0"/>
-        </w:tabs>
-        <w:ind w:start="0" w:hanging="0"/>
-      </w:pPr>
-    </w:lvl>
-  </w:abstractNum>
-  <w:abstractNum w:abstractNumId="2">
-    <w:lvl w:ilvl="0">
-      <w:start w:val="1"/>
       <w:numFmt w:val="bullet"/>
       <w:lvlText w:val=""/>
       <w:lvlJc w:val="start"/>
@@ -17585,7 +17441,7 @@
       <w:rPr/>
     </w:lvl>
   </w:abstractNum>
-  <w:abstractNum w:abstractNumId="3">
+  <w:abstractNum w:abstractNumId="2">
     <w:lvl w:ilvl="0">
       <w:start w:val="1"/>
       <w:numFmt w:val="decimal"/>
@@ -17704,7 +17560,7 @@
       <w:rPr/>
     </w:lvl>
   </w:abstractNum>
-  <w:abstractNum w:abstractNumId="4">
+  <w:abstractNum w:abstractNumId="3">
     <w:lvl w:ilvl="0">
       <w:start w:val="1"/>
       <w:numFmt w:val="bullet"/>
@@ -17842,7 +17698,7 @@
       </w:rPr>
     </w:lvl>
   </w:abstractNum>
-  <w:abstractNum w:abstractNumId="5">
+  <w:abstractNum w:abstractNumId="4">
     <w:lvl w:ilvl="0">
       <w:start w:val="1"/>
       <w:numFmt w:val="bullet"/>
@@ -17979,6 +17835,125 @@
       </w:rPr>
     </w:lvl>
   </w:abstractNum>
+  <w:abstractNum w:abstractNumId="5">
+    <w:lvl w:ilvl="0">
+      <w:start w:val="1"/>
+      <w:numFmt w:val="decimal"/>
+      <w:lvlText w:val="%1."/>
+      <w:lvlJc w:val="start"/>
+      <w:pPr>
+        <w:tabs>
+          <w:tab w:val="num" w:pos="0"/>
+        </w:tabs>
+        <w:ind w:start="851" w:hanging="0"/>
+      </w:pPr>
+      <w:rPr/>
+    </w:lvl>
+    <w:lvl w:ilvl="1">
+      <w:start w:val="1"/>
+      <w:numFmt w:val="lowerLetter"/>
+      <w:lvlText w:val="%2."/>
+      <w:lvlJc w:val="start"/>
+      <w:pPr>
+        <w:tabs>
+          <w:tab w:val="num" w:pos="0"/>
+        </w:tabs>
+        <w:ind w:start="1571" w:hanging="0"/>
+      </w:pPr>
+      <w:rPr/>
+    </w:lvl>
+    <w:lvl w:ilvl="2">
+      <w:start w:val="1"/>
+      <w:numFmt w:val="lowerRoman"/>
+      <w:lvlText w:val="%3."/>
+      <w:lvlJc w:val="end"/>
+      <w:pPr>
+        <w:tabs>
+          <w:tab w:val="num" w:pos="0"/>
+        </w:tabs>
+        <w:ind w:start="2471" w:hanging="0"/>
+      </w:pPr>
+      <w:rPr/>
+    </w:lvl>
+    <w:lvl w:ilvl="3">
+      <w:start w:val="1"/>
+      <w:numFmt w:val="decimal"/>
+      <w:lvlText w:val="%4."/>
+      <w:lvlJc w:val="start"/>
+      <w:pPr>
+        <w:tabs>
+          <w:tab w:val="num" w:pos="0"/>
+        </w:tabs>
+        <w:ind w:start="3011" w:hanging="0"/>
+      </w:pPr>
+      <w:rPr/>
+    </w:lvl>
+    <w:lvl w:ilvl="4">
+      <w:start w:val="1"/>
+      <w:numFmt w:val="lowerLetter"/>
+      <w:lvlText w:val="%5."/>
+      <w:lvlJc w:val="start"/>
+      <w:pPr>
+        <w:tabs>
+          <w:tab w:val="num" w:pos="0"/>
+        </w:tabs>
+        <w:ind w:start="3731" w:hanging="0"/>
+      </w:pPr>
+      <w:rPr/>
+    </w:lvl>
+    <w:lvl w:ilvl="5">
+      <w:start w:val="1"/>
+      <w:numFmt w:val="lowerRoman"/>
+      <w:lvlText w:val="%6."/>
+      <w:lvlJc w:val="end"/>
+      <w:pPr>
+        <w:tabs>
+          <w:tab w:val="num" w:pos="0"/>
+        </w:tabs>
+        <w:ind w:start="4631" w:hanging="0"/>
+      </w:pPr>
+      <w:rPr/>
+    </w:lvl>
+    <w:lvl w:ilvl="6">
+      <w:start w:val="1"/>
+      <w:numFmt w:val="decimal"/>
+      <w:lvlText w:val="%7."/>
+      <w:lvlJc w:val="start"/>
+      <w:pPr>
+        <w:tabs>
+          <w:tab w:val="num" w:pos="0"/>
+        </w:tabs>
+        <w:ind w:start="5171" w:hanging="0"/>
+      </w:pPr>
+      <w:rPr/>
+    </w:lvl>
+    <w:lvl w:ilvl="7">
+      <w:start w:val="1"/>
+      <w:numFmt w:val="lowerLetter"/>
+      <w:lvlText w:val="%8."/>
+      <w:lvlJc w:val="start"/>
+      <w:pPr>
+        <w:tabs>
+          <w:tab w:val="num" w:pos="0"/>
+        </w:tabs>
+        <w:ind w:start="5891" w:hanging="0"/>
+      </w:pPr>
+      <w:rPr/>
+    </w:lvl>
+    <w:lvl w:ilvl="8">
+      <w:start w:val="1"/>
+      <w:numFmt w:val="lowerRoman"/>
+      <w:lvlText w:val="%9."/>
+      <w:lvlJc w:val="end"/>
+      <w:pPr>
+        <w:tabs>
+          <w:tab w:val="num" w:pos="0"/>
+        </w:tabs>
+        <w:ind w:start="6791" w:hanging="0"/>
+      </w:pPr>
+      <w:rPr/>
+    </w:lvl>
+  </w:abstractNum>
   <w:abstractNum w:abstractNumId="6">
     <w:lvl w:ilvl="0">
       <w:start w:val="1"/>
@@ -18220,120 +18195,120 @@
   <w:abstractNum w:abstractNumId="8">
     <w:lvl w:ilvl="0">
       <w:start w:val="1"/>
-      <w:numFmt w:val="decimal"/>
-      <w:lvlText w:val="%1."/>
+      <w:numFmt w:val="none"/>
+      <w:suff w:val="nothing"/>
+      <w:lvlText w:val=""/>
       <w:lvlJc w:val="start"/>
       <w:pPr>
         <w:tabs>
           <w:tab w:val="num" w:pos="0"/>
         </w:tabs>
-        <w:ind w:start="851" w:hanging="0"/>
-      </w:pPr>
-      <w:rPr/>
+        <w:ind w:start="0" w:hanging="0"/>
+      </w:pPr>
     </w:lvl>
     <w:lvl w:ilvl="1">
       <w:start w:val="1"/>
-      <w:numFmt w:val="lowerLetter"/>
-      <w:lvlText w:val="%2."/>
+      <w:numFmt w:val="none"/>
+      <w:suff w:val="nothing"/>
+      <w:lvlText w:val=""/>
       <w:lvlJc w:val="start"/>
       <w:pPr>
         <w:tabs>
           <w:tab w:val="num" w:pos="0"/>
         </w:tabs>
-        <w:ind w:start="1571" w:hanging="0"/>
-      </w:pPr>
-      <w:rPr/>
+        <w:ind w:start="0" w:hanging="0"/>
+      </w:pPr>
     </w:lvl>
     <w:lvl w:ilvl="2">
       <w:start w:val="1"/>
-      <w:numFmt w:val="lowerRoman"/>
-      <w:lvlText w:val="%3."/>
-      <w:lvlJc w:val="end"/>
+      <w:numFmt w:val="none"/>
+      <w:suff w:val="nothing"/>
+      <w:lvlText w:val=""/>
+      <w:lvlJc w:val="start"/>
       <w:pPr>
         <w:tabs>
           <w:tab w:val="num" w:pos="0"/>
         </w:tabs>
-        <w:ind w:start="2471" w:hanging="0"/>
-      </w:pPr>
-      <w:rPr/>
+        <w:ind w:start="0" w:hanging="0"/>
+      </w:pPr>
     </w:lvl>
     <w:lvl w:ilvl="3">
       <w:start w:val="1"/>
-      <w:numFmt w:val="decimal"/>
-      <w:lvlText w:val="%4."/>
+      <w:numFmt w:val="none"/>
+      <w:suff w:val="nothing"/>
+      <w:lvlText w:val=""/>
       <w:lvlJc w:val="start"/>
       <w:pPr>
         <w:tabs>
           <w:tab w:val="num" w:pos="0"/>
         </w:tabs>
-        <w:ind w:start="3011" w:hanging="0"/>
-      </w:pPr>
-      <w:rPr/>
+        <w:ind w:start="0" w:hanging="0"/>
+      </w:pPr>
     </w:lvl>
     <w:lvl w:ilvl="4">
       <w:start w:val="1"/>
-      <w:numFmt w:val="lowerLetter"/>
-      <w:lvlText w:val="%5."/>
+      <w:numFmt w:val="none"/>
+      <w:suff w:val="nothing"/>
+      <w:lvlText w:val=""/>
       <w:lvlJc w:val="start"/>
       <w:pPr>
         <w:tabs>
           <w:tab w:val="num" w:pos="0"/>
         </w:tabs>
-        <w:ind w:start="3731" w:hanging="0"/>
-      </w:pPr>
-      <w:rPr/>
+        <w:ind w:start="0" w:hanging="0"/>
+      </w:pPr>
     </w:lvl>
     <w:lvl w:ilvl="5">
       <w:start w:val="1"/>
-      <w:numFmt w:val="lowerRoman"/>
-      <w:lvlText w:val="%6."/>
-      <w:lvlJc w:val="end"/>
+      <w:numFmt w:val="none"/>
+      <w:suff w:val="nothing"/>
+      <w:lvlText w:val=""/>
+      <w:lvlJc w:val="start"/>
       <w:pPr>
         <w:tabs>
           <w:tab w:val="num" w:pos="0"/>
         </w:tabs>
-        <w:ind w:start="4631" w:hanging="0"/>
-      </w:pPr>
-      <w:rPr/>
+        <w:ind w:start="0" w:hanging="0"/>
+      </w:pPr>
     </w:lvl>
     <w:lvl w:ilvl="6">
       <w:start w:val="1"/>
-      <w:numFmt w:val="decimal"/>
-      <w:lvlText w:val="%7."/>
+      <w:numFmt w:val="none"/>
+      <w:suff w:val="nothing"/>
+      <w:lvlText w:val=""/>
       <w:lvlJc w:val="start"/>
       <w:pPr>
         <w:tabs>
           <w:tab w:val="num" w:pos="0"/>
         </w:tabs>
-        <w:ind w:start="5171" w:hanging="0"/>
-      </w:pPr>
-      <w:rPr/>
+        <w:ind w:start="0" w:hanging="0"/>
+      </w:pPr>
     </w:lvl>
     <w:lvl w:ilvl="7">
       <w:start w:val="1"/>
-      <w:numFmt w:val="lowerLetter"/>
-      <w:lvlText w:val="%8."/>
+      <w:numFmt w:val="none"/>
+      <w:suff w:val="nothing"/>
+      <w:lvlText w:val=""/>
       <w:lvlJc w:val="start"/>
       <w:pPr>
         <w:tabs>
           <w:tab w:val="num" w:pos="0"/>
         </w:tabs>
-        <w:ind w:start="5891" w:hanging="0"/>
-      </w:pPr>
-      <w:rPr/>
+        <w:ind w:start="0" w:hanging="0"/>
+      </w:pPr>
     </w:lvl>
     <w:lvl w:ilvl="8">
       <w:start w:val="1"/>
-      <w:numFmt w:val="lowerRoman"/>
-      <w:lvlText w:val="%9."/>
-      <w:lvlJc w:val="end"/>
+      <w:numFmt w:val="none"/>
+      <w:suff w:val="nothing"/>
+      <w:lvlText w:val=""/>
+      <w:lvlJc w:val="start"/>
       <w:pPr>
         <w:tabs>
           <w:tab w:val="num" w:pos="0"/>
         </w:tabs>
-        <w:ind w:start="6791" w:hanging="0"/>
-      </w:pPr>
-      <w:rPr/>
+        <w:ind w:start="0" w:hanging="0"/>
+      </w:pPr>
     </w:lvl>
   </w:abstractNum>
   <w:num w:numId="1">
@@ -18384,9 +18359,7 @@
     <w:pPr>
       <w:widowControl/>
       <w:suppressAutoHyphens w:val="true"/>
-      <w:kinsoku w:val="true"/>
-      <w:overflowPunct w:val="true"/>
-      <w:autoSpaceDE w:val="true"/>
+      <w:overflowPunct w:val="false"/>
       <w:bidi w:val="0"/>
       <w:spacing w:lineRule="auto" w:line="259" w:before="0" w:after="160"/>
       <w:jc w:val="start"/>
@@ -18792,13 +18765,13 @@
       <w:sz w:val="28"/>
     </w:rPr>
   </w:style>
-  <w:style w:type="character" w:styleId="user">
-    <w:name w:val="Посилання покажчика (user)"/>
+  <w:style w:type="character" w:styleId="Style18">
+    <w:name w:val="Посилання покажчика"/>
     <w:qFormat/>
     <w:rPr/>
   </w:style>
-  <w:style w:type="character" w:styleId="Style18">
-    <w:name w:val="Посилання покажчика"/>
+  <w:style w:type="character" w:styleId="user">
+    <w:name w:val="Посилання покажчика (user)"/>
     <w:qFormat/>
     <w:rPr/>
   </w:style>
@@ -18899,15 +18872,15 @@
       <w:szCs w:val="16"/>
     </w:rPr>
   </w:style>
-  <w:style w:type="paragraph" w:styleId="user3">
-    <w:name w:val="Верхній і нижній колонтитули (user)"/>
+  <w:style w:type="paragraph" w:styleId="Style21">
+    <w:name w:val="Верхній і нижній колонтитули"/>
     <w:basedOn w:val="Normal"/>
     <w:qFormat/>
     <w:pPr/>
     <w:rPr/>
   </w:style>
-  <w:style w:type="paragraph" w:styleId="Style21">
-    <w:name w:val="Верхній і нижній колонтитули"/>
+  <w:style w:type="paragraph" w:styleId="user3">
+    <w:name w:val="Верхній і нижній колонтитули (user)"/>
     <w:basedOn w:val="Normal"/>
     <w:qFormat/>
     <w:pPr/>
@@ -18978,7 +18951,7 @@
     <w:pPr>
       <w:numPr>
         <w:ilvl w:val="0"/>
-        <w:numId w:val="2"/>
+        <w:numId w:val="1"/>
       </w:numPr>
       <w:spacing w:lineRule="auto" w:line="360" w:before="0" w:after="0"/>
       <w:ind w:hanging="360" w:start="360"/>
@@ -18996,7 +18969,7 @@
     <w:pPr>
       <w:numPr>
         <w:ilvl w:val="0"/>
-        <w:numId w:val="3"/>
+        <w:numId w:val="2"/>
       </w:numPr>
       <w:spacing w:lineRule="auto" w:line="360" w:before="0" w:after="0"/>
       <w:ind w:firstLine="851" w:start="0"/>
@@ -19151,9 +19124,7 @@
         <w:tab w:val="right" w:pos="9356" w:leader="none"/>
       </w:tabs>
       <w:suppressAutoHyphens w:val="true"/>
-      <w:kinsoku w:val="true"/>
-      <w:overflowPunct w:val="true"/>
-      <w:autoSpaceDE w:val="true"/>
+      <w:overflowPunct w:val="false"/>
       <w:bidi w:val="0"/>
       <w:spacing w:lineRule="auto" w:line="360" w:before="0" w:after="360"/>
       <w:jc w:val="start"/>
@@ -19248,9 +19219,7 @@
     <w:pPr>
       <w:widowControl/>
       <w:suppressAutoHyphens w:val="true"/>
-      <w:kinsoku w:val="true"/>
-      <w:overflowPunct w:val="true"/>
-      <w:autoSpaceDE w:val="true"/>
+      <w:overflowPunct w:val="false"/>
       <w:bidi w:val="0"/>
       <w:spacing w:lineRule="auto" w:line="259" w:before="0" w:after="160"/>
       <w:jc w:val="center"/>
@@ -19392,7 +19361,7 @@
     <w:pPr>
       <w:numPr>
         <w:ilvl w:val="0"/>
-        <w:numId w:val="4"/>
+        <w:numId w:val="3"/>
       </w:numPr>
       <w:ind w:firstLine="851" w:start="0"/>
     </w:pPr>
@@ -19404,9 +19373,7 @@
     <w:pPr>
       <w:widowControl/>
       <w:suppressAutoHyphens w:val="true"/>
-      <w:kinsoku w:val="true"/>
-      <w:overflowPunct w:val="true"/>
-      <w:autoSpaceDE w:val="true"/>
+      <w:overflowPunct w:val="false"/>
       <w:bidi w:val="0"/>
       <w:spacing w:lineRule="auto" w:line="240" w:before="0" w:after="0"/>
       <w:jc w:val="start"/>
@@ -19426,9 +19393,7 @@
     <w:pPr>
       <w:widowControl w:val="false"/>
       <w:suppressAutoHyphens w:val="true"/>
-      <w:kinsoku w:val="true"/>
-      <w:overflowPunct w:val="true"/>
-      <w:autoSpaceDE w:val="true"/>
+      <w:overflowPunct w:val="false"/>
       <w:bidi w:val="0"/>
       <w:spacing w:lineRule="auto" w:line="240" w:before="0" w:after="0"/>
       <w:jc w:val="start"/>
@@ -19442,8 +19407,8 @@
       <w:lang w:val="ru-RU" w:eastAsia="ru-RU" w:bidi="ar-SA"/>
     </w:rPr>
   </w:style>
-  <w:style w:type="paragraph" w:styleId="user4">
-    <w:name w:val="Вміст таблиці (user)"/>
+  <w:style w:type="paragraph" w:styleId="Style28">
+    <w:name w:val="Вміст таблиці"/>
     <w:basedOn w:val="Normal"/>
     <w:qFormat/>
     <w:pPr>
@@ -19452,8 +19417,8 @@
     </w:pPr>
     <w:rPr/>
   </w:style>
-  <w:style w:type="paragraph" w:styleId="Style28">
-    <w:name w:val="Вміст таблиці"/>
+  <w:style w:type="paragraph" w:styleId="user4">
+    <w:name w:val="Вміст таблиці (user)"/>
     <w:basedOn w:val="Normal"/>
     <w:qFormat/>
     <w:pPr>

</xml_diff>